<commit_message>
add abstract to report
</commit_message>
<xml_diff>
--- a/report/Диссертация.docx
+++ b/report/Диссертация.docx
@@ -132,7 +132,6 @@
         </w:rPr>
         <w:t>“</w:t>
       </w:r>
-      <w:proofErr w:type="gramStart"/>
       <w:r>
         <w:rPr>
           <w:b/>
@@ -147,16 +146,7 @@
           <w:bCs/>
           <w:lang w:val="en-US"/>
         </w:rPr>
-        <w:t>-British</w:t>
-      </w:r>
-      <w:proofErr w:type="gramEnd"/>
-      <w:r>
-        <w:rPr>
-          <w:b/>
-          <w:bCs/>
-          <w:lang w:val="en-US"/>
-        </w:rPr>
-        <w:t xml:space="preserve"> </w:t>
+        <w:t xml:space="preserve">-British </w:t>
       </w:r>
       <w:r>
         <w:rPr>
@@ -407,32 +397,15 @@
           <w:b/>
           <w:bCs/>
         </w:rPr>
-        <w:t xml:space="preserve"> </w:t>
-      </w:r>
-      <w:proofErr w:type="spellStart"/>
-      <w:r>
-        <w:rPr>
-          <w:b/>
-          <w:bCs/>
-        </w:rPr>
-        <w:t>A.Zh</w:t>
-      </w:r>
-      <w:proofErr w:type="spellEnd"/>
-      <w:r>
-        <w:rPr>
-          <w:b/>
-          <w:bCs/>
-        </w:rPr>
-        <w:t>.</w:t>
-      </w:r>
-      <w:r>
-        <w:rPr>
-          <w:b/>
-          <w:bCs/>
-        </w:rPr>
-        <w:t xml:space="preserve"> </w:t>
-      </w:r>
-      <w:proofErr w:type="spellStart"/>
+        <w:t xml:space="preserve"> A.Zh.</w:t>
+      </w:r>
+      <w:r>
+        <w:rPr>
+          <w:b/>
+          <w:bCs/>
+        </w:rPr>
+        <w:t xml:space="preserve"> </w:t>
+      </w:r>
       <w:r>
         <w:rPr>
           <w:b/>
@@ -440,7 +413,6 @@
         </w:rPr>
         <w:t>Imanbayev</w:t>
       </w:r>
-      <w:proofErr w:type="spellEnd"/>
     </w:p>
     <w:p>
       <w:pPr>
@@ -742,19 +714,15 @@
       <w:r>
         <w:t xml:space="preserve"> </w:t>
       </w:r>
-      <w:proofErr w:type="spellStart"/>
       <w:r>
         <w:t>Zh</w:t>
       </w:r>
-      <w:proofErr w:type="spellEnd"/>
       <w:r>
         <w:t xml:space="preserve">. </w:t>
       </w:r>
-      <w:proofErr w:type="spellStart"/>
       <w:r>
         <w:t>Alimseitova</w:t>
       </w:r>
-      <w:proofErr w:type="spellEnd"/>
     </w:p>
     <w:p>
       <w:pPr>
@@ -986,18 +954,11 @@
         <w:t xml:space="preserve">                               </w:t>
       </w:r>
       <w:r>
-        <w:t xml:space="preserve"> </w:t>
-      </w:r>
-      <w:proofErr w:type="spellStart"/>
-      <w:proofErr w:type="gramStart"/>
-      <w:r>
-        <w:t>A.</w:t>
+        <w:t xml:space="preserve"> A.</w:t>
       </w:r>
       <w:r>
         <w:t>Ziro</w:t>
       </w:r>
-      <w:proofErr w:type="spellEnd"/>
-      <w:proofErr w:type="gramEnd"/>
       <w:r>
         <w:rPr>
           <w:u w:val="single"/>
@@ -1099,6 +1060,16 @@
           <w:lang w:val="en-US"/>
         </w:rPr>
       </w:pPr>
+    </w:p>
+    <w:p>
+      <w:pPr>
+        <w:ind w:left="20" w:right="1057"/>
+        <w:jc w:val="center"/>
+        <w:rPr>
+          <w:b/>
+          <w:lang w:val="en-US"/>
+        </w:rPr>
+      </w:pPr>
       <w:r>
         <w:rPr>
           <w:b/>
@@ -1131,12 +1102,2235 @@
     </w:p>
     <w:p>
       <w:pPr>
+        <w:ind w:left="20" w:right="1057"/>
+        <w:jc w:val="center"/>
+        <w:rPr>
+          <w:b/>
+          <w:lang w:val="en-US"/>
+        </w:rPr>
+      </w:pPr>
+      <w:r>
+        <w:rPr>
+          <w:b/>
+          <w:bCs/>
+          <w:lang w:val="en-US"/>
+        </w:rPr>
+        <w:lastRenderedPageBreak/>
+        <w:t>FORECASTING CORRUPTION CRIME TRENDS IN KAZAKHSTAN USING REGRESSION MODELS AND TIME SERIES ANALYSIS WITH NEWS DATA</w:t>
+      </w:r>
+    </w:p>
+    <w:p>
+      <w:pPr>
         <w:ind w:firstLine="709"/>
         <w:rPr>
-          <w:b/>
-          <w:bCs/>
-          <w:lang w:val="en-US"/>
-        </w:rPr>
+          <w:lang w:val="en-US"/>
+        </w:rPr>
+      </w:pPr>
+    </w:p>
+    <w:p>
+      <w:pPr>
+        <w:ind w:firstLine="709"/>
+        <w:rPr>
+          <w:lang w:val="en-US"/>
+        </w:rPr>
+      </w:pPr>
+      <w:r>
+        <w:rPr>
+          <w:lang w:val="en-US"/>
+        </w:rPr>
+        <w:t>Abstract</w:t>
+      </w:r>
+      <w:r>
+        <w:rPr>
+          <w:lang w:val="en-US"/>
+        </w:rPr>
+        <w:t xml:space="preserve"> </w:t>
+      </w:r>
+      <w:r>
+        <w:rPr>
+          <w:lang w:val="en-US"/>
+        </w:rPr>
+        <w:t>–</w:t>
+      </w:r>
+      <w:r>
+        <w:rPr>
+          <w:lang w:val="en-US"/>
+        </w:rPr>
+        <w:t xml:space="preserve"> </w:t>
+      </w:r>
+      <w:r>
+        <w:rPr>
+          <w:lang w:val="en-US"/>
+        </w:rPr>
+        <w:t>Corruption remains a critical challenge for economic development, political stability, and social justice in Kazakhstan. Despite widespread media coverage on corruption issues, the reported crime statistics often appear disconnected from the intensity of media discourse. This discrepancy raises questions about the reliability of official statistics and the possibility of external influences on crime reporting.</w:t>
+      </w:r>
+    </w:p>
+    <w:p>
+      <w:pPr>
+        <w:ind w:firstLine="709"/>
+        <w:rPr>
+          <w:lang w:val="en-US"/>
+        </w:rPr>
+      </w:pPr>
+      <w:r>
+        <w:rPr>
+          <w:lang w:val="en-US"/>
+        </w:rPr>
+        <w:t>The primary objective of this study is to forecast monthly corruption crime numbers in Kazakhstan using advanced time series modeling techniques. A hybrid forecasting model integrating SARIMA, Prophet, and Linear Regression is developed to provide robust predictions.</w:t>
+      </w:r>
+    </w:p>
+    <w:p>
+      <w:pPr>
+        <w:ind w:firstLine="709"/>
+        <w:rPr>
+          <w:lang w:val="en-US"/>
+        </w:rPr>
+      </w:pPr>
+      <w:r>
+        <w:rPr>
+          <w:lang w:val="en-US"/>
+        </w:rPr>
+        <w:t>The research focuses on the dynamics of corruption crimes in Kazakhstan, as captured through official crime statistics and news media data.</w:t>
+      </w:r>
+    </w:p>
+    <w:p>
+      <w:pPr>
+        <w:ind w:firstLine="709"/>
+        <w:jc w:val="left"/>
+        <w:rPr>
+          <w:lang w:val="en-US"/>
+        </w:rPr>
+      </w:pPr>
+      <w:r>
+        <w:rPr>
+          <w:b/>
+          <w:bCs/>
+          <w:lang w:val="en-US"/>
+        </w:rPr>
+        <w:t>Research</w:t>
+      </w:r>
+      <w:r>
+        <w:rPr>
+          <w:b/>
+          <w:bCs/>
+          <w:lang w:val="en-US"/>
+        </w:rPr>
+        <w:t xml:space="preserve"> </w:t>
+      </w:r>
+      <w:r>
+        <w:rPr>
+          <w:b/>
+          <w:bCs/>
+          <w:lang w:val="en-US"/>
+        </w:rPr>
+        <w:t>Methods:</w:t>
+      </w:r>
+      <w:r>
+        <w:rPr>
+          <w:lang w:val="en-US"/>
+        </w:rPr>
+        <w:br/>
+        <w:t>Data is collected from two main sources:</w:t>
+      </w:r>
+    </w:p>
+    <w:p>
+      <w:pPr>
+        <w:numPr>
+          <w:ilvl w:val="0"/>
+          <w:numId w:val="4"/>
+        </w:numPr>
+        <w:rPr>
+          <w:lang w:val="en-US"/>
+        </w:rPr>
+      </w:pPr>
+      <w:r>
+        <w:rPr>
+          <w:lang w:val="en-US"/>
+        </w:rPr>
+        <w:t>Official monthly crime reports on corruption, starting from 2016.</w:t>
+      </w:r>
+    </w:p>
+    <w:p>
+      <w:pPr>
+        <w:numPr>
+          <w:ilvl w:val="0"/>
+          <w:numId w:val="4"/>
+        </w:numPr>
+        <w:rPr>
+          <w:lang w:val="en-US"/>
+        </w:rPr>
+      </w:pPr>
+      <w:r>
+        <w:rPr>
+          <w:lang w:val="en-US"/>
+        </w:rPr>
+        <w:t xml:space="preserve">News articles related to corruption, from which key corruption-related keywords are extracted and aggregated </w:t>
+      </w:r>
+      <w:r>
+        <w:rPr>
+          <w:lang w:val="en-US"/>
+        </w:rPr>
+        <w:t>monthly</w:t>
+      </w:r>
+      <w:r>
+        <w:rPr>
+          <w:lang w:val="en-US"/>
+        </w:rPr>
+        <w:t>.</w:t>
+      </w:r>
+    </w:p>
+    <w:p>
+      <w:pPr>
+        <w:ind w:firstLine="709"/>
+        <w:rPr>
+          <w:lang w:val="en-US"/>
+        </w:rPr>
+      </w:pPr>
+      <w:r>
+        <w:rPr>
+          <w:lang w:val="en-US"/>
+        </w:rPr>
+        <w:t>The two datasets are merged by date to create a unified time series. Time series models, including SARIMA and Prophet, are employed, and their performance is evaluated using cross-validation methods (rolling and expanding window CV). Statistical tests, such as Pearson correlation and Granger causality, are also applied to assess the relationship between media coverage and crime statistics.</w:t>
+      </w:r>
+    </w:p>
+    <w:p>
+      <w:pPr>
+        <w:ind w:firstLine="709"/>
+        <w:rPr>
+          <w:lang w:val="en-US"/>
+        </w:rPr>
+      </w:pPr>
+      <w:r>
+        <w:rPr>
+          <w:lang w:val="en-US"/>
+        </w:rPr>
+        <w:t>The hybrid forecasting model achieved high performance (R² &gt; 0.91, with the best model reaching an R² of 0.99), providing accurate forecasts for 2025 and 2026. Notably, the analysis revealed a weak correlation between media keyword counts and reported corruption crimes, suggesting that crime statistics might be influenced by external control or manipulation. This novel insight contributes to both scientific understanding and practical policy discussions regarding transparency in crime reporting.</w:t>
+      </w:r>
+    </w:p>
+    <w:p>
+      <w:pPr>
+        <w:ind w:firstLine="709"/>
+        <w:jc w:val="left"/>
+        <w:rPr>
+          <w:lang w:val="en-US"/>
+        </w:rPr>
+      </w:pPr>
+      <w:r>
+        <w:rPr>
+          <w:b/>
+          <w:bCs/>
+          <w:lang w:val="en-US"/>
+        </w:rPr>
+        <w:t>Volume and Structure of the Dissertation:</w:t>
+      </w:r>
+      <w:r>
+        <w:rPr>
+          <w:lang w:val="en-US"/>
+        </w:rPr>
+        <w:br/>
+      </w:r>
+      <w:r>
+        <w:rPr>
+          <w:lang w:val="en-US"/>
+        </w:rPr>
+        <w:t>None.</w:t>
+      </w:r>
+    </w:p>
+    <w:p>
+      <w:pPr>
+        <w:ind w:firstLine="709"/>
+        <w:jc w:val="left"/>
+        <w:rPr>
+          <w:lang w:val="en-US"/>
+        </w:rPr>
+      </w:pPr>
+      <w:r>
+        <w:rPr>
+          <w:b/>
+          <w:bCs/>
+          <w:lang w:val="en-US"/>
+        </w:rPr>
+        <w:t>Number of Illustrations, Tables, and References:</w:t>
+      </w:r>
+      <w:r>
+        <w:rPr>
+          <w:lang w:val="en-US"/>
+        </w:rPr>
+        <w:br/>
+      </w:r>
+      <w:r>
+        <w:rPr>
+          <w:lang w:val="en-US"/>
+        </w:rPr>
+        <w:t>None.</w:t>
+      </w:r>
+    </w:p>
+    <w:p>
+      <w:pPr>
+        <w:ind w:firstLine="709"/>
+        <w:jc w:val="left"/>
+        <w:rPr>
+          <w:lang w:val="en-US"/>
+        </w:rPr>
+      </w:pPr>
+      <w:r>
+        <w:rPr>
+          <w:b/>
+          <w:bCs/>
+          <w:lang w:val="en-US"/>
+        </w:rPr>
+        <w:t>List of Keywords:</w:t>
+      </w:r>
+      <w:r>
+        <w:rPr>
+          <w:lang w:val="en-US"/>
+        </w:rPr>
+        <w:br/>
+        <w:t>corruption, forecasting, time series, hybrid model, SARIMA, Prophet, Kazakhstan</w:t>
+      </w:r>
+    </w:p>
+    <w:p>
+      <w:pPr>
+        <w:ind w:firstLine="709"/>
+        <w:jc w:val="left"/>
+        <w:rPr>
+          <w:lang w:val="en-US"/>
+        </w:rPr>
+      </w:pPr>
+      <w:r>
+        <w:rPr>
+          <w:b/>
+          <w:bCs/>
+          <w:lang w:val="en-US"/>
+        </w:rPr>
+        <w:t>Information on Publications:</w:t>
+      </w:r>
+      <w:r>
+        <w:rPr>
+          <w:lang w:val="en-US"/>
+        </w:rPr>
+        <w:br/>
+      </w:r>
+      <w:r>
+        <w:rPr>
+          <w:lang w:val="en-US"/>
+        </w:rPr>
+        <w:t>None.</w:t>
+      </w:r>
+    </w:p>
+    <w:p>
+      <w:pPr>
+        <w:ind w:firstLine="709"/>
+        <w:rPr>
+          <w:lang w:val="en-US"/>
+        </w:rPr>
+      </w:pPr>
+    </w:p>
+    <w:p>
+      <w:pPr>
+        <w:ind w:firstLine="709"/>
+        <w:rPr>
+          <w:lang w:val="en-US"/>
+        </w:rPr>
+      </w:pPr>
+    </w:p>
+    <w:p>
+      <w:pPr>
+        <w:rPr>
+          <w:lang w:val="en-US"/>
+        </w:rPr>
+        <w:sectPr>
+          <w:footerReference w:type="default" r:id="rId9"/>
+          <w:pgSz w:w="11906" w:h="16838"/>
+          <w:pgMar w:top="1134" w:right="567" w:bottom="1134" w:left="1701" w:header="709" w:footer="709" w:gutter="0"/>
+          <w:cols w:space="708"/>
+          <w:titlePg/>
+          <w:docGrid w:linePitch="381"/>
+        </w:sectPr>
+      </w:pPr>
+      <w:r>
+        <w:rPr>
+          <w:lang w:val="en-US"/>
+        </w:rPr>
+        <w:br w:type="page"/>
+      </w:r>
+    </w:p>
+    <w:p>
+      <w:pPr>
+        <w:jc w:val="center"/>
+        <w:rPr>
+          <w:rFonts w:eastAsia="Times New Roman" w:cs="Times New Roman"/>
+          <w:b/>
+          <w:bCs/>
+          <w:color w:val="000000"/>
+          <w:szCs w:val="28"/>
+          <w:lang w:val="en-US" w:eastAsia="ru-RU"/>
+        </w:rPr>
+      </w:pPr>
+      <w:r>
+        <w:rPr>
+          <w:rFonts w:eastAsia="Times New Roman" w:cs="Times New Roman"/>
+          <w:b/>
+          <w:bCs/>
+          <w:color w:val="000000"/>
+          <w:szCs w:val="28"/>
+          <w:lang w:eastAsia="ru-RU"/>
+        </w:rPr>
+        <w:lastRenderedPageBreak/>
+        <w:t>ҚАЗАҚСТАНДАҒЫ</w:t>
+      </w:r>
+      <w:r>
+        <w:rPr>
+          <w:rFonts w:eastAsia="Times New Roman" w:cs="Times New Roman"/>
+          <w:b/>
+          <w:bCs/>
+          <w:color w:val="000000"/>
+          <w:szCs w:val="28"/>
+          <w:lang w:val="en-US" w:eastAsia="ru-RU"/>
+        </w:rPr>
+        <w:t xml:space="preserve"> </w:t>
+      </w:r>
+      <w:r>
+        <w:rPr>
+          <w:rFonts w:eastAsia="Times New Roman" w:cs="Times New Roman"/>
+          <w:b/>
+          <w:bCs/>
+          <w:color w:val="000000"/>
+          <w:szCs w:val="28"/>
+          <w:lang w:eastAsia="ru-RU"/>
+        </w:rPr>
+        <w:t>СЫБАЙЛАС</w:t>
+      </w:r>
+      <w:r>
+        <w:rPr>
+          <w:rFonts w:eastAsia="Times New Roman" w:cs="Times New Roman"/>
+          <w:b/>
+          <w:bCs/>
+          <w:color w:val="000000"/>
+          <w:szCs w:val="28"/>
+          <w:lang w:val="en-US" w:eastAsia="ru-RU"/>
+        </w:rPr>
+        <w:t xml:space="preserve"> </w:t>
+      </w:r>
+      <w:r>
+        <w:rPr>
+          <w:rFonts w:eastAsia="Times New Roman" w:cs="Times New Roman"/>
+          <w:b/>
+          <w:bCs/>
+          <w:color w:val="000000"/>
+          <w:szCs w:val="28"/>
+          <w:lang w:eastAsia="ru-RU"/>
+        </w:rPr>
+        <w:t>ЖЕМҚОРЛЫҚ</w:t>
+      </w:r>
+      <w:r>
+        <w:rPr>
+          <w:rFonts w:eastAsia="Times New Roman" w:cs="Times New Roman"/>
+          <w:b/>
+          <w:bCs/>
+          <w:color w:val="000000"/>
+          <w:szCs w:val="28"/>
+          <w:lang w:val="en-US" w:eastAsia="ru-RU"/>
+        </w:rPr>
+        <w:t xml:space="preserve"> </w:t>
+      </w:r>
+      <w:r>
+        <w:rPr>
+          <w:rFonts w:eastAsia="Times New Roman" w:cs="Times New Roman"/>
+          <w:b/>
+          <w:bCs/>
+          <w:color w:val="000000"/>
+          <w:szCs w:val="28"/>
+          <w:lang w:eastAsia="ru-RU"/>
+        </w:rPr>
+        <w:t>ҚЫЛМЫСТАРЫНЫҢ</w:t>
+      </w:r>
+      <w:r>
+        <w:rPr>
+          <w:rFonts w:eastAsia="Times New Roman" w:cs="Times New Roman"/>
+          <w:b/>
+          <w:bCs/>
+          <w:color w:val="000000"/>
+          <w:szCs w:val="28"/>
+          <w:lang w:val="en-US" w:eastAsia="ru-RU"/>
+        </w:rPr>
+        <w:t xml:space="preserve"> </w:t>
+      </w:r>
+      <w:r>
+        <w:rPr>
+          <w:rFonts w:eastAsia="Times New Roman" w:cs="Times New Roman"/>
+          <w:b/>
+          <w:bCs/>
+          <w:color w:val="000000"/>
+          <w:szCs w:val="28"/>
+          <w:lang w:eastAsia="ru-RU"/>
+        </w:rPr>
+        <w:t>ТЕНДЕНЦИЯЛАРЫН</w:t>
+      </w:r>
+      <w:r>
+        <w:rPr>
+          <w:rFonts w:eastAsia="Times New Roman" w:cs="Times New Roman"/>
+          <w:b/>
+          <w:bCs/>
+          <w:color w:val="000000"/>
+          <w:szCs w:val="28"/>
+          <w:lang w:val="en-US" w:eastAsia="ru-RU"/>
+        </w:rPr>
+        <w:t xml:space="preserve"> </w:t>
+      </w:r>
+      <w:r>
+        <w:rPr>
+          <w:rFonts w:eastAsia="Times New Roman" w:cs="Times New Roman"/>
+          <w:b/>
+          <w:bCs/>
+          <w:color w:val="000000"/>
+          <w:szCs w:val="28"/>
+          <w:lang w:eastAsia="ru-RU"/>
+        </w:rPr>
+        <w:t>РЕГРЕССИЯЛЫҚ</w:t>
+      </w:r>
+      <w:r>
+        <w:rPr>
+          <w:rFonts w:eastAsia="Times New Roman" w:cs="Times New Roman"/>
+          <w:b/>
+          <w:bCs/>
+          <w:color w:val="000000"/>
+          <w:szCs w:val="28"/>
+          <w:lang w:val="en-US" w:eastAsia="ru-RU"/>
+        </w:rPr>
+        <w:t xml:space="preserve"> </w:t>
+      </w:r>
+      <w:r>
+        <w:rPr>
+          <w:rFonts w:eastAsia="Times New Roman" w:cs="Times New Roman"/>
+          <w:b/>
+          <w:bCs/>
+          <w:color w:val="000000"/>
+          <w:szCs w:val="28"/>
+          <w:lang w:eastAsia="ru-RU"/>
+        </w:rPr>
+        <w:t>МОДЕЛЬДЕР</w:t>
+      </w:r>
+      <w:r>
+        <w:rPr>
+          <w:rFonts w:eastAsia="Times New Roman" w:cs="Times New Roman"/>
+          <w:b/>
+          <w:bCs/>
+          <w:color w:val="000000"/>
+          <w:szCs w:val="28"/>
+          <w:lang w:val="en-US" w:eastAsia="ru-RU"/>
+        </w:rPr>
+        <w:t xml:space="preserve">, </w:t>
+      </w:r>
+      <w:r>
+        <w:rPr>
+          <w:rFonts w:eastAsia="Times New Roman" w:cs="Times New Roman"/>
+          <w:b/>
+          <w:bCs/>
+          <w:color w:val="000000"/>
+          <w:szCs w:val="28"/>
+          <w:lang w:eastAsia="ru-RU"/>
+        </w:rPr>
+        <w:t>УАҚЫТТЫҚ</w:t>
+      </w:r>
+      <w:r>
+        <w:rPr>
+          <w:rFonts w:eastAsia="Times New Roman" w:cs="Times New Roman"/>
+          <w:b/>
+          <w:bCs/>
+          <w:color w:val="000000"/>
+          <w:szCs w:val="28"/>
+          <w:lang w:val="en-US" w:eastAsia="ru-RU"/>
+        </w:rPr>
+        <w:t xml:space="preserve"> </w:t>
+      </w:r>
+      <w:r>
+        <w:rPr>
+          <w:rFonts w:eastAsia="Times New Roman" w:cs="Times New Roman"/>
+          <w:b/>
+          <w:bCs/>
+          <w:color w:val="000000"/>
+          <w:szCs w:val="28"/>
+          <w:lang w:eastAsia="ru-RU"/>
+        </w:rPr>
+        <w:t>ҚАТАРЛАР</w:t>
+      </w:r>
+      <w:r>
+        <w:rPr>
+          <w:rFonts w:eastAsia="Times New Roman" w:cs="Times New Roman"/>
+          <w:b/>
+          <w:bCs/>
+          <w:color w:val="000000"/>
+          <w:szCs w:val="28"/>
+          <w:lang w:val="en-US" w:eastAsia="ru-RU"/>
+        </w:rPr>
+        <w:t xml:space="preserve"> </w:t>
+      </w:r>
+      <w:r>
+        <w:rPr>
+          <w:rFonts w:eastAsia="Times New Roman" w:cs="Times New Roman"/>
+          <w:b/>
+          <w:bCs/>
+          <w:color w:val="000000"/>
+          <w:szCs w:val="28"/>
+          <w:lang w:eastAsia="ru-RU"/>
+        </w:rPr>
+        <w:t>АНАЛИЗІ</w:t>
+      </w:r>
+      <w:r>
+        <w:rPr>
+          <w:rFonts w:eastAsia="Times New Roman" w:cs="Times New Roman"/>
+          <w:b/>
+          <w:bCs/>
+          <w:color w:val="000000"/>
+          <w:szCs w:val="28"/>
+          <w:lang w:val="en-US" w:eastAsia="ru-RU"/>
+        </w:rPr>
+        <w:t xml:space="preserve"> </w:t>
+      </w:r>
+      <w:r>
+        <w:rPr>
+          <w:rFonts w:eastAsia="Times New Roman" w:cs="Times New Roman"/>
+          <w:b/>
+          <w:bCs/>
+          <w:color w:val="000000"/>
+          <w:szCs w:val="28"/>
+          <w:lang w:eastAsia="ru-RU"/>
+        </w:rPr>
+        <w:t>ЖӘНЕ</w:t>
+      </w:r>
+      <w:r>
+        <w:rPr>
+          <w:rFonts w:eastAsia="Times New Roman" w:cs="Times New Roman"/>
+          <w:b/>
+          <w:bCs/>
+          <w:color w:val="000000"/>
+          <w:szCs w:val="28"/>
+          <w:lang w:val="en-US" w:eastAsia="ru-RU"/>
+        </w:rPr>
+        <w:t xml:space="preserve"> </w:t>
+      </w:r>
+      <w:r>
+        <w:rPr>
+          <w:rFonts w:eastAsia="Times New Roman" w:cs="Times New Roman"/>
+          <w:b/>
+          <w:bCs/>
+          <w:color w:val="000000"/>
+          <w:szCs w:val="28"/>
+          <w:lang w:eastAsia="ru-RU"/>
+        </w:rPr>
+        <w:t>ЖАҢАЛЫҚТАР</w:t>
+      </w:r>
+      <w:r>
+        <w:rPr>
+          <w:rFonts w:eastAsia="Times New Roman" w:cs="Times New Roman"/>
+          <w:b/>
+          <w:bCs/>
+          <w:color w:val="000000"/>
+          <w:szCs w:val="28"/>
+          <w:lang w:val="en-US" w:eastAsia="ru-RU"/>
+        </w:rPr>
+        <w:t xml:space="preserve"> </w:t>
+      </w:r>
+      <w:r>
+        <w:rPr>
+          <w:rFonts w:eastAsia="Times New Roman" w:cs="Times New Roman"/>
+          <w:b/>
+          <w:bCs/>
+          <w:color w:val="000000"/>
+          <w:szCs w:val="28"/>
+          <w:lang w:eastAsia="ru-RU"/>
+        </w:rPr>
+        <w:t>ДЕРЕКТЕРІ</w:t>
+      </w:r>
+      <w:r>
+        <w:rPr>
+          <w:rFonts w:eastAsia="Times New Roman" w:cs="Times New Roman"/>
+          <w:b/>
+          <w:bCs/>
+          <w:color w:val="000000"/>
+          <w:szCs w:val="28"/>
+          <w:lang w:val="en-US" w:eastAsia="ru-RU"/>
+        </w:rPr>
+        <w:t xml:space="preserve"> </w:t>
+      </w:r>
+      <w:r>
+        <w:rPr>
+          <w:rFonts w:eastAsia="Times New Roman" w:cs="Times New Roman"/>
+          <w:b/>
+          <w:bCs/>
+          <w:color w:val="000000"/>
+          <w:szCs w:val="28"/>
+          <w:lang w:eastAsia="ru-RU"/>
+        </w:rPr>
+        <w:t>АРҚЫЛЫ</w:t>
+      </w:r>
+      <w:r>
+        <w:rPr>
+          <w:rFonts w:eastAsia="Times New Roman" w:cs="Times New Roman"/>
+          <w:b/>
+          <w:bCs/>
+          <w:color w:val="000000"/>
+          <w:szCs w:val="28"/>
+          <w:lang w:val="en-US" w:eastAsia="ru-RU"/>
+        </w:rPr>
+        <w:t xml:space="preserve">  </w:t>
+      </w:r>
+      <w:r>
+        <w:rPr>
+          <w:rFonts w:eastAsia="Times New Roman" w:cs="Times New Roman"/>
+          <w:b/>
+          <w:bCs/>
+          <w:color w:val="000000"/>
+          <w:szCs w:val="28"/>
+          <w:lang w:eastAsia="ru-RU"/>
+        </w:rPr>
+        <w:t>БОЛЖАУ</w:t>
+      </w:r>
+    </w:p>
+    <w:p>
+      <w:pPr>
+        <w:rPr>
+          <w:lang w:val="en-US"/>
+        </w:rPr>
+      </w:pPr>
+    </w:p>
+    <w:p>
+      <w:pPr>
+        <w:ind w:firstLine="708"/>
+        <w:rPr>
+          <w:lang w:val="en-US"/>
+        </w:rPr>
+      </w:pPr>
+      <w:r>
+        <w:rPr>
+          <w:szCs w:val="28"/>
+        </w:rPr>
+        <w:t>Аңдатпа</w:t>
+      </w:r>
+      <w:r>
+        <w:rPr>
+          <w:szCs w:val="28"/>
+          <w:lang w:val="en-US"/>
+        </w:rPr>
+        <w:t xml:space="preserve"> </w:t>
+      </w:r>
+      <w:r>
+        <w:rPr>
+          <w:lang w:val="en-US"/>
+        </w:rPr>
+        <w:t xml:space="preserve">– </w:t>
+      </w:r>
+      <w:r>
+        <w:t>Қазақстанда</w:t>
+      </w:r>
+      <w:r>
+        <w:rPr>
+          <w:lang w:val="en-US"/>
+        </w:rPr>
+        <w:t xml:space="preserve"> </w:t>
+      </w:r>
+      <w:r>
+        <w:t>жемқорлық</w:t>
+      </w:r>
+      <w:r>
+        <w:rPr>
+          <w:lang w:val="en-US"/>
+        </w:rPr>
+        <w:t xml:space="preserve"> </w:t>
+      </w:r>
+      <w:r>
+        <w:t>экономикалық</w:t>
+      </w:r>
+      <w:r>
+        <w:rPr>
+          <w:lang w:val="en-US"/>
+        </w:rPr>
+        <w:t xml:space="preserve"> </w:t>
+      </w:r>
+      <w:r>
+        <w:t>даму</w:t>
+      </w:r>
+      <w:r>
+        <w:rPr>
+          <w:lang w:val="en-US"/>
+        </w:rPr>
+        <w:t xml:space="preserve">, </w:t>
+      </w:r>
+      <w:r>
+        <w:t>саяси</w:t>
+      </w:r>
+      <w:r>
+        <w:rPr>
+          <w:lang w:val="en-US"/>
+        </w:rPr>
+        <w:t xml:space="preserve"> </w:t>
+      </w:r>
+      <w:r>
+        <w:t>тұрақтылық</w:t>
+      </w:r>
+      <w:r>
+        <w:rPr>
+          <w:lang w:val="en-US"/>
+        </w:rPr>
+        <w:t xml:space="preserve"> </w:t>
+      </w:r>
+      <w:r>
+        <w:t>және</w:t>
+      </w:r>
+      <w:r>
+        <w:rPr>
+          <w:lang w:val="en-US"/>
+        </w:rPr>
+        <w:t xml:space="preserve"> </w:t>
+      </w:r>
+      <w:r>
+        <w:t>әлеуметтік</w:t>
+      </w:r>
+      <w:r>
+        <w:rPr>
+          <w:lang w:val="en-US"/>
+        </w:rPr>
+        <w:t xml:space="preserve"> </w:t>
+      </w:r>
+      <w:r>
+        <w:t>әділеттілік</w:t>
+      </w:r>
+      <w:r>
+        <w:rPr>
+          <w:lang w:val="en-US"/>
+        </w:rPr>
+        <w:t xml:space="preserve"> </w:t>
+      </w:r>
+      <w:r>
+        <w:t>үшін</w:t>
+      </w:r>
+      <w:r>
+        <w:rPr>
+          <w:lang w:val="en-US"/>
+        </w:rPr>
+        <w:t xml:space="preserve"> </w:t>
+      </w:r>
+      <w:r>
+        <w:t>аса</w:t>
+      </w:r>
+      <w:r>
+        <w:rPr>
+          <w:lang w:val="en-US"/>
+        </w:rPr>
+        <w:t xml:space="preserve"> </w:t>
+      </w:r>
+      <w:r>
+        <w:t>маңызды</w:t>
+      </w:r>
+      <w:r>
+        <w:rPr>
+          <w:lang w:val="en-US"/>
+        </w:rPr>
+        <w:t xml:space="preserve"> </w:t>
+      </w:r>
+      <w:r>
+        <w:t>қиындық</w:t>
+      </w:r>
+      <w:r>
+        <w:rPr>
+          <w:lang w:val="en-US"/>
+        </w:rPr>
+        <w:t xml:space="preserve"> </w:t>
+      </w:r>
+      <w:r>
+        <w:t>болып</w:t>
+      </w:r>
+      <w:r>
+        <w:rPr>
+          <w:lang w:val="en-US"/>
+        </w:rPr>
+        <w:t xml:space="preserve"> </w:t>
+      </w:r>
+      <w:r>
+        <w:t>қала</w:t>
+      </w:r>
+      <w:r>
+        <w:rPr>
+          <w:lang w:val="en-US"/>
+        </w:rPr>
+        <w:t xml:space="preserve"> </w:t>
+      </w:r>
+      <w:r>
+        <w:t>береді</w:t>
+      </w:r>
+      <w:r>
+        <w:rPr>
+          <w:lang w:val="en-US"/>
+        </w:rPr>
+        <w:t xml:space="preserve">. </w:t>
+      </w:r>
+      <w:r>
+        <w:t>Жемқорлық</w:t>
+      </w:r>
+      <w:r>
+        <w:rPr>
+          <w:lang w:val="en-US"/>
+        </w:rPr>
+        <w:t xml:space="preserve"> </w:t>
+      </w:r>
+      <w:r>
+        <w:t>мәселелеріне</w:t>
+      </w:r>
+      <w:r>
+        <w:rPr>
+          <w:lang w:val="en-US"/>
+        </w:rPr>
+        <w:t xml:space="preserve"> </w:t>
+      </w:r>
+      <w:r>
+        <w:t>қатысты</w:t>
+      </w:r>
+      <w:r>
+        <w:rPr>
+          <w:lang w:val="en-US"/>
+        </w:rPr>
+        <w:t xml:space="preserve"> </w:t>
+      </w:r>
+      <w:r>
+        <w:t>медиа</w:t>
+      </w:r>
+      <w:r>
+        <w:rPr>
+          <w:lang w:val="en-US"/>
+        </w:rPr>
+        <w:t xml:space="preserve"> </w:t>
+      </w:r>
+      <w:r>
+        <w:t>кеңістігіндегі</w:t>
+      </w:r>
+      <w:r>
+        <w:rPr>
+          <w:lang w:val="en-US"/>
+        </w:rPr>
+        <w:t xml:space="preserve"> </w:t>
+      </w:r>
+      <w:r>
+        <w:t>кең</w:t>
+      </w:r>
+      <w:r>
+        <w:rPr>
+          <w:lang w:val="en-US"/>
+        </w:rPr>
+        <w:t xml:space="preserve"> </w:t>
+      </w:r>
+      <w:r>
+        <w:t>ауқымды</w:t>
+      </w:r>
+      <w:r>
+        <w:rPr>
+          <w:lang w:val="en-US"/>
+        </w:rPr>
+        <w:t xml:space="preserve"> </w:t>
+      </w:r>
+      <w:r>
+        <w:t>хабарландыруға</w:t>
+      </w:r>
+      <w:r>
+        <w:rPr>
+          <w:lang w:val="en-US"/>
+        </w:rPr>
+        <w:t xml:space="preserve"> </w:t>
+      </w:r>
+      <w:r>
+        <w:t>қарамастан</w:t>
+      </w:r>
+      <w:r>
+        <w:rPr>
+          <w:lang w:val="en-US"/>
+        </w:rPr>
+        <w:t xml:space="preserve">, </w:t>
+      </w:r>
+      <w:r>
+        <w:t>ресми</w:t>
+      </w:r>
+      <w:r>
+        <w:rPr>
+          <w:lang w:val="en-US"/>
+        </w:rPr>
+        <w:t xml:space="preserve"> </w:t>
+      </w:r>
+      <w:r>
+        <w:t>қылмыс</w:t>
+      </w:r>
+      <w:r>
+        <w:rPr>
+          <w:lang w:val="en-US"/>
+        </w:rPr>
+        <w:t xml:space="preserve"> </w:t>
+      </w:r>
+      <w:r>
+        <w:t>статистикасы</w:t>
+      </w:r>
+      <w:r>
+        <w:rPr>
+          <w:lang w:val="en-US"/>
+        </w:rPr>
+        <w:t xml:space="preserve"> </w:t>
+      </w:r>
+      <w:r>
+        <w:t>көбіне</w:t>
+      </w:r>
+      <w:r>
+        <w:rPr>
+          <w:lang w:val="en-US"/>
+        </w:rPr>
+        <w:t xml:space="preserve"> </w:t>
+      </w:r>
+      <w:r>
+        <w:t>медиа</w:t>
+      </w:r>
+      <w:r>
+        <w:rPr>
+          <w:lang w:val="en-US"/>
+        </w:rPr>
+        <w:t xml:space="preserve"> </w:t>
+      </w:r>
+      <w:r>
+        <w:t>дискурстың</w:t>
+      </w:r>
+      <w:r>
+        <w:rPr>
+          <w:lang w:val="en-US"/>
+        </w:rPr>
+        <w:t xml:space="preserve"> </w:t>
+      </w:r>
+      <w:r>
+        <w:t>қарқындығынан</w:t>
+      </w:r>
+      <w:r>
+        <w:rPr>
+          <w:lang w:val="en-US"/>
+        </w:rPr>
+        <w:t xml:space="preserve"> </w:t>
+      </w:r>
+      <w:r>
+        <w:t>ажыратылып</w:t>
+      </w:r>
+      <w:r>
+        <w:rPr>
+          <w:lang w:val="en-US"/>
+        </w:rPr>
+        <w:t xml:space="preserve"> </w:t>
+      </w:r>
+      <w:r>
+        <w:t>көрінеді</w:t>
+      </w:r>
+      <w:r>
+        <w:rPr>
+          <w:lang w:val="en-US"/>
+        </w:rPr>
+        <w:t xml:space="preserve">. </w:t>
+      </w:r>
+      <w:r>
+        <w:t>Бұл</w:t>
+      </w:r>
+      <w:r>
+        <w:rPr>
+          <w:lang w:val="en-US"/>
+        </w:rPr>
+        <w:t xml:space="preserve"> </w:t>
+      </w:r>
+      <w:r>
+        <w:t>айырмашылық</w:t>
+      </w:r>
+      <w:r>
+        <w:rPr>
+          <w:lang w:val="en-US"/>
+        </w:rPr>
+        <w:t xml:space="preserve"> </w:t>
+      </w:r>
+      <w:r>
+        <w:t>ресми</w:t>
+      </w:r>
+      <w:r>
+        <w:rPr>
+          <w:lang w:val="en-US"/>
+        </w:rPr>
+        <w:t xml:space="preserve"> </w:t>
+      </w:r>
+      <w:r>
+        <w:t>статистиканың</w:t>
+      </w:r>
+      <w:r>
+        <w:rPr>
+          <w:lang w:val="en-US"/>
+        </w:rPr>
+        <w:t xml:space="preserve"> </w:t>
+      </w:r>
+      <w:r>
+        <w:t>сенімділігіне</w:t>
+      </w:r>
+      <w:r>
+        <w:rPr>
+          <w:lang w:val="en-US"/>
+        </w:rPr>
+        <w:t xml:space="preserve"> </w:t>
+      </w:r>
+      <w:r>
+        <w:t>және</w:t>
+      </w:r>
+      <w:r>
+        <w:rPr>
+          <w:lang w:val="en-US"/>
+        </w:rPr>
+        <w:t xml:space="preserve"> </w:t>
+      </w:r>
+      <w:r>
+        <w:t>қылмыс</w:t>
+      </w:r>
+      <w:r>
+        <w:rPr>
+          <w:lang w:val="en-US"/>
+        </w:rPr>
+        <w:t xml:space="preserve"> </w:t>
+      </w:r>
+      <w:r>
+        <w:t>туралы</w:t>
+      </w:r>
+      <w:r>
+        <w:rPr>
+          <w:lang w:val="en-US"/>
+        </w:rPr>
+        <w:t xml:space="preserve"> </w:t>
+      </w:r>
+      <w:r>
+        <w:t>есеп</w:t>
+      </w:r>
+      <w:r>
+        <w:rPr>
+          <w:lang w:val="en-US"/>
+        </w:rPr>
+        <w:t xml:space="preserve"> </w:t>
+      </w:r>
+      <w:r>
+        <w:t>беру</w:t>
+      </w:r>
+      <w:r>
+        <w:rPr>
+          <w:lang w:val="en-US"/>
+        </w:rPr>
+        <w:t xml:space="preserve"> </w:t>
+      </w:r>
+      <w:r>
+        <w:t>кезінде</w:t>
+      </w:r>
+      <w:r>
+        <w:rPr>
+          <w:lang w:val="en-US"/>
+        </w:rPr>
+        <w:t xml:space="preserve"> </w:t>
+      </w:r>
+      <w:r>
+        <w:t>сыртқы</w:t>
+      </w:r>
+      <w:r>
+        <w:rPr>
+          <w:lang w:val="en-US"/>
+        </w:rPr>
+        <w:t xml:space="preserve"> </w:t>
+      </w:r>
+      <w:r>
+        <w:t>әсердің</w:t>
+      </w:r>
+      <w:r>
+        <w:rPr>
+          <w:lang w:val="en-US"/>
+        </w:rPr>
+        <w:t xml:space="preserve"> </w:t>
+      </w:r>
+      <w:r>
+        <w:t>ықтималдығына</w:t>
+      </w:r>
+      <w:r>
+        <w:rPr>
+          <w:lang w:val="en-US"/>
+        </w:rPr>
+        <w:t xml:space="preserve"> </w:t>
+      </w:r>
+      <w:r>
+        <w:t>қатысты</w:t>
+      </w:r>
+      <w:r>
+        <w:rPr>
+          <w:lang w:val="en-US"/>
+        </w:rPr>
+        <w:t xml:space="preserve"> </w:t>
+      </w:r>
+      <w:r>
+        <w:t>сұрақтар</w:t>
+      </w:r>
+      <w:r>
+        <w:rPr>
+          <w:lang w:val="en-US"/>
+        </w:rPr>
+        <w:t xml:space="preserve"> </w:t>
+      </w:r>
+      <w:r>
+        <w:t>туғызады</w:t>
+      </w:r>
+      <w:r>
+        <w:rPr>
+          <w:lang w:val="en-US"/>
+        </w:rPr>
+        <w:t>.</w:t>
+      </w:r>
+    </w:p>
+    <w:p>
+      <w:pPr>
+        <w:ind w:firstLine="708"/>
+        <w:rPr>
+          <w:lang w:val="en-US"/>
+        </w:rPr>
+      </w:pPr>
+      <w:r>
+        <w:t>Осы</w:t>
+      </w:r>
+      <w:r>
+        <w:rPr>
+          <w:lang w:val="en-US"/>
+        </w:rPr>
+        <w:t xml:space="preserve"> </w:t>
+      </w:r>
+      <w:r>
+        <w:t>зерттеудің</w:t>
+      </w:r>
+      <w:r>
+        <w:rPr>
+          <w:lang w:val="en-US"/>
+        </w:rPr>
+        <w:t xml:space="preserve"> </w:t>
+      </w:r>
+      <w:r>
+        <w:t>негізгі</w:t>
+      </w:r>
+      <w:r>
+        <w:rPr>
+          <w:lang w:val="en-US"/>
+        </w:rPr>
+        <w:t xml:space="preserve"> </w:t>
+      </w:r>
+      <w:r>
+        <w:t>мақсаты</w:t>
+      </w:r>
+      <w:r>
+        <w:rPr>
+          <w:lang w:val="en-US"/>
+        </w:rPr>
+        <w:t xml:space="preserve"> – </w:t>
+      </w:r>
+      <w:r>
+        <w:t>Қазақстандағы</w:t>
+      </w:r>
+      <w:r>
+        <w:rPr>
+          <w:lang w:val="en-US"/>
+        </w:rPr>
+        <w:t xml:space="preserve"> </w:t>
+      </w:r>
+      <w:r>
+        <w:t>жемқорлық</w:t>
+      </w:r>
+      <w:r>
+        <w:rPr>
+          <w:lang w:val="en-US"/>
+        </w:rPr>
+        <w:t xml:space="preserve"> </w:t>
+      </w:r>
+      <w:r>
+        <w:t>қылмыстарының</w:t>
+      </w:r>
+      <w:r>
+        <w:rPr>
+          <w:lang w:val="en-US"/>
+        </w:rPr>
+        <w:t xml:space="preserve"> </w:t>
+      </w:r>
+      <w:r>
+        <w:t>ай</w:t>
+      </w:r>
+      <w:r>
+        <w:rPr>
+          <w:lang w:val="en-US"/>
+        </w:rPr>
+        <w:t xml:space="preserve"> </w:t>
+      </w:r>
+      <w:r>
+        <w:t>сайынғы</w:t>
+      </w:r>
+      <w:r>
+        <w:rPr>
+          <w:lang w:val="en-US"/>
+        </w:rPr>
+        <w:t xml:space="preserve"> </w:t>
+      </w:r>
+      <w:r>
+        <w:t>санын</w:t>
+      </w:r>
+      <w:r>
+        <w:rPr>
+          <w:lang w:val="en-US"/>
+        </w:rPr>
+        <w:t xml:space="preserve"> </w:t>
+      </w:r>
+      <w:r>
+        <w:t>заманауи</w:t>
+      </w:r>
+      <w:r>
+        <w:rPr>
+          <w:lang w:val="en-US"/>
+        </w:rPr>
+        <w:t xml:space="preserve"> </w:t>
+      </w:r>
+      <w:r>
+        <w:t>уақыттық</w:t>
+      </w:r>
+      <w:r>
+        <w:rPr>
+          <w:lang w:val="en-US"/>
+        </w:rPr>
+        <w:t xml:space="preserve"> </w:t>
+      </w:r>
+      <w:r>
+        <w:t>қатар</w:t>
+      </w:r>
+      <w:r>
+        <w:rPr>
+          <w:lang w:val="en-US"/>
+        </w:rPr>
+        <w:t xml:space="preserve"> </w:t>
+      </w:r>
+      <w:r>
+        <w:t>моделдеу</w:t>
+      </w:r>
+      <w:r>
+        <w:rPr>
+          <w:lang w:val="en-US"/>
+        </w:rPr>
+        <w:t xml:space="preserve"> </w:t>
+      </w:r>
+      <w:r>
+        <w:t>әдістерін</w:t>
+      </w:r>
+      <w:r>
+        <w:rPr>
+          <w:lang w:val="en-US"/>
+        </w:rPr>
+        <w:t xml:space="preserve"> </w:t>
+      </w:r>
+      <w:r>
+        <w:t>пайдалана</w:t>
+      </w:r>
+      <w:r>
+        <w:rPr>
+          <w:lang w:val="en-US"/>
+        </w:rPr>
+        <w:t xml:space="preserve"> </w:t>
+      </w:r>
+      <w:r>
+        <w:t>отырып</w:t>
+      </w:r>
+      <w:r>
+        <w:rPr>
+          <w:lang w:val="en-US"/>
+        </w:rPr>
+        <w:t xml:space="preserve"> </w:t>
+      </w:r>
+      <w:r>
+        <w:t>болжау</w:t>
+      </w:r>
+      <w:r>
+        <w:rPr>
+          <w:lang w:val="en-US"/>
+        </w:rPr>
+        <w:t xml:space="preserve">. </w:t>
+      </w:r>
+      <w:r>
+        <w:t>Болжау</w:t>
+      </w:r>
+      <w:r>
+        <w:rPr>
+          <w:lang w:val="en-US"/>
+        </w:rPr>
+        <w:t xml:space="preserve"> </w:t>
+      </w:r>
+      <w:r>
+        <w:t>үшін</w:t>
+      </w:r>
+      <w:r>
+        <w:rPr>
+          <w:lang w:val="en-US"/>
+        </w:rPr>
+        <w:t xml:space="preserve"> SARIMA, Prophet </w:t>
+      </w:r>
+      <w:r>
+        <w:t>және</w:t>
+      </w:r>
+      <w:r>
+        <w:rPr>
+          <w:lang w:val="en-US"/>
+        </w:rPr>
+        <w:t xml:space="preserve"> </w:t>
+      </w:r>
+      <w:r>
+        <w:t>сызықтық</w:t>
+      </w:r>
+      <w:r>
+        <w:rPr>
+          <w:lang w:val="en-US"/>
+        </w:rPr>
+        <w:t xml:space="preserve"> </w:t>
+      </w:r>
+      <w:r>
+        <w:t>регрессияны</w:t>
+      </w:r>
+      <w:r>
+        <w:rPr>
+          <w:lang w:val="en-US"/>
+        </w:rPr>
+        <w:t xml:space="preserve"> </w:t>
+      </w:r>
+      <w:r>
+        <w:t>біріктіретін</w:t>
+      </w:r>
+      <w:r>
+        <w:rPr>
+          <w:lang w:val="en-US"/>
+        </w:rPr>
+        <w:t xml:space="preserve"> </w:t>
+      </w:r>
+      <w:r>
+        <w:t>гибридтік</w:t>
+      </w:r>
+      <w:r>
+        <w:rPr>
+          <w:lang w:val="en-US"/>
+        </w:rPr>
+        <w:t xml:space="preserve"> </w:t>
+      </w:r>
+      <w:r>
+        <w:t>модель</w:t>
+      </w:r>
+      <w:r>
+        <w:rPr>
+          <w:lang w:val="en-US"/>
+        </w:rPr>
+        <w:t xml:space="preserve"> </w:t>
+      </w:r>
+      <w:r>
+        <w:t>әзірленді</w:t>
+      </w:r>
+      <w:r>
+        <w:rPr>
+          <w:lang w:val="en-US"/>
+        </w:rPr>
+        <w:t xml:space="preserve">, </w:t>
+      </w:r>
+      <w:r>
+        <w:t>ол</w:t>
+      </w:r>
+      <w:r>
+        <w:rPr>
+          <w:lang w:val="en-US"/>
+        </w:rPr>
+        <w:t xml:space="preserve"> </w:t>
+      </w:r>
+      <w:r>
+        <w:t>сенімді</w:t>
+      </w:r>
+      <w:r>
+        <w:rPr>
+          <w:lang w:val="en-US"/>
+        </w:rPr>
+        <w:t xml:space="preserve"> </w:t>
+      </w:r>
+      <w:r>
+        <w:t>болжамдар</w:t>
+      </w:r>
+      <w:r>
+        <w:rPr>
+          <w:lang w:val="en-US"/>
+        </w:rPr>
+        <w:t xml:space="preserve"> </w:t>
+      </w:r>
+      <w:r>
+        <w:t>береді</w:t>
+      </w:r>
+      <w:r>
+        <w:rPr>
+          <w:lang w:val="en-US"/>
+        </w:rPr>
+        <w:t>.</w:t>
+      </w:r>
+    </w:p>
+    <w:p>
+      <w:pPr>
+        <w:ind w:firstLine="708"/>
+        <w:rPr>
+          <w:lang w:val="en-US"/>
+        </w:rPr>
+      </w:pPr>
+      <w:r>
+        <w:t>Зерттеу</w:t>
+      </w:r>
+      <w:r>
+        <w:rPr>
+          <w:lang w:val="en-US"/>
+        </w:rPr>
+        <w:t xml:space="preserve"> </w:t>
+      </w:r>
+      <w:r>
+        <w:t>Қазақстандағы</w:t>
+      </w:r>
+      <w:r>
+        <w:rPr>
+          <w:lang w:val="en-US"/>
+        </w:rPr>
+        <w:t xml:space="preserve"> </w:t>
+      </w:r>
+      <w:r>
+        <w:t>жемқорлық</w:t>
+      </w:r>
+      <w:r>
+        <w:rPr>
+          <w:lang w:val="en-US"/>
+        </w:rPr>
+        <w:t xml:space="preserve"> </w:t>
+      </w:r>
+      <w:r>
+        <w:t>қылмыстарының</w:t>
+      </w:r>
+      <w:r>
+        <w:rPr>
+          <w:lang w:val="en-US"/>
+        </w:rPr>
+        <w:t xml:space="preserve"> </w:t>
+      </w:r>
+      <w:r>
+        <w:t>динамикасына</w:t>
+      </w:r>
+      <w:r>
+        <w:rPr>
+          <w:lang w:val="en-US"/>
+        </w:rPr>
+        <w:t xml:space="preserve"> </w:t>
+      </w:r>
+      <w:r>
+        <w:t>бағытталған</w:t>
+      </w:r>
+      <w:r>
+        <w:rPr>
+          <w:lang w:val="en-US"/>
+        </w:rPr>
+        <w:t xml:space="preserve">, </w:t>
+      </w:r>
+      <w:r>
+        <w:t>бұл</w:t>
+      </w:r>
+      <w:r>
+        <w:rPr>
+          <w:lang w:val="en-US"/>
+        </w:rPr>
+        <w:t xml:space="preserve"> </w:t>
+      </w:r>
+      <w:r>
+        <w:t>ресми</w:t>
+      </w:r>
+      <w:r>
+        <w:rPr>
+          <w:lang w:val="en-US"/>
+        </w:rPr>
+        <w:t xml:space="preserve"> </w:t>
+      </w:r>
+      <w:r>
+        <w:t>қылмыс</w:t>
+      </w:r>
+      <w:r>
+        <w:rPr>
+          <w:lang w:val="en-US"/>
+        </w:rPr>
+        <w:t xml:space="preserve"> </w:t>
+      </w:r>
+      <w:r>
+        <w:t>статистикасы</w:t>
+      </w:r>
+      <w:r>
+        <w:rPr>
+          <w:lang w:val="en-US"/>
+        </w:rPr>
+        <w:t xml:space="preserve"> </w:t>
+      </w:r>
+      <w:r>
+        <w:t>мен</w:t>
+      </w:r>
+      <w:r>
+        <w:rPr>
+          <w:lang w:val="en-US"/>
+        </w:rPr>
+        <w:t xml:space="preserve"> </w:t>
+      </w:r>
+      <w:r>
+        <w:t>жаңалық</w:t>
+      </w:r>
+      <w:r>
+        <w:rPr>
+          <w:lang w:val="en-US"/>
+        </w:rPr>
+        <w:t xml:space="preserve"> </w:t>
+      </w:r>
+      <w:r>
+        <w:t>медиа</w:t>
+      </w:r>
+      <w:r>
+        <w:rPr>
+          <w:lang w:val="en-US"/>
+        </w:rPr>
+        <w:t xml:space="preserve"> </w:t>
+      </w:r>
+      <w:r>
+        <w:t>деректері</w:t>
+      </w:r>
+      <w:r>
+        <w:rPr>
+          <w:lang w:val="en-US"/>
+        </w:rPr>
+        <w:t xml:space="preserve"> </w:t>
+      </w:r>
+      <w:r>
+        <w:t>арқылы</w:t>
+      </w:r>
+      <w:r>
+        <w:rPr>
+          <w:lang w:val="en-US"/>
+        </w:rPr>
+        <w:t xml:space="preserve"> </w:t>
+      </w:r>
+      <w:r>
+        <w:t>анықталған</w:t>
+      </w:r>
+      <w:r>
+        <w:rPr>
+          <w:lang w:val="en-US"/>
+        </w:rPr>
+        <w:t>.</w:t>
+      </w:r>
+    </w:p>
+    <w:p>
+      <w:pPr>
+        <w:ind w:firstLine="708"/>
+      </w:pPr>
+      <w:r>
+        <w:t xml:space="preserve">Деректер екі негізгі көзден жиналады: </w:t>
+      </w:r>
+    </w:p>
+    <w:p>
+      <w:pPr>
+        <w:ind w:firstLine="708"/>
+      </w:pPr>
+      <w:r>
+        <w:t xml:space="preserve">• 2016 жылдан бастап ресми ай сайынғы жемқорлық қылмыстарының есептері. </w:t>
+      </w:r>
+    </w:p>
+    <w:p>
+      <w:pPr>
+        <w:ind w:firstLine="708"/>
+      </w:pPr>
+      <w:r>
+        <w:t xml:space="preserve">• Жемқорлыққа қатысты жаңалық мақалалары, олардан жемқорлықпен байланысты негізгі кілт сөздер шығарып, ай сайын агрегатталады. </w:t>
+      </w:r>
+    </w:p>
+    <w:p>
+      <w:pPr>
+        <w:ind w:firstLine="708"/>
+      </w:pPr>
+      <w:r>
+        <w:t xml:space="preserve">Екі деректер жиыны даталар бойынша біріктіріліп, бірыңғай уақыттық қатар құрылады. Уақыттық қатар модельдері, оның ішінде </w:t>
+      </w:r>
+      <w:r>
+        <w:rPr>
+          <w:lang w:val="en-US"/>
+        </w:rPr>
+        <w:t>SARIMA</w:t>
+      </w:r>
+      <w:r>
+        <w:t xml:space="preserve"> және </w:t>
+      </w:r>
+      <w:r>
+        <w:rPr>
+          <w:lang w:val="en-US"/>
+        </w:rPr>
+        <w:t>Prophet</w:t>
+      </w:r>
+      <w:r>
+        <w:t xml:space="preserve"> қолданылады, олардың өнімділігі кросс-валидация әдістері (</w:t>
+      </w:r>
+      <w:r>
+        <w:rPr>
+          <w:lang w:val="en-US"/>
+        </w:rPr>
+        <w:t>rolling</w:t>
+      </w:r>
+      <w:r>
+        <w:t xml:space="preserve"> және </w:t>
+      </w:r>
+      <w:r>
+        <w:rPr>
+          <w:lang w:val="en-US"/>
+        </w:rPr>
+        <w:t>expanding</w:t>
+      </w:r>
+      <w:r>
+        <w:t xml:space="preserve"> </w:t>
+      </w:r>
+      <w:r>
+        <w:rPr>
+          <w:lang w:val="en-US"/>
+        </w:rPr>
+        <w:t>window</w:t>
+      </w:r>
+      <w:r>
+        <w:t xml:space="preserve"> </w:t>
+      </w:r>
+      <w:r>
+        <w:rPr>
+          <w:lang w:val="en-US"/>
+        </w:rPr>
+        <w:t>CV</w:t>
+      </w:r>
+      <w:r>
+        <w:t>) арқылы бағаланады. Сондай-ақ, медиа хабарландыру мен қылмыс статистикасы арасындағы байланысты бағалау үшін Пирсон корреляциясы және Гранжер себептілік тесті сияқты статистикалық тесттер қолданылады.</w:t>
+      </w:r>
+    </w:p>
+    <w:p>
+      <w:pPr>
+        <w:ind w:firstLine="708"/>
+      </w:pPr>
+      <w:r>
+        <w:t>Гибридтік болжау моделі жоғары өнімділікті көрсетті (</w:t>
+      </w:r>
+      <w:r>
+        <w:rPr>
+          <w:lang w:val="en-US"/>
+        </w:rPr>
+        <w:t>R</w:t>
+      </w:r>
+      <w:r>
+        <w:t xml:space="preserve">² &gt; 0.91, ең жақсы модель </w:t>
+      </w:r>
+      <w:r>
+        <w:rPr>
+          <w:lang w:val="en-US"/>
+        </w:rPr>
+        <w:t>R</w:t>
+      </w:r>
+      <w:r>
+        <w:t>² = 0.99-ге жетті), ол 2025 және 2026 жылдарға дәл болжамдар береді. Ең бастысы, талдау жаңалықтардағы кілт сөздердің саны мен тіркелген жемқорлық қылмыстары арасындағы әлсіз корреляцияны көрсетті, бұл қылмыс статистикасы сыртқы бақылау немесе манипуляцияға ұшырауы мүмкін екенін көрсетеді. Бұл жаңа тұжырым ғылыми түсінік пен қылмыс туралы есеп берудегі ашықтыққа қатысты практикалық саясат талқылауларына үлес қосады.</w:t>
+      </w:r>
+    </w:p>
+    <w:p>
+      <w:r>
+        <w:t>Диссертацияның көлемі мен құрылымы: Жоқ.</w:t>
+      </w:r>
+    </w:p>
+    <w:p>
+      <w:r>
+        <w:t>Иллюстрациялар, кестелер және қолданылған әдебиеттер саны: Жоқ.</w:t>
+      </w:r>
+    </w:p>
+    <w:p>
+      <w:pPr>
+        <w:rPr>
+          <w:lang w:val="en-US"/>
+        </w:rPr>
+      </w:pPr>
+      <w:r>
+        <w:t>Кілт</w:t>
+      </w:r>
+      <w:r>
+        <w:rPr>
+          <w:lang w:val="en-US"/>
+        </w:rPr>
+        <w:t xml:space="preserve"> </w:t>
+      </w:r>
+      <w:r>
+        <w:t>сөздер</w:t>
+      </w:r>
+      <w:r>
+        <w:rPr>
+          <w:lang w:val="en-US"/>
+        </w:rPr>
+        <w:t xml:space="preserve"> </w:t>
+      </w:r>
+      <w:r>
+        <w:t>тізімі</w:t>
+      </w:r>
+      <w:r>
+        <w:rPr>
+          <w:lang w:val="en-US"/>
+        </w:rPr>
+        <w:t>: corruption, forecasting, time series, hybrid model, SARIMA, Prophet, Kazakhstan</w:t>
+      </w:r>
+    </w:p>
+    <w:p>
+      <w:r>
+        <w:t>Мақалалар туралы мәлімет: Жоқ.</w:t>
+      </w:r>
+    </w:p>
+    <w:p>
+      <w:pPr>
+        <w:sectPr>
+          <w:footerReference w:type="default" r:id="rId10"/>
+          <w:footerReference w:type="first" r:id="rId11"/>
+          <w:pgSz w:w="11906" w:h="16838"/>
+          <w:pgMar w:top="1134" w:right="567" w:bottom="1134" w:left="1701" w:header="709" w:footer="709" w:gutter="0"/>
+          <w:cols w:space="708"/>
+          <w:titlePg/>
+          <w:docGrid w:linePitch="381"/>
+        </w:sectPr>
+      </w:pPr>
+    </w:p>
+    <w:p>
+      <w:pPr>
+        <w:jc w:val="center"/>
+        <w:rPr>
+          <w:rFonts w:eastAsia="Times New Roman" w:cs="Times New Roman"/>
+          <w:b/>
+          <w:bCs/>
+          <w:color w:val="000000"/>
+          <w:szCs w:val="28"/>
+          <w:lang w:eastAsia="ru-RU"/>
+        </w:rPr>
+      </w:pPr>
+      <w:r>
+        <w:rPr>
+          <w:rFonts w:eastAsia="Times New Roman" w:cs="Times New Roman"/>
+          <w:b/>
+          <w:bCs/>
+          <w:color w:val="000000"/>
+          <w:szCs w:val="28"/>
+          <w:lang w:eastAsia="ru-RU"/>
+        </w:rPr>
+        <w:lastRenderedPageBreak/>
+        <w:t>ПРОГНОЗИРОВАНИЕ ТЕНДЕНЦИЙ КОРРУПЦИОННЫХ ПРЕСТУПЛЕНИЙ В КАЗАХСТАНЕ С  ИСПОЛЬЗОВАНИЕМ РЕГРЕССИОННЫХ МОДЕЛЕЙ, АНАЛИЗА ВРЕМЕННЫХ РЯДОВ И НОВОСТНЫХ ДАННЫХ</w:t>
+      </w:r>
+    </w:p>
+    <w:p>
+      <w:pPr>
+        <w:jc w:val="center"/>
+        <w:rPr>
+          <w:rFonts w:eastAsia="Times New Roman" w:cs="Times New Roman"/>
+          <w:b/>
+          <w:bCs/>
+          <w:color w:val="000000"/>
+          <w:szCs w:val="28"/>
+          <w:lang w:eastAsia="ru-RU"/>
+        </w:rPr>
+      </w:pPr>
+    </w:p>
+    <w:p>
+      <w:pPr>
+        <w:ind w:firstLine="708"/>
+        <w:rPr>
+          <w:rFonts w:eastAsia="Times New Roman" w:cs="Times New Roman"/>
+          <w:color w:val="000000"/>
+          <w:szCs w:val="28"/>
+          <w:lang w:eastAsia="ru-RU"/>
+        </w:rPr>
+      </w:pPr>
+      <w:r>
+        <w:rPr>
+          <w:rFonts w:eastAsia="Times New Roman" w:cs="Times New Roman"/>
+          <w:color w:val="000000"/>
+          <w:szCs w:val="28"/>
+          <w:lang w:eastAsia="ru-RU"/>
+        </w:rPr>
+        <w:t>Аннотация – Коррупция остаётся критической проблемой для экономического развития, политической стабильности и социальной справедливости в Казахстане. Несмотря на широкое освещение коррупционных вопросов в СМИ, официальная статистика преступлений часто оказывается несвязанной с интенсивностью медийного дискурса. Это расхождение вызывает вопросы о достоверности официальной статистики и возможности внешнего влияния на регистрацию преступлений.</w:t>
+      </w:r>
+    </w:p>
+    <w:p>
+      <w:pPr>
+        <w:ind w:firstLine="708"/>
+        <w:rPr>
+          <w:rFonts w:eastAsia="Times New Roman" w:cs="Times New Roman"/>
+          <w:color w:val="000000"/>
+          <w:szCs w:val="28"/>
+          <w:lang w:eastAsia="ru-RU"/>
+        </w:rPr>
+      </w:pPr>
+      <w:r>
+        <w:rPr>
+          <w:rFonts w:eastAsia="Times New Roman" w:cs="Times New Roman"/>
+          <w:color w:val="000000"/>
+          <w:szCs w:val="28"/>
+          <w:lang w:eastAsia="ru-RU"/>
+        </w:rPr>
+        <w:t xml:space="preserve">Основная цель данного исследования заключается в прогнозировании ежемесячного количества коррупционных преступлений в Казахстане с использованием современных методов моделирования временных рядов. Для обеспечения надёжных прогнозов разработана гибридная модель, объединяющая методы SARIMA, </w:t>
+      </w:r>
+      <w:proofErr w:type="spellStart"/>
+      <w:r>
+        <w:rPr>
+          <w:rFonts w:eastAsia="Times New Roman" w:cs="Times New Roman"/>
+          <w:color w:val="000000"/>
+          <w:szCs w:val="28"/>
+          <w:lang w:eastAsia="ru-RU"/>
+        </w:rPr>
+        <w:t>Prophet</w:t>
+      </w:r>
+      <w:proofErr w:type="spellEnd"/>
+      <w:r>
+        <w:rPr>
+          <w:rFonts w:eastAsia="Times New Roman" w:cs="Times New Roman"/>
+          <w:color w:val="000000"/>
+          <w:szCs w:val="28"/>
+          <w:lang w:eastAsia="ru-RU"/>
+        </w:rPr>
+        <w:t xml:space="preserve"> и линейной регрессии.</w:t>
+      </w:r>
+    </w:p>
+    <w:p>
+      <w:pPr>
+        <w:ind w:firstLine="708"/>
+        <w:rPr>
+          <w:rFonts w:eastAsia="Times New Roman" w:cs="Times New Roman"/>
+          <w:color w:val="000000"/>
+          <w:szCs w:val="28"/>
+          <w:lang w:eastAsia="ru-RU"/>
+        </w:rPr>
+      </w:pPr>
+      <w:r>
+        <w:rPr>
+          <w:rFonts w:eastAsia="Times New Roman" w:cs="Times New Roman"/>
+          <w:color w:val="000000"/>
+          <w:szCs w:val="28"/>
+          <w:lang w:eastAsia="ru-RU"/>
+        </w:rPr>
+        <w:t>Здесь исследование сосредоточено на динамике коррупционных преступлений в Казахстане, как отражено в официальной статистике преступлений и данных новостных медиа.</w:t>
+      </w:r>
+    </w:p>
+    <w:p>
+      <w:pPr>
+        <w:ind w:firstLine="708"/>
+        <w:rPr>
+          <w:rFonts w:eastAsia="Times New Roman" w:cs="Times New Roman"/>
+          <w:color w:val="000000"/>
+          <w:szCs w:val="28"/>
+          <w:lang w:eastAsia="ru-RU"/>
+        </w:rPr>
+      </w:pPr>
+      <w:r>
+        <w:rPr>
+          <w:rFonts w:eastAsia="Times New Roman" w:cs="Times New Roman"/>
+          <w:color w:val="000000"/>
+          <w:szCs w:val="28"/>
+          <w:lang w:eastAsia="ru-RU"/>
+        </w:rPr>
+        <w:t xml:space="preserve">Данные собираются из двух основных источников: </w:t>
+      </w:r>
+    </w:p>
+    <w:p>
+      <w:pPr>
+        <w:ind w:firstLine="708"/>
+        <w:rPr>
+          <w:rFonts w:eastAsia="Times New Roman" w:cs="Times New Roman"/>
+          <w:color w:val="000000"/>
+          <w:szCs w:val="28"/>
+          <w:lang w:eastAsia="ru-RU"/>
+        </w:rPr>
+      </w:pPr>
+      <w:r>
+        <w:rPr>
+          <w:rFonts w:eastAsia="Times New Roman" w:cs="Times New Roman"/>
+          <w:color w:val="000000"/>
+          <w:szCs w:val="28"/>
+          <w:lang w:eastAsia="ru-RU"/>
+        </w:rPr>
+        <w:t xml:space="preserve">• Официальные ежемесячные отчёты о коррупционных преступлениях, начиная с 2016 года. </w:t>
+      </w:r>
+    </w:p>
+    <w:p>
+      <w:pPr>
+        <w:ind w:firstLine="708"/>
+        <w:rPr>
+          <w:rFonts w:eastAsia="Times New Roman" w:cs="Times New Roman"/>
+          <w:color w:val="000000"/>
+          <w:szCs w:val="28"/>
+          <w:lang w:eastAsia="ru-RU"/>
+        </w:rPr>
+      </w:pPr>
+      <w:r>
+        <w:rPr>
+          <w:rFonts w:eastAsia="Times New Roman" w:cs="Times New Roman"/>
+          <w:color w:val="000000"/>
+          <w:szCs w:val="28"/>
+          <w:lang w:eastAsia="ru-RU"/>
+        </w:rPr>
+        <w:t xml:space="preserve">• Новостные статьи, связанные с коррупцией, из которых извлекаются и агрегируются по месяцам ключевые слова, связанные с коррупцией. Два набора данных объединяются по дате для создания единого временного ряда. Применяются модели временных рядов, включая SARIMA и </w:t>
+      </w:r>
+      <w:proofErr w:type="spellStart"/>
+      <w:r>
+        <w:rPr>
+          <w:rFonts w:eastAsia="Times New Roman" w:cs="Times New Roman"/>
+          <w:color w:val="000000"/>
+          <w:szCs w:val="28"/>
+          <w:lang w:eastAsia="ru-RU"/>
+        </w:rPr>
+        <w:t>Prophet</w:t>
+      </w:r>
+      <w:proofErr w:type="spellEnd"/>
+      <w:r>
+        <w:rPr>
+          <w:rFonts w:eastAsia="Times New Roman" w:cs="Times New Roman"/>
+          <w:color w:val="000000"/>
+          <w:szCs w:val="28"/>
+          <w:lang w:eastAsia="ru-RU"/>
+        </w:rPr>
+        <w:t>, а их эффективность оценивается с использованием методов кросс-валидации (</w:t>
+      </w:r>
+      <w:proofErr w:type="spellStart"/>
+      <w:r>
+        <w:rPr>
+          <w:rFonts w:eastAsia="Times New Roman" w:cs="Times New Roman"/>
+          <w:color w:val="000000"/>
+          <w:szCs w:val="28"/>
+          <w:lang w:eastAsia="ru-RU"/>
+        </w:rPr>
+        <w:t>rolling</w:t>
+      </w:r>
+      <w:proofErr w:type="spellEnd"/>
+      <w:r>
+        <w:rPr>
+          <w:rFonts w:eastAsia="Times New Roman" w:cs="Times New Roman"/>
+          <w:color w:val="000000"/>
+          <w:szCs w:val="28"/>
+          <w:lang w:eastAsia="ru-RU"/>
+        </w:rPr>
+        <w:t xml:space="preserve"> и </w:t>
+      </w:r>
+      <w:proofErr w:type="spellStart"/>
+      <w:r>
+        <w:rPr>
+          <w:rFonts w:eastAsia="Times New Roman" w:cs="Times New Roman"/>
+          <w:color w:val="000000"/>
+          <w:szCs w:val="28"/>
+          <w:lang w:eastAsia="ru-RU"/>
+        </w:rPr>
+        <w:t>expanding</w:t>
+      </w:r>
+      <w:proofErr w:type="spellEnd"/>
+      <w:r>
+        <w:rPr>
+          <w:rFonts w:eastAsia="Times New Roman" w:cs="Times New Roman"/>
+          <w:color w:val="000000"/>
+          <w:szCs w:val="28"/>
+          <w:lang w:eastAsia="ru-RU"/>
+        </w:rPr>
+        <w:t xml:space="preserve"> </w:t>
+      </w:r>
+      <w:proofErr w:type="spellStart"/>
+      <w:r>
+        <w:rPr>
+          <w:rFonts w:eastAsia="Times New Roman" w:cs="Times New Roman"/>
+          <w:color w:val="000000"/>
+          <w:szCs w:val="28"/>
+          <w:lang w:eastAsia="ru-RU"/>
+        </w:rPr>
+        <w:t>window</w:t>
+      </w:r>
+      <w:proofErr w:type="spellEnd"/>
+      <w:r>
+        <w:rPr>
+          <w:rFonts w:eastAsia="Times New Roman" w:cs="Times New Roman"/>
+          <w:color w:val="000000"/>
+          <w:szCs w:val="28"/>
+          <w:lang w:eastAsia="ru-RU"/>
+        </w:rPr>
+        <w:t xml:space="preserve"> CV). Также используются статистические тесты, такие как корреляция Пирсона и тест </w:t>
+      </w:r>
+      <w:proofErr w:type="spellStart"/>
+      <w:r>
+        <w:rPr>
+          <w:rFonts w:eastAsia="Times New Roman" w:cs="Times New Roman"/>
+          <w:color w:val="000000"/>
+          <w:szCs w:val="28"/>
+          <w:lang w:eastAsia="ru-RU"/>
+        </w:rPr>
+        <w:t>Гранджера</w:t>
+      </w:r>
+      <w:proofErr w:type="spellEnd"/>
+      <w:r>
+        <w:rPr>
+          <w:rFonts w:eastAsia="Times New Roman" w:cs="Times New Roman"/>
+          <w:color w:val="000000"/>
+          <w:szCs w:val="28"/>
+          <w:lang w:eastAsia="ru-RU"/>
+        </w:rPr>
+        <w:t>, для оценки взаимосвязи между медийным освещением и статистикой преступлений.</w:t>
+      </w:r>
+    </w:p>
+    <w:p>
+      <w:pPr>
+        <w:ind w:firstLine="708"/>
+        <w:rPr>
+          <w:rFonts w:eastAsia="Times New Roman" w:cs="Times New Roman"/>
+          <w:color w:val="000000"/>
+          <w:szCs w:val="28"/>
+          <w:lang w:eastAsia="ru-RU"/>
+        </w:rPr>
+      </w:pPr>
+      <w:r>
+        <w:rPr>
+          <w:rFonts w:eastAsia="Times New Roman" w:cs="Times New Roman"/>
+          <w:color w:val="000000"/>
+          <w:szCs w:val="28"/>
+          <w:lang w:eastAsia="ru-RU"/>
+        </w:rPr>
+        <w:t>Гибридная модель прогнозирования показала высокую эффективность (R² &gt; 0.91, при этом лучшая модель достигла R² = 0.99), обеспечив точные прогнозы на 2025 и 2026 годы. Примечательно, что анализ выявил слабую корреляцию между количеством ключевых слов в СМИ и зарегистрированными коррупционными преступлениями, что указывает на то, что статистика преступлений может подвергаться внешнему контролю или манипуляции. Это новое наблюдение вносит вклад как в научное понимание, так и в практические дискуссии о прозрачности в регистрации преступлений.</w:t>
+      </w:r>
+    </w:p>
+    <w:p>
+      <w:pPr>
+        <w:rPr>
+          <w:rFonts w:eastAsia="Times New Roman" w:cs="Times New Roman"/>
+          <w:color w:val="000000"/>
+          <w:szCs w:val="28"/>
+          <w:lang w:eastAsia="ru-RU"/>
+        </w:rPr>
+      </w:pPr>
+      <w:r>
+        <w:rPr>
+          <w:rFonts w:eastAsia="Times New Roman" w:cs="Times New Roman"/>
+          <w:color w:val="000000"/>
+          <w:szCs w:val="28"/>
+          <w:lang w:eastAsia="ru-RU"/>
+        </w:rPr>
+        <w:t>Объём и структура диссертации: Нет.</w:t>
+      </w:r>
+    </w:p>
+    <w:p>
+      <w:pPr>
+        <w:rPr>
+          <w:rFonts w:eastAsia="Times New Roman" w:cs="Times New Roman"/>
+          <w:color w:val="000000"/>
+          <w:szCs w:val="28"/>
+          <w:lang w:eastAsia="ru-RU"/>
+        </w:rPr>
+      </w:pPr>
+      <w:r>
+        <w:rPr>
+          <w:rFonts w:eastAsia="Times New Roman" w:cs="Times New Roman"/>
+          <w:color w:val="000000"/>
+          <w:szCs w:val="28"/>
+          <w:lang w:eastAsia="ru-RU"/>
+        </w:rPr>
+        <w:t>Количество иллюстраций, таблиц и использованных источников: Нет.</w:t>
+      </w:r>
+    </w:p>
+    <w:p>
+      <w:pPr>
+        <w:rPr>
+          <w:rFonts w:eastAsia="Times New Roman" w:cs="Times New Roman"/>
+          <w:color w:val="000000"/>
+          <w:szCs w:val="28"/>
+          <w:lang w:val="en-US" w:eastAsia="ru-RU"/>
+        </w:rPr>
+      </w:pPr>
+      <w:r>
+        <w:rPr>
+          <w:rFonts w:eastAsia="Times New Roman" w:cs="Times New Roman"/>
+          <w:color w:val="000000"/>
+          <w:szCs w:val="28"/>
+          <w:lang w:eastAsia="ru-RU"/>
+        </w:rPr>
+        <w:t>Перечень</w:t>
+      </w:r>
+      <w:r>
+        <w:rPr>
+          <w:rFonts w:eastAsia="Times New Roman" w:cs="Times New Roman"/>
+          <w:color w:val="000000"/>
+          <w:szCs w:val="28"/>
+          <w:lang w:val="en-US" w:eastAsia="ru-RU"/>
+        </w:rPr>
+        <w:t xml:space="preserve"> </w:t>
+      </w:r>
+      <w:r>
+        <w:rPr>
+          <w:rFonts w:eastAsia="Times New Roman" w:cs="Times New Roman"/>
+          <w:color w:val="000000"/>
+          <w:szCs w:val="28"/>
+          <w:lang w:eastAsia="ru-RU"/>
+        </w:rPr>
+        <w:t>ключевых</w:t>
+      </w:r>
+      <w:r>
+        <w:rPr>
+          <w:rFonts w:eastAsia="Times New Roman" w:cs="Times New Roman"/>
+          <w:color w:val="000000"/>
+          <w:szCs w:val="28"/>
+          <w:lang w:val="en-US" w:eastAsia="ru-RU"/>
+        </w:rPr>
+        <w:t xml:space="preserve"> </w:t>
+      </w:r>
+      <w:r>
+        <w:rPr>
+          <w:rFonts w:eastAsia="Times New Roman" w:cs="Times New Roman"/>
+          <w:color w:val="000000"/>
+          <w:szCs w:val="28"/>
+          <w:lang w:eastAsia="ru-RU"/>
+        </w:rPr>
+        <w:t>слов</w:t>
+      </w:r>
+      <w:r>
+        <w:rPr>
+          <w:rFonts w:eastAsia="Times New Roman" w:cs="Times New Roman"/>
+          <w:color w:val="000000"/>
+          <w:szCs w:val="28"/>
+          <w:lang w:val="en-US" w:eastAsia="ru-RU"/>
+        </w:rPr>
+        <w:t>: corruption, forecasting, time series, hybrid model, SARIMA, Prophet, Kazakhstan</w:t>
+      </w:r>
+    </w:p>
+    <w:p>
+      <w:pPr>
+        <w:rPr>
+          <w:rFonts w:eastAsia="Times New Roman" w:cs="Times New Roman"/>
+          <w:color w:val="000000"/>
+          <w:szCs w:val="28"/>
+          <w:lang w:eastAsia="ru-RU"/>
+        </w:rPr>
+      </w:pPr>
+      <w:r>
+        <w:rPr>
+          <w:rFonts w:eastAsia="Times New Roman" w:cs="Times New Roman"/>
+          <w:color w:val="000000"/>
+          <w:szCs w:val="28"/>
+          <w:lang w:eastAsia="ru-RU"/>
+        </w:rPr>
+        <w:t>Сведения о публикациях: Нет.</w:t>
+      </w:r>
+    </w:p>
+    <w:p>
+      <w:pPr>
+        <w:rPr>
+          <w:rFonts w:eastAsia="Times New Roman" w:cs="Times New Roman"/>
+          <w:b/>
+          <w:bCs/>
+          <w:color w:val="000000"/>
+          <w:szCs w:val="28"/>
+          <w:lang w:val="en-US" w:eastAsia="ru-RU"/>
+        </w:rPr>
+        <w:sectPr>
+          <w:footerReference w:type="first" r:id="rId12"/>
+          <w:pgSz w:w="11906" w:h="16838"/>
+          <w:pgMar w:top="1134" w:right="567" w:bottom="1134" w:left="1701" w:header="709" w:footer="709" w:gutter="0"/>
+          <w:cols w:space="708"/>
+          <w:titlePg/>
+          <w:docGrid w:linePitch="381"/>
+        </w:sectPr>
       </w:pPr>
     </w:p>
     <w:p>
@@ -1187,7 +3381,7 @@
           <w:pPr>
             <w:pStyle w:val="11"/>
             <w:tabs>
-              <w:tab w:val="right" w:leader="dot" w:pos="9345"/>
+              <w:tab w:val="right" w:leader="dot" w:pos="9628"/>
             </w:tabs>
             <w:rPr>
               <w:rFonts w:asciiTheme="minorHAnsi" w:eastAsiaTheme="minorEastAsia" w:hAnsiTheme="minorHAnsi"/>
@@ -1208,7 +3402,7 @@
           <w:r>
             <w:fldChar w:fldCharType="separate"/>
           </w:r>
-          <w:hyperlink w:anchor="_Toc194061346" w:history="1">
+          <w:hyperlink w:anchor="_Toc194164088" w:history="1">
             <w:r>
               <w:rPr>
                 <w:rStyle w:val="af4"/>
@@ -1236,264 +3430,7 @@
                 <w:noProof/>
                 <w:webHidden/>
               </w:rPr>
-              <w:instrText xml:space="preserve"> PAGEREF _Toc194061346 \h </w:instrText>
-            </w:r>
-            <w:r>
-              <w:rPr>
-                <w:noProof/>
-                <w:webHidden/>
-              </w:rPr>
-            </w:r>
-            <w:r>
-              <w:rPr>
-                <w:noProof/>
-                <w:webHidden/>
-              </w:rPr>
-              <w:fldChar w:fldCharType="separate"/>
-            </w:r>
-            <w:r>
-              <w:rPr>
-                <w:noProof/>
-                <w:webHidden/>
-              </w:rPr>
-              <w:t>3</w:t>
-            </w:r>
-            <w:r>
-              <w:rPr>
-                <w:noProof/>
-                <w:webHidden/>
-              </w:rPr>
-              <w:fldChar w:fldCharType="end"/>
-            </w:r>
-          </w:hyperlink>
-        </w:p>
-        <w:p>
-          <w:pPr>
-            <w:pStyle w:val="11"/>
-            <w:tabs>
-              <w:tab w:val="right" w:leader="dot" w:pos="9345"/>
-            </w:tabs>
-            <w:rPr>
-              <w:rFonts w:asciiTheme="minorHAnsi" w:eastAsiaTheme="minorEastAsia" w:hAnsiTheme="minorHAnsi"/>
-              <w:noProof/>
-              <w:kern w:val="2"/>
-              <w:sz w:val="24"/>
-              <w:szCs w:val="24"/>
-              <w:lang w:eastAsia="ru-RU"/>
-              <w14:ligatures w14:val="standardContextual"/>
-            </w:rPr>
-          </w:pPr>
-          <w:hyperlink w:anchor="_Toc194061347" w:history="1">
-            <w:r>
-              <w:rPr>
-                <w:rStyle w:val="af4"/>
-                <w:noProof/>
-                <w:lang w:val="en-US"/>
-              </w:rPr>
-              <w:t>INTROD</w:t>
-            </w:r>
-            <w:r>
-              <w:rPr>
-                <w:rStyle w:val="af4"/>
-                <w:noProof/>
-                <w:lang w:val="en-US"/>
-              </w:rPr>
-              <w:t>U</w:t>
-            </w:r>
-            <w:r>
-              <w:rPr>
-                <w:rStyle w:val="af4"/>
-                <w:noProof/>
-                <w:lang w:val="en-US"/>
-              </w:rPr>
-              <w:t>CTION</w:t>
-            </w:r>
-            <w:r>
-              <w:rPr>
-                <w:noProof/>
-                <w:webHidden/>
-              </w:rPr>
-              <w:tab/>
-            </w:r>
-            <w:r>
-              <w:rPr>
-                <w:noProof/>
-                <w:webHidden/>
-              </w:rPr>
-              <w:fldChar w:fldCharType="begin"/>
-            </w:r>
-            <w:r>
-              <w:rPr>
-                <w:noProof/>
-                <w:webHidden/>
-              </w:rPr>
-              <w:instrText xml:space="preserve"> PAGEREF _Toc194061347 \h </w:instrText>
-            </w:r>
-            <w:r>
-              <w:rPr>
-                <w:noProof/>
-                <w:webHidden/>
-              </w:rPr>
-            </w:r>
-            <w:r>
-              <w:rPr>
-                <w:noProof/>
-                <w:webHidden/>
-              </w:rPr>
-              <w:fldChar w:fldCharType="separate"/>
-            </w:r>
-            <w:r>
-              <w:rPr>
-                <w:noProof/>
-                <w:webHidden/>
-              </w:rPr>
-              <w:t>4</w:t>
-            </w:r>
-            <w:r>
-              <w:rPr>
-                <w:noProof/>
-                <w:webHidden/>
-              </w:rPr>
-              <w:fldChar w:fldCharType="end"/>
-            </w:r>
-          </w:hyperlink>
-        </w:p>
-        <w:p>
-          <w:pPr>
-            <w:pStyle w:val="11"/>
-            <w:tabs>
-              <w:tab w:val="right" w:leader="dot" w:pos="9345"/>
-            </w:tabs>
-            <w:rPr>
-              <w:rFonts w:asciiTheme="minorHAnsi" w:eastAsiaTheme="minorEastAsia" w:hAnsiTheme="minorHAnsi"/>
-              <w:noProof/>
-              <w:kern w:val="2"/>
-              <w:sz w:val="24"/>
-              <w:szCs w:val="24"/>
-              <w:lang w:eastAsia="ru-RU"/>
-              <w14:ligatures w14:val="standardContextual"/>
-            </w:rPr>
-          </w:pPr>
-          <w:hyperlink w:anchor="_Toc194061348" w:history="1">
-            <w:r>
-              <w:rPr>
-                <w:rStyle w:val="af4"/>
-                <w:noProof/>
-                <w:lang w:val="en-US"/>
-              </w:rPr>
-              <w:t>CONCLUSION</w:t>
-            </w:r>
-            <w:r>
-              <w:rPr>
-                <w:noProof/>
-                <w:webHidden/>
-              </w:rPr>
-              <w:tab/>
-            </w:r>
-            <w:r>
-              <w:rPr>
-                <w:noProof/>
-                <w:webHidden/>
-              </w:rPr>
-              <w:fldChar w:fldCharType="begin"/>
-            </w:r>
-            <w:r>
-              <w:rPr>
-                <w:noProof/>
-                <w:webHidden/>
-              </w:rPr>
-              <w:instrText xml:space="preserve"> PAGEREF _Toc194061348 \h </w:instrText>
-            </w:r>
-            <w:r>
-              <w:rPr>
-                <w:noProof/>
-                <w:webHidden/>
-              </w:rPr>
-            </w:r>
-            <w:r>
-              <w:rPr>
-                <w:noProof/>
-                <w:webHidden/>
-              </w:rPr>
-              <w:fldChar w:fldCharType="separate"/>
-            </w:r>
-            <w:r>
-              <w:rPr>
-                <w:noProof/>
-                <w:webHidden/>
-              </w:rPr>
-              <w:t>5</w:t>
-            </w:r>
-            <w:r>
-              <w:rPr>
-                <w:noProof/>
-                <w:webHidden/>
-              </w:rPr>
-              <w:fldChar w:fldCharType="end"/>
-            </w:r>
-          </w:hyperlink>
-        </w:p>
-        <w:p>
-          <w:pPr>
-            <w:pStyle w:val="11"/>
-            <w:tabs>
-              <w:tab w:val="right" w:leader="dot" w:pos="9345"/>
-            </w:tabs>
-            <w:rPr>
-              <w:rFonts w:asciiTheme="minorHAnsi" w:eastAsiaTheme="minorEastAsia" w:hAnsiTheme="minorHAnsi"/>
-              <w:noProof/>
-              <w:kern w:val="2"/>
-              <w:sz w:val="24"/>
-              <w:szCs w:val="24"/>
-              <w:lang w:eastAsia="ru-RU"/>
-              <w14:ligatures w14:val="standardContextual"/>
-            </w:rPr>
-          </w:pPr>
-          <w:hyperlink w:anchor="_Toc194061349" w:history="1">
-            <w:r>
-              <w:rPr>
-                <w:rStyle w:val="af4"/>
-                <w:noProof/>
-                <w:lang w:val="en-US"/>
-              </w:rPr>
-              <w:t>REF</w:t>
-            </w:r>
-            <w:r>
-              <w:rPr>
-                <w:rStyle w:val="af4"/>
-                <w:noProof/>
-                <w:lang w:val="en-US"/>
-              </w:rPr>
-              <w:t>E</w:t>
-            </w:r>
-            <w:r>
-              <w:rPr>
-                <w:rStyle w:val="af4"/>
-                <w:noProof/>
-                <w:lang w:val="en-US"/>
-              </w:rPr>
-              <w:t>RENCES</w:t>
-            </w:r>
-            <w:r>
-              <w:rPr>
-                <w:noProof/>
-                <w:webHidden/>
-              </w:rPr>
-              <w:tab/>
-            </w:r>
-            <w:r>
-              <w:rPr>
-                <w:noProof/>
-                <w:webHidden/>
-              </w:rPr>
-              <w:fldChar w:fldCharType="begin"/>
-            </w:r>
-            <w:r>
-              <w:rPr>
-                <w:noProof/>
-                <w:webHidden/>
-              </w:rPr>
-              <w:instrText xml:space="preserve"> PAGEREF _Toc194061349 \h </w:instrText>
+              <w:instrText xml:space="preserve"> PAGEREF _Toc194164088 \h </w:instrText>
             </w:r>
             <w:r>
               <w:rPr>
@@ -1528,7 +3465,7 @@
           <w:pPr>
             <w:pStyle w:val="11"/>
             <w:tabs>
-              <w:tab w:val="right" w:leader="dot" w:pos="9345"/>
+              <w:tab w:val="right" w:leader="dot" w:pos="9628"/>
             </w:tabs>
             <w:rPr>
               <w:rFonts w:asciiTheme="minorHAnsi" w:eastAsiaTheme="minorEastAsia" w:hAnsiTheme="minorHAnsi"/>
@@ -1540,13 +3477,14 @@
               <w14:ligatures w14:val="standardContextual"/>
             </w:rPr>
           </w:pPr>
-          <w:hyperlink w:anchor="_Toc194061350" w:history="1">
+          <w:hyperlink w:anchor="_Toc194164089" w:history="1">
             <w:r>
               <w:rPr>
                 <w:rStyle w:val="af4"/>
                 <w:noProof/>
+                <w:lang w:val="en-US"/>
               </w:rPr>
-              <w:t>APPENDIX</w:t>
+              <w:t>INTRODUCTION</w:t>
             </w:r>
             <w:r>
               <w:rPr>
@@ -1567,7 +3505,7 @@
                 <w:noProof/>
                 <w:webHidden/>
               </w:rPr>
-              <w:instrText xml:space="preserve"> PAGEREF _Toc194061350 \h </w:instrText>
+              <w:instrText xml:space="preserve"> PAGEREF _Toc194164089 \h </w:instrText>
             </w:r>
             <w:r>
               <w:rPr>
@@ -1599,6 +3537,230 @@
           </w:hyperlink>
         </w:p>
         <w:p>
+          <w:pPr>
+            <w:pStyle w:val="11"/>
+            <w:tabs>
+              <w:tab w:val="right" w:leader="dot" w:pos="9628"/>
+            </w:tabs>
+            <w:rPr>
+              <w:rFonts w:asciiTheme="minorHAnsi" w:eastAsiaTheme="minorEastAsia" w:hAnsiTheme="minorHAnsi"/>
+              <w:noProof/>
+              <w:kern w:val="2"/>
+              <w:sz w:val="24"/>
+              <w:szCs w:val="24"/>
+              <w:lang w:eastAsia="ru-RU"/>
+              <w14:ligatures w14:val="standardContextual"/>
+            </w:rPr>
+          </w:pPr>
+          <w:hyperlink w:anchor="_Toc194164090" w:history="1">
+            <w:r>
+              <w:rPr>
+                <w:rStyle w:val="af4"/>
+                <w:noProof/>
+                <w:lang w:val="en-US"/>
+              </w:rPr>
+              <w:t>CONCLUSION</w:t>
+            </w:r>
+            <w:r>
+              <w:rPr>
+                <w:noProof/>
+                <w:webHidden/>
+              </w:rPr>
+              <w:tab/>
+            </w:r>
+            <w:r>
+              <w:rPr>
+                <w:noProof/>
+                <w:webHidden/>
+              </w:rPr>
+              <w:fldChar w:fldCharType="begin"/>
+            </w:r>
+            <w:r>
+              <w:rPr>
+                <w:noProof/>
+                <w:webHidden/>
+              </w:rPr>
+              <w:instrText xml:space="preserve"> PAGEREF _Toc194164090 \h </w:instrText>
+            </w:r>
+            <w:r>
+              <w:rPr>
+                <w:noProof/>
+                <w:webHidden/>
+              </w:rPr>
+            </w:r>
+            <w:r>
+              <w:rPr>
+                <w:noProof/>
+                <w:webHidden/>
+              </w:rPr>
+              <w:fldChar w:fldCharType="separate"/>
+            </w:r>
+            <w:r>
+              <w:rPr>
+                <w:noProof/>
+                <w:webHidden/>
+              </w:rPr>
+              <w:t>8</w:t>
+            </w:r>
+            <w:r>
+              <w:rPr>
+                <w:noProof/>
+                <w:webHidden/>
+              </w:rPr>
+              <w:fldChar w:fldCharType="end"/>
+            </w:r>
+          </w:hyperlink>
+        </w:p>
+        <w:p>
+          <w:pPr>
+            <w:pStyle w:val="11"/>
+            <w:tabs>
+              <w:tab w:val="right" w:leader="dot" w:pos="9628"/>
+            </w:tabs>
+            <w:rPr>
+              <w:rFonts w:asciiTheme="minorHAnsi" w:eastAsiaTheme="minorEastAsia" w:hAnsiTheme="minorHAnsi"/>
+              <w:noProof/>
+              <w:kern w:val="2"/>
+              <w:sz w:val="24"/>
+              <w:szCs w:val="24"/>
+              <w:lang w:eastAsia="ru-RU"/>
+              <w14:ligatures w14:val="standardContextual"/>
+            </w:rPr>
+          </w:pPr>
+          <w:hyperlink w:anchor="_Toc194164091" w:history="1">
+            <w:r>
+              <w:rPr>
+                <w:rStyle w:val="af4"/>
+                <w:noProof/>
+                <w:lang w:val="en-US"/>
+              </w:rPr>
+              <w:t>REFERENCES</w:t>
+            </w:r>
+            <w:r>
+              <w:rPr>
+                <w:noProof/>
+                <w:webHidden/>
+              </w:rPr>
+              <w:tab/>
+            </w:r>
+            <w:r>
+              <w:rPr>
+                <w:noProof/>
+                <w:webHidden/>
+              </w:rPr>
+              <w:fldChar w:fldCharType="begin"/>
+            </w:r>
+            <w:r>
+              <w:rPr>
+                <w:noProof/>
+                <w:webHidden/>
+              </w:rPr>
+              <w:instrText xml:space="preserve"> PAGEREF _Toc194164091 \h </w:instrText>
+            </w:r>
+            <w:r>
+              <w:rPr>
+                <w:noProof/>
+                <w:webHidden/>
+              </w:rPr>
+            </w:r>
+            <w:r>
+              <w:rPr>
+                <w:noProof/>
+                <w:webHidden/>
+              </w:rPr>
+              <w:fldChar w:fldCharType="separate"/>
+            </w:r>
+            <w:r>
+              <w:rPr>
+                <w:noProof/>
+                <w:webHidden/>
+              </w:rPr>
+              <w:t>9</w:t>
+            </w:r>
+            <w:r>
+              <w:rPr>
+                <w:noProof/>
+                <w:webHidden/>
+              </w:rPr>
+              <w:fldChar w:fldCharType="end"/>
+            </w:r>
+          </w:hyperlink>
+        </w:p>
+        <w:p>
+          <w:pPr>
+            <w:pStyle w:val="11"/>
+            <w:tabs>
+              <w:tab w:val="right" w:leader="dot" w:pos="9628"/>
+            </w:tabs>
+            <w:rPr>
+              <w:rFonts w:asciiTheme="minorHAnsi" w:eastAsiaTheme="minorEastAsia" w:hAnsiTheme="minorHAnsi"/>
+              <w:noProof/>
+              <w:kern w:val="2"/>
+              <w:sz w:val="24"/>
+              <w:szCs w:val="24"/>
+              <w:lang w:eastAsia="ru-RU"/>
+              <w14:ligatures w14:val="standardContextual"/>
+            </w:rPr>
+          </w:pPr>
+          <w:hyperlink w:anchor="_Toc194164092" w:history="1">
+            <w:r>
+              <w:rPr>
+                <w:rStyle w:val="af4"/>
+                <w:noProof/>
+              </w:rPr>
+              <w:t>APPENDIX</w:t>
+            </w:r>
+            <w:r>
+              <w:rPr>
+                <w:noProof/>
+                <w:webHidden/>
+              </w:rPr>
+              <w:tab/>
+            </w:r>
+            <w:r>
+              <w:rPr>
+                <w:noProof/>
+                <w:webHidden/>
+              </w:rPr>
+              <w:fldChar w:fldCharType="begin"/>
+            </w:r>
+            <w:r>
+              <w:rPr>
+                <w:noProof/>
+                <w:webHidden/>
+              </w:rPr>
+              <w:instrText xml:space="preserve"> PAGEREF _Toc194164092 \h </w:instrText>
+            </w:r>
+            <w:r>
+              <w:rPr>
+                <w:noProof/>
+                <w:webHidden/>
+              </w:rPr>
+            </w:r>
+            <w:r>
+              <w:rPr>
+                <w:noProof/>
+                <w:webHidden/>
+              </w:rPr>
+              <w:fldChar w:fldCharType="separate"/>
+            </w:r>
+            <w:r>
+              <w:rPr>
+                <w:noProof/>
+                <w:webHidden/>
+              </w:rPr>
+              <w:t>11</w:t>
+            </w:r>
+            <w:r>
+              <w:rPr>
+                <w:noProof/>
+                <w:webHidden/>
+              </w:rPr>
+              <w:fldChar w:fldCharType="end"/>
+            </w:r>
+          </w:hyperlink>
+        </w:p>
+        <w:p>
           <w:r>
             <w:rPr>
               <w:b/>
@@ -1636,7 +3798,7 @@
           <w:lang w:val="en-US"/>
         </w:rPr>
       </w:pPr>
-      <w:bookmarkStart w:id="3" w:name="_Toc194061346"/>
+      <w:bookmarkStart w:id="3" w:name="_Toc194164088"/>
       <w:r>
         <w:rPr>
           <w:lang w:val="en-US"/>
@@ -1662,8 +3824,10 @@
     <w:p>
       <w:pPr>
         <w:pStyle w:val="1"/>
-      </w:pPr>
-      <w:bookmarkStart w:id="4" w:name="_Toc194061347"/>
+        <w:ind w:firstLine="708"/>
+        <w:jc w:val="center"/>
+      </w:pPr>
+      <w:bookmarkStart w:id="4" w:name="_Toc194164089"/>
       <w:r>
         <w:rPr>
           <w:lang w:val="en-US"/>
@@ -1696,21 +3860,7 @@
         <w:rPr>
           <w:lang w:val="en-US"/>
         </w:rPr>
-        <w:t xml:space="preserve"> </w:t>
-      </w:r>
-      <w:proofErr w:type="gramStart"/>
-      <w:r>
-        <w:rPr>
-          <w:lang w:val="en-US"/>
-        </w:rPr>
-        <w:t>to</w:t>
-      </w:r>
-      <w:proofErr w:type="gramEnd"/>
-      <w:r>
-        <w:rPr>
-          <w:lang w:val="en-US"/>
-        </w:rPr>
-        <w:t xml:space="preserve"> economic development, political stability, and social equity. </w:t>
+        <w:t xml:space="preserve"> to economic development, political stability, and social equity. </w:t>
       </w:r>
       <w:r>
         <w:rPr>
@@ -1977,33 +4127,7 @@
         <w:rPr>
           <w:lang w:val="en-US"/>
         </w:rPr>
-        <w:t xml:space="preserve"> Text data scraped from </w:t>
-      </w:r>
-      <w:proofErr w:type="gramStart"/>
-      <w:r>
-        <w:rPr>
-          <w:lang w:val="en-US"/>
-        </w:rPr>
-        <w:t>news</w:t>
-      </w:r>
-      <w:proofErr w:type="gramEnd"/>
-      <w:r>
-        <w:rPr>
-          <w:lang w:val="en-US"/>
-        </w:rPr>
-        <w:t xml:space="preserve"> website covering corruption-related topics. These articles were processed to extract key corruption-related terms, and the keyword counts were aggregated </w:t>
-      </w:r>
-      <w:r>
-        <w:rPr>
-          <w:lang w:val="en-US"/>
-        </w:rPr>
-        <w:t>monthly</w:t>
-      </w:r>
-      <w:r>
-        <w:rPr>
-          <w:lang w:val="en-US"/>
-        </w:rPr>
-        <w:t>.</w:t>
+        <w:t xml:space="preserve"> Text data scraped from news website covering corruption-related topics. These articles were processed to extract key corruption-related terms, and the keyword counts were aggregated monthly.</w:t>
       </w:r>
     </w:p>
     <w:p>
@@ -2200,19 +4324,12 @@
     </w:p>
     <w:p>
       <w:pPr>
-        <w:rPr>
-          <w:lang w:val="en-US"/>
-        </w:rPr>
-      </w:pPr>
-    </w:p>
-    <w:p>
-      <w:pPr>
         <w:pStyle w:val="1"/>
         <w:rPr>
           <w:lang w:val="en-US"/>
         </w:rPr>
       </w:pPr>
-      <w:bookmarkStart w:id="5" w:name="_Toc194061348"/>
+      <w:bookmarkStart w:id="5" w:name="_Toc194164090"/>
       <w:r>
         <w:rPr>
           <w:lang w:val="en-US"/>
@@ -2244,8 +4361,11 @@
     <w:p>
       <w:pPr>
         <w:pStyle w:val="1"/>
-      </w:pPr>
-      <w:bookmarkStart w:id="6" w:name="_Toc194061349"/>
+        <w:rPr>
+          <w:lang w:val="en-US"/>
+        </w:rPr>
+      </w:pPr>
+      <w:bookmarkStart w:id="6" w:name="_Toc194164091"/>
       <w:r>
         <w:rPr>
           <w:lang w:val="en-US"/>
@@ -2272,7 +4392,7 @@
           <w:szCs w:val="28"/>
           <w:lang w:val="en-US"/>
         </w:rPr>
-        <w:t>[1] Transparency International, "202</w:t>
+        <w:t>[1] Transparency International, "2024 corruption perceptions index:</w:t>
       </w:r>
       <w:r>
         <w:rPr>
@@ -2281,7 +4401,7 @@
           <w:szCs w:val="28"/>
           <w:lang w:val="en-US"/>
         </w:rPr>
-        <w:t>4</w:t>
+        <w:t xml:space="preserve"> Kazakhstan</w:t>
       </w:r>
       <w:r>
         <w:rPr>
@@ -2290,7 +4410,7 @@
           <w:szCs w:val="28"/>
           <w:lang w:val="en-US"/>
         </w:rPr>
-        <w:t xml:space="preserve"> corruption perceptions index:</w:t>
+        <w:t>" [Online].</w:t>
       </w:r>
       <w:r>
         <w:rPr>
@@ -2299,7 +4419,7 @@
           <w:szCs w:val="28"/>
           <w:lang w:val="en-US"/>
         </w:rPr>
-        <w:t xml:space="preserve"> Kazakhstan</w:t>
+        <w:t xml:space="preserve"> </w:t>
       </w:r>
       <w:r>
         <w:rPr>
@@ -2308,27 +4428,9 @@
           <w:szCs w:val="28"/>
           <w:lang w:val="en-US"/>
         </w:rPr>
-        <w:t>" [Online].</w:t>
-      </w:r>
-      <w:r>
-        <w:rPr>
-          <w:rFonts w:cs="Times New Roman"/>
-          <w:kern w:val="2"/>
-          <w:szCs w:val="28"/>
-          <w:lang w:val="en-US"/>
-        </w:rPr>
-        <w:t xml:space="preserve"> </w:t>
-      </w:r>
-      <w:r>
-        <w:rPr>
-          <w:rFonts w:cs="Times New Roman"/>
-          <w:kern w:val="2"/>
-          <w:szCs w:val="28"/>
-          <w:lang w:val="en-US"/>
-        </w:rPr>
         <w:t xml:space="preserve">Available: </w:t>
       </w:r>
-      <w:hyperlink r:id="rId9" w:history="1">
+      <w:hyperlink r:id="rId13" w:history="1">
         <w:r>
           <w:rPr>
             <w:rStyle w:val="af4"/>
@@ -2445,19 +4547,19 @@
           <w:szCs w:val="28"/>
           <w:lang w:val="en-US"/>
         </w:rPr>
-        <w:t xml:space="preserve">[5] E. Ash, S. Galletta, and T. </w:t>
-      </w:r>
-      <w:proofErr w:type="spellStart"/>
-      <w:r>
+        <w:t xml:space="preserve">[5] E. Ash, S. Galletta, and T. Giommoni, "A machine learning approach to analyze and support anti-corruption policy," [Online]. Available: https://www.RePEc.org. [Accessed: Mar. 11, 2025].  </w:t>
+      </w:r>
+    </w:p>
+    <w:p>
+      <w:pPr>
+        <w:ind w:firstLine="652"/>
         <w:rPr>
           <w:rFonts w:cs="Times New Roman"/>
           <w:kern w:val="2"/>
           <w:szCs w:val="28"/>
           <w:lang w:val="en-US"/>
         </w:rPr>
-        <w:t>Giommoni</w:t>
-      </w:r>
-      <w:proofErr w:type="spellEnd"/>
+      </w:pPr>
       <w:r>
         <w:rPr>
           <w:rFonts w:cs="Times New Roman"/>
@@ -2465,7 +4567,7 @@
           <w:szCs w:val="28"/>
           <w:lang w:val="en-US"/>
         </w:rPr>
-        <w:t xml:space="preserve">, "A machine learning approach to analyze and support anti-corruption policy," [Online]. Available: https://www.RePEc.org. [Accessed: Mar. 11, 2025].  </w:t>
+        <w:t xml:space="preserve">[6] U4 Anti-Corruption Resource Centre, "Artificial intelligence – a promising anti-corruption tool in development settings?" [Online]. Available: https://www.u4.no/publications/artificial-intelligence-a-promising-anti-corruption-tool-in-development-settings. [Accessed: Mar. 11, 2025].  </w:t>
       </w:r>
     </w:p>
     <w:p>
@@ -2485,7 +4587,7 @@
           <w:szCs w:val="28"/>
           <w:lang w:val="en-US"/>
         </w:rPr>
-        <w:t xml:space="preserve">[6] U4 Anti-Corruption Resource Centre, "Artificial intelligence – a promising anti-corruption tool in development settings?" [Online]. Available: https://www.u4.no/publications/artificial-intelligence-a-promising-anti-corruption-tool-in-development-settings. [Accessed: Mar. 11, 2025].  </w:t>
+        <w:t xml:space="preserve">[7] N. Köbis, C. Starke, and I. Rahwan, Int. Journal of Anticorruption Research 5, 89-102 (2021). https://doi.org/10.48550/arXiv.2102.11567.  </w:t>
       </w:r>
     </w:p>
     <w:p>
@@ -2505,19 +4607,19 @@
           <w:szCs w:val="28"/>
           <w:lang w:val="en-US"/>
         </w:rPr>
-        <w:t xml:space="preserve">[7] N. </w:t>
-      </w:r>
-      <w:proofErr w:type="spellStart"/>
-      <w:r>
+        <w:t xml:space="preserve">[8] M. S. M. Lima and D. Delen, Government Information Quarterly 37, 101407 (2020). https://doi.org/10.1016/j.giq.2019.101407.  </w:t>
+      </w:r>
+    </w:p>
+    <w:p>
+      <w:pPr>
+        <w:ind w:firstLine="652"/>
         <w:rPr>
           <w:rFonts w:cs="Times New Roman"/>
           <w:kern w:val="2"/>
           <w:szCs w:val="28"/>
           <w:lang w:val="en-US"/>
         </w:rPr>
-        <w:t>Köbis</w:t>
-      </w:r>
-      <w:proofErr w:type="spellEnd"/>
+      </w:pPr>
       <w:r>
         <w:rPr>
           <w:rFonts w:cs="Times New Roman"/>
@@ -2525,7 +4627,7 @@
           <w:szCs w:val="28"/>
           <w:lang w:val="en-US"/>
         </w:rPr>
-        <w:t xml:space="preserve">, C. Starke, and I. Rahwan, Int. Journal of Anticorruption Research 5, 89-102 (2021). https://doi.org/10.48550/arXiv.2102.11567.  </w:t>
+        <w:t xml:space="preserve">[9] G. de Blasio, A. D’Ignazio, and M. Letta, Technological Forecasting and Social Change 184, 122016 (2022). https://doi.org/10.1016/j.techfore.2022.122016.  </w:t>
       </w:r>
     </w:p>
     <w:p>
@@ -2545,7 +4647,7 @@
           <w:szCs w:val="28"/>
           <w:lang w:val="en-US"/>
         </w:rPr>
-        <w:t xml:space="preserve">[8] M. S. M. Lima and D. Delen, Government Information Quarterly 37, 101407 (2020). https://doi.org/10.1016/j.giq.2019.101407.  </w:t>
+        <w:t xml:space="preserve">[10] A. R. Rashid, Z. L. Ali, and G. H. A. Alshmeel, Proc. 4th Int. Congress on Human-Computer Interaction, Optimization and Robotic Applications (HORA), 2022. https://doi.org/10.1109/HORA55278.2022.9799970.  </w:t>
       </w:r>
     </w:p>
     <w:p>
@@ -2565,19 +4667,19 @@
           <w:szCs w:val="28"/>
           <w:lang w:val="en-US"/>
         </w:rPr>
-        <w:t xml:space="preserve">[9] G. de Blasio, A. </w:t>
-      </w:r>
-      <w:proofErr w:type="spellStart"/>
-      <w:r>
+        <w:t xml:space="preserve">[11] M. Pan and D. Li, International Review of Financial Analysis 84, 102367 (2023). https://doi.org/10.1016/j.irfa.2023.102367.  </w:t>
+      </w:r>
+    </w:p>
+    <w:p>
+      <w:pPr>
+        <w:ind w:firstLine="652"/>
         <w:rPr>
           <w:rFonts w:cs="Times New Roman"/>
           <w:kern w:val="2"/>
           <w:szCs w:val="28"/>
           <w:lang w:val="en-US"/>
         </w:rPr>
-        <w:t>D’Ignazio</w:t>
-      </w:r>
-      <w:proofErr w:type="spellEnd"/>
+      </w:pPr>
       <w:r>
         <w:rPr>
           <w:rFonts w:cs="Times New Roman"/>
@@ -2585,7 +4687,7 @@
           <w:szCs w:val="28"/>
           <w:lang w:val="en-US"/>
         </w:rPr>
-        <w:t xml:space="preserve">, and M. Letta, Technological Forecasting and Social Change 184, 122016 (2022). https://doi.org/10.1016/j.techfore.2022.122016.  </w:t>
+        <w:t xml:space="preserve">[12] C. van Noordt, Government Information Quarterly 39, 101680 (2022). https://doi.org/10.1016/j.giq.2022.101680.  </w:t>
       </w:r>
     </w:p>
     <w:p>
@@ -2605,19 +4707,19 @@
           <w:szCs w:val="28"/>
           <w:lang w:val="en-US"/>
         </w:rPr>
-        <w:t xml:space="preserve">[10] A. R. Rashid, Z. L. Ali, and G. H. A. </w:t>
-      </w:r>
-      <w:proofErr w:type="spellStart"/>
-      <w:r>
+        <w:t xml:space="preserve">[13] T. Yigitcanlar, R. Y. M. Li, and P. B. Bulu, Government Information Quarterly 40, 101733 (2023). https://doi.org/10.1016/j.giq.2022.101733.  </w:t>
+      </w:r>
+    </w:p>
+    <w:p>
+      <w:pPr>
+        <w:ind w:firstLine="652"/>
         <w:rPr>
           <w:rFonts w:cs="Times New Roman"/>
           <w:kern w:val="2"/>
           <w:szCs w:val="28"/>
           <w:lang w:val="en-US"/>
         </w:rPr>
-        <w:t>Alshmeel</w:t>
-      </w:r>
-      <w:proofErr w:type="spellEnd"/>
+      </w:pPr>
       <w:r>
         <w:rPr>
           <w:rFonts w:cs="Times New Roman"/>
@@ -2625,7 +4727,7 @@
           <w:szCs w:val="28"/>
           <w:lang w:val="en-US"/>
         </w:rPr>
-        <w:t xml:space="preserve">, Proc. 4th Int. Congress on Human-Computer Interaction, Optimization and Robotic Applications (HORA), 2022. https://doi.org/10.1109/HORA55278.2022.9799970.  </w:t>
+        <w:t xml:space="preserve">[14] Z. Wang, X. Guan, L. Sun, and D. Zhang, Heliyon 9, e13765 (2023). https://doi.org/10.1016/j.heliyon.2023.e13765.  </w:t>
       </w:r>
     </w:p>
     <w:p>
@@ -2645,7 +4747,7 @@
           <w:szCs w:val="28"/>
           <w:lang w:val="en-US"/>
         </w:rPr>
-        <w:t xml:space="preserve">[11] M. Pan and D. Li, International Review of Financial Analysis 84, 102367 (2023). https://doi.org/10.1016/j.irfa.2023.102367.  </w:t>
+        <w:t xml:space="preserve">[15] D. Valle-Cruz, V. Fernández-Cortez, and J. R. Gil-Garcia, Government Information Quarterly 38, 101600 (2021). https://doi.org/10.1016/j.giq.2021.101600.  </w:t>
       </w:r>
     </w:p>
     <w:p>
@@ -2665,19 +4767,19 @@
           <w:szCs w:val="28"/>
           <w:lang w:val="en-US"/>
         </w:rPr>
-        <w:t xml:space="preserve">[12] C. van </w:t>
-      </w:r>
-      <w:proofErr w:type="spellStart"/>
-      <w:r>
+        <w:t xml:space="preserve">[16] V. J. Straub, D. Morgan, and J. Bertot, Government Information Quarterly 40, 101749 (2023). https://doi.org/10.1016/j.giq.2022.101749.  </w:t>
+      </w:r>
+    </w:p>
+    <w:p>
+      <w:pPr>
+        <w:ind w:firstLine="652"/>
         <w:rPr>
           <w:rFonts w:cs="Times New Roman"/>
           <w:kern w:val="2"/>
           <w:szCs w:val="28"/>
           <w:lang w:val="en-US"/>
         </w:rPr>
-        <w:t>Noordt</w:t>
-      </w:r>
-      <w:proofErr w:type="spellEnd"/>
+      </w:pPr>
       <w:r>
         <w:rPr>
           <w:rFonts w:cs="Times New Roman"/>
@@ -2685,7 +4787,8 @@
           <w:szCs w:val="28"/>
           <w:lang w:val="en-US"/>
         </w:rPr>
-        <w:t xml:space="preserve">, Government Information Quarterly 39, 101680 (2022). https://doi.org/10.1016/j.giq.2022.101680.  </w:t>
+        <w:lastRenderedPageBreak/>
+        <w:t xml:space="preserve">[17] I. Adam and M. Fazekas, Information Economics and Policy 54, 100880 (2021). https://doi.org/10.1016/j.infoecopol.2020.100880.  </w:t>
       </w:r>
     </w:p>
     <w:p>
@@ -2705,19 +4808,19 @@
           <w:szCs w:val="28"/>
           <w:lang w:val="en-US"/>
         </w:rPr>
-        <w:t xml:space="preserve">[13] T. </w:t>
-      </w:r>
-      <w:proofErr w:type="spellStart"/>
-      <w:r>
+        <w:t xml:space="preserve">[18] M. S. M. Lima and D. Delen, Government Information Quarterly 37, 101407 (2020). https://doi.org/10.1016/j.giq.2019.101407.  </w:t>
+      </w:r>
+    </w:p>
+    <w:p>
+      <w:pPr>
+        <w:ind w:firstLine="652"/>
         <w:rPr>
           <w:rFonts w:cs="Times New Roman"/>
           <w:kern w:val="2"/>
           <w:szCs w:val="28"/>
           <w:lang w:val="en-US"/>
         </w:rPr>
-        <w:t>Yigitcanlar</w:t>
-      </w:r>
-      <w:proofErr w:type="spellEnd"/>
+      </w:pPr>
       <w:r>
         <w:rPr>
           <w:rFonts w:cs="Times New Roman"/>
@@ -2725,7 +4828,7 @@
           <w:szCs w:val="28"/>
           <w:lang w:val="en-US"/>
         </w:rPr>
-        <w:t xml:space="preserve">, R. Y. M. Li, and P. B. Bulu, Government Information Quarterly 40, 101733 (2023). https://doi.org/10.1016/j.giq.2022.101733.  </w:t>
+        <w:t xml:space="preserve">[19] R. Nai, R. Meo, and G. P. Pinna, Government Information Quarterly 39, 101679 (2022). https://doi.org/10.1016/j.giq.2022.101679.  </w:t>
       </w:r>
     </w:p>
     <w:p>
@@ -2735,7 +4838,6 @@
           <w:rFonts w:cs="Times New Roman"/>
           <w:kern w:val="2"/>
           <w:szCs w:val="28"/>
-          <w:lang w:val="en-US"/>
         </w:rPr>
       </w:pPr>
       <w:r>
@@ -2745,201 +4847,15 @@
           <w:szCs w:val="28"/>
           <w:lang w:val="en-US"/>
         </w:rPr>
-        <w:t xml:space="preserve">[14] Z. Wang, X. Guan, L. Sun, and D. Zhang, </w:t>
-      </w:r>
-      <w:proofErr w:type="spellStart"/>
+        <w:t xml:space="preserve">[20] "Portal of legal statistics and special accounts," [Online]. </w:t>
+      </w:r>
       <w:r>
         <w:rPr>
           <w:rFonts w:cs="Times New Roman"/>
           <w:kern w:val="2"/>
           <w:szCs w:val="28"/>
-          <w:lang w:val="en-US"/>
-        </w:rPr>
-        <w:t>Heliyon</w:t>
-      </w:r>
-      <w:proofErr w:type="spellEnd"/>
-      <w:r>
-        <w:rPr>
-          <w:rFonts w:cs="Times New Roman"/>
-          <w:kern w:val="2"/>
-          <w:szCs w:val="28"/>
-          <w:lang w:val="en-US"/>
-        </w:rPr>
-        <w:t xml:space="preserve"> 9, e13765 (2023). https://doi.org/10.1016/j.heliyon.2023.e13765.  </w:t>
-      </w:r>
-    </w:p>
-    <w:p>
-      <w:pPr>
-        <w:ind w:firstLine="652"/>
-        <w:rPr>
-          <w:rFonts w:cs="Times New Roman"/>
-          <w:kern w:val="2"/>
-          <w:szCs w:val="28"/>
-          <w:lang w:val="en-US"/>
-        </w:rPr>
-      </w:pPr>
-      <w:r>
-        <w:rPr>
-          <w:rFonts w:cs="Times New Roman"/>
-          <w:kern w:val="2"/>
-          <w:szCs w:val="28"/>
-          <w:lang w:val="en-US"/>
-        </w:rPr>
-        <w:t xml:space="preserve">[15] D. Valle-Cruz, V. Fernández-Cortez, and J. R. Gil-Garcia, Government Information Quarterly 38, 101600 (2021). https://doi.org/10.1016/j.giq.2021.101600.  </w:t>
-      </w:r>
-    </w:p>
-    <w:p>
-      <w:pPr>
-        <w:ind w:firstLine="652"/>
-        <w:rPr>
-          <w:rFonts w:cs="Times New Roman"/>
-          <w:kern w:val="2"/>
-          <w:szCs w:val="28"/>
-          <w:lang w:val="en-US"/>
-        </w:rPr>
-      </w:pPr>
-      <w:r>
-        <w:rPr>
-          <w:rFonts w:cs="Times New Roman"/>
-          <w:kern w:val="2"/>
-          <w:szCs w:val="28"/>
-          <w:lang w:val="en-US"/>
-        </w:rPr>
-        <w:t xml:space="preserve">[16] V. J. Straub, D. Morgan, and J. Bertot, Government Information Quarterly 40, 101749 (2023). https://doi.org/10.1016/j.giq.2022.101749.  </w:t>
-      </w:r>
-    </w:p>
-    <w:p>
-      <w:pPr>
-        <w:ind w:firstLine="652"/>
-        <w:rPr>
-          <w:rFonts w:cs="Times New Roman"/>
-          <w:kern w:val="2"/>
-          <w:szCs w:val="28"/>
-          <w:lang w:val="en-US"/>
-        </w:rPr>
-      </w:pPr>
-      <w:r>
-        <w:rPr>
-          <w:rFonts w:cs="Times New Roman"/>
-          <w:kern w:val="2"/>
-          <w:szCs w:val="28"/>
-          <w:lang w:val="en-US"/>
-        </w:rPr>
-        <w:lastRenderedPageBreak/>
-        <w:t xml:space="preserve">[17] I. Adam and M. Fazekas, Information Economics and Policy 54, 100880 (2021). https://doi.org/10.1016/j.infoecopol.2020.100880.  </w:t>
-      </w:r>
-    </w:p>
-    <w:p>
-      <w:pPr>
-        <w:ind w:firstLine="652"/>
-        <w:rPr>
-          <w:rFonts w:cs="Times New Roman"/>
-          <w:kern w:val="2"/>
-          <w:szCs w:val="28"/>
-          <w:lang w:val="en-US"/>
-        </w:rPr>
-      </w:pPr>
-      <w:r>
-        <w:rPr>
-          <w:rFonts w:cs="Times New Roman"/>
-          <w:kern w:val="2"/>
-          <w:szCs w:val="28"/>
-          <w:lang w:val="en-US"/>
-        </w:rPr>
-        <w:t xml:space="preserve">[18] M. S. M. Lima and D. Delen, Government Information Quarterly 37, 101407 (2020). https://doi.org/10.1016/j.giq.2019.101407.  </w:t>
-      </w:r>
-    </w:p>
-    <w:p>
-      <w:pPr>
-        <w:ind w:firstLine="652"/>
-        <w:rPr>
-          <w:rFonts w:cs="Times New Roman"/>
-          <w:kern w:val="2"/>
-          <w:szCs w:val="28"/>
-          <w:lang w:val="en-US"/>
-        </w:rPr>
-      </w:pPr>
-      <w:r>
-        <w:rPr>
-          <w:rFonts w:cs="Times New Roman"/>
-          <w:kern w:val="2"/>
-          <w:szCs w:val="28"/>
-          <w:lang w:val="en-US"/>
-        </w:rPr>
-        <w:t xml:space="preserve">[19] R. Nai, R. Meo, and G. P. Pinna, Government Information Quarterly 39, 101679 (2022). https://doi.org/10.1016/j.giq.2022.101679.  </w:t>
-      </w:r>
-    </w:p>
-    <w:p>
-      <w:pPr>
-        <w:ind w:firstLine="652"/>
-        <w:rPr>
-          <w:rFonts w:cs="Times New Roman"/>
-          <w:kern w:val="2"/>
-          <w:szCs w:val="28"/>
-        </w:rPr>
-      </w:pPr>
-      <w:r>
-        <w:rPr>
-          <w:rFonts w:cs="Times New Roman"/>
-          <w:kern w:val="2"/>
-          <w:szCs w:val="28"/>
-          <w:lang w:val="en-US"/>
-        </w:rPr>
-        <w:t xml:space="preserve">[20] "Portal of legal statistics and special accounts," [Online]. </w:t>
-      </w:r>
-      <w:proofErr w:type="spellStart"/>
-      <w:r>
-        <w:rPr>
-          <w:rFonts w:cs="Times New Roman"/>
-          <w:kern w:val="2"/>
-          <w:szCs w:val="28"/>
-        </w:rPr>
-        <w:t>Available</w:t>
-      </w:r>
-      <w:proofErr w:type="spellEnd"/>
-      <w:r>
-        <w:rPr>
-          <w:rFonts w:cs="Times New Roman"/>
-          <w:kern w:val="2"/>
-          <w:szCs w:val="28"/>
-        </w:rPr>
-        <w:t>: https://qamqor.gov.kz/. [</w:t>
-      </w:r>
-      <w:proofErr w:type="spellStart"/>
-      <w:r>
-        <w:rPr>
-          <w:rFonts w:cs="Times New Roman"/>
-          <w:kern w:val="2"/>
-          <w:szCs w:val="28"/>
-        </w:rPr>
-        <w:t>Accessed</w:t>
-      </w:r>
-      <w:proofErr w:type="spellEnd"/>
-      <w:r>
-        <w:rPr>
-          <w:rFonts w:cs="Times New Roman"/>
-          <w:kern w:val="2"/>
-          <w:szCs w:val="28"/>
-        </w:rPr>
-        <w:t xml:space="preserve">: </w:t>
-      </w:r>
-      <w:proofErr w:type="spellStart"/>
-      <w:r>
-        <w:rPr>
-          <w:rFonts w:cs="Times New Roman"/>
-          <w:kern w:val="2"/>
-          <w:szCs w:val="28"/>
-        </w:rPr>
-        <w:t>Mar</w:t>
-      </w:r>
-      <w:proofErr w:type="spellEnd"/>
-      <w:r>
-        <w:rPr>
-          <w:rFonts w:cs="Times New Roman"/>
-          <w:kern w:val="2"/>
-          <w:szCs w:val="28"/>
-        </w:rPr>
-        <w:t xml:space="preserve">. 11, 2025].  </w:t>
+        </w:rPr>
+        <w:t xml:space="preserve">Available: https://qamqor.gov.kz/. [Accessed: Mar. 11, 2025].  </w:t>
       </w:r>
     </w:p>
     <w:p/>
@@ -2970,7 +4886,7 @@
           <w:lang w:val="en-US"/>
         </w:rPr>
       </w:pPr>
-      <w:bookmarkStart w:id="7" w:name="_Toc194061350"/>
+      <w:bookmarkStart w:id="7" w:name="_Toc194164092"/>
       <w:r>
         <w:lastRenderedPageBreak/>
         <w:t>APPENDIX</w:t>
@@ -2978,9 +4894,8 @@
       <w:bookmarkEnd w:id="7"/>
     </w:p>
     <w:sectPr>
-      <w:footerReference w:type="default" r:id="rId10"/>
       <w:pgSz w:w="11906" w:h="16838"/>
-      <w:pgMar w:top="1134" w:right="850" w:bottom="1134" w:left="1701" w:header="708" w:footer="708" w:gutter="0"/>
+      <w:pgMar w:top="1134" w:right="567" w:bottom="1134" w:left="1701" w:header="709" w:footer="709" w:gutter="0"/>
       <w:cols w:space="708"/>
       <w:titlePg/>
       <w:docGrid w:linePitch="381"/>
@@ -3010,38 +4925,104 @@
 
 <file path=word/footer1.xml><?xml version="1.0" encoding="utf-8"?>
 <w:ftr xmlns:wpc="http://schemas.microsoft.com/office/word/2010/wordprocessingCanvas" xmlns:cx="http://schemas.microsoft.com/office/drawing/2014/chartex" xmlns:cx1="http://schemas.microsoft.com/office/drawing/2015/9/8/chartex" xmlns:cx2="http://schemas.microsoft.com/office/drawing/2015/10/21/chartex" xmlns:cx3="http://schemas.microsoft.com/office/drawing/2016/5/9/chartex" xmlns:cx4="http://schemas.microsoft.com/office/drawing/2016/5/10/chartex" xmlns:cx5="http://schemas.microsoft.com/office/drawing/2016/5/11/chartex" xmlns:cx6="http://schemas.microsoft.com/office/drawing/2016/5/12/chartex" xmlns:cx7="http://schemas.microsoft.com/office/drawing/2016/5/13/chartex" xmlns:cx8="http://schemas.microsoft.com/office/drawing/2016/5/14/chartex" xmlns:mc="http://schemas.openxmlformats.org/markup-compatibility/2006" xmlns:aink="http://schemas.microsoft.com/office/drawing/2016/ink" xmlns:am3d="http://schemas.microsoft.com/office/drawing/2017/model3d" xmlns:o="urn:schemas-microsoft-com:office:office" xmlns:oel="http://schemas.microsoft.com/office/2019/extlst" xmlns:r="http://schemas.openxmlformats.org/officeDocument/2006/relationships" xmlns:m="http://schemas.openxmlformats.org/officeDocument/2006/math" xmlns:v="urn:schemas-microsoft-com:vml" xmlns:wp14="http://schemas.microsoft.com/office/word/2010/wordprocessingDrawing" xmlns:wp="http://schemas.openxmlformats.org/drawingml/2006/wordprocessingDrawing" xmlns:w10="urn:schemas-microsoft-com:office:word" xmlns:w="http://schemas.openxmlformats.org/wordprocessingml/2006/main" xmlns:w14="http://schemas.microsoft.com/office/word/2010/wordml" xmlns:w15="http://schemas.microsoft.com/office/word/2012/wordml" xmlns:w16cex="http://schemas.microsoft.com/office/word/2018/wordml/cex" xmlns:w16cid="http://schemas.microsoft.com/office/word/2016/wordml/cid" xmlns:w16="http://schemas.microsoft.com/office/word/2018/wordml" xmlns:w16du="http://schemas.microsoft.com/office/word/2023/wordml/word16du" xmlns:w16sdtdh="http://schemas.microsoft.com/office/word/2020/wordml/sdtdatahash" xmlns:w16sdtfl="http://schemas.microsoft.com/office/word/2024/wordml/sdtformatlock" xmlns:w16se="http://schemas.microsoft.com/office/word/2015/wordml/symex" xmlns:wpg="http://schemas.microsoft.com/office/word/2010/wordprocessingGroup" xmlns:wpi="http://schemas.microsoft.com/office/word/2010/wordprocessingInk" xmlns:wne="http://schemas.microsoft.com/office/word/2006/wordml" xmlns:wps="http://schemas.microsoft.com/office/word/2010/wordprocessingShape" mc:Ignorable="w14 w15 w16se w16cid w16 w16cex w16sdtdh w16sdtfl w16du wp14">
+  <w:p>
+    <w:pPr>
+      <w:pStyle w:val="af1"/>
+      <w:jc w:val="center"/>
+    </w:pPr>
+  </w:p>
+  <w:p>
+    <w:pPr>
+      <w:pStyle w:val="af1"/>
+    </w:pPr>
+  </w:p>
+</w:ftr>
+</file>
+
+<file path=word/footer2.xml><?xml version="1.0" encoding="utf-8"?>
+<w:ftr xmlns:wpc="http://schemas.microsoft.com/office/word/2010/wordprocessingCanvas" xmlns:cx="http://schemas.microsoft.com/office/drawing/2014/chartex" xmlns:cx1="http://schemas.microsoft.com/office/drawing/2015/9/8/chartex" xmlns:cx2="http://schemas.microsoft.com/office/drawing/2015/10/21/chartex" xmlns:cx3="http://schemas.microsoft.com/office/drawing/2016/5/9/chartex" xmlns:cx4="http://schemas.microsoft.com/office/drawing/2016/5/10/chartex" xmlns:cx5="http://schemas.microsoft.com/office/drawing/2016/5/11/chartex" xmlns:cx6="http://schemas.microsoft.com/office/drawing/2016/5/12/chartex" xmlns:cx7="http://schemas.microsoft.com/office/drawing/2016/5/13/chartex" xmlns:cx8="http://schemas.microsoft.com/office/drawing/2016/5/14/chartex" xmlns:mc="http://schemas.openxmlformats.org/markup-compatibility/2006" xmlns:aink="http://schemas.microsoft.com/office/drawing/2016/ink" xmlns:am3d="http://schemas.microsoft.com/office/drawing/2017/model3d" xmlns:o="urn:schemas-microsoft-com:office:office" xmlns:oel="http://schemas.microsoft.com/office/2019/extlst" xmlns:r="http://schemas.openxmlformats.org/officeDocument/2006/relationships" xmlns:m="http://schemas.openxmlformats.org/officeDocument/2006/math" xmlns:v="urn:schemas-microsoft-com:vml" xmlns:wp14="http://schemas.microsoft.com/office/word/2010/wordprocessingDrawing" xmlns:wp="http://schemas.openxmlformats.org/drawingml/2006/wordprocessingDrawing" xmlns:w10="urn:schemas-microsoft-com:office:word" xmlns:w="http://schemas.openxmlformats.org/wordprocessingml/2006/main" xmlns:w14="http://schemas.microsoft.com/office/word/2010/wordml" xmlns:w15="http://schemas.microsoft.com/office/word/2012/wordml" xmlns:w16cex="http://schemas.microsoft.com/office/word/2018/wordml/cex" xmlns:w16cid="http://schemas.microsoft.com/office/word/2016/wordml/cid" xmlns:w16="http://schemas.microsoft.com/office/word/2018/wordml" xmlns:w16du="http://schemas.microsoft.com/office/word/2023/wordml/word16du" xmlns:w16sdtdh="http://schemas.microsoft.com/office/word/2020/wordml/sdtdatahash" xmlns:w16sdtfl="http://schemas.microsoft.com/office/word/2024/wordml/sdtformatlock" xmlns:w16se="http://schemas.microsoft.com/office/word/2015/wordml/symex" xmlns:wpg="http://schemas.microsoft.com/office/word/2010/wordprocessingGroup" xmlns:wpi="http://schemas.microsoft.com/office/word/2010/wordprocessingInk" xmlns:wne="http://schemas.microsoft.com/office/word/2006/wordml" xmlns:wps="http://schemas.microsoft.com/office/word/2010/wordprocessingShape" mc:Ignorable="w14 w15 w16se w16cid w16 w16cex w16sdtdh w16sdtfl w16du wp14">
   <w:sdt>
     <w:sdtPr>
-      <w:id w:val="-1697923940"/>
+      <w:id w:val="1660890094"/>
       <w:docPartObj>
         <w:docPartGallery w:val="Page Numbers (Bottom of Page)"/>
         <w:docPartUnique/>
       </w:docPartObj>
     </w:sdtPr>
+    <w:sdtEndPr>
+      <w:rPr>
+        <w:sz w:val="24"/>
+        <w:szCs w:val="24"/>
+      </w:rPr>
+    </w:sdtEndPr>
     <w:sdtContent>
       <w:p>
         <w:pPr>
           <w:pStyle w:val="af1"/>
           <w:jc w:val="center"/>
+          <w:rPr>
+            <w:sz w:val="24"/>
+            <w:szCs w:val="24"/>
+          </w:rPr>
         </w:pPr>
         <w:r>
+          <w:rPr>
+            <w:sz w:val="24"/>
+            <w:szCs w:val="24"/>
+          </w:rPr>
           <w:fldChar w:fldCharType="begin"/>
         </w:r>
         <w:r>
+          <w:rPr>
+            <w:sz w:val="24"/>
+            <w:szCs w:val="24"/>
+          </w:rPr>
           <w:instrText>PAGE   \* MERGEFORMAT</w:instrText>
         </w:r>
         <w:r>
+          <w:rPr>
+            <w:sz w:val="24"/>
+            <w:szCs w:val="24"/>
+          </w:rPr>
           <w:fldChar w:fldCharType="separate"/>
         </w:r>
         <w:r>
+          <w:rPr>
+            <w:sz w:val="24"/>
+            <w:szCs w:val="24"/>
+          </w:rPr>
           <w:t>2</w:t>
         </w:r>
         <w:r>
+          <w:rPr>
+            <w:sz w:val="24"/>
+            <w:szCs w:val="24"/>
+          </w:rPr>
           <w:fldChar w:fldCharType="end"/>
         </w:r>
       </w:p>
     </w:sdtContent>
   </w:sdt>
+  <w:p>
+    <w:pPr>
+      <w:pStyle w:val="af1"/>
+    </w:pPr>
+  </w:p>
+</w:ftr>
+</file>
+
+<file path=word/footer3.xml><?xml version="1.0" encoding="utf-8"?>
+<w:ftr xmlns:wpc="http://schemas.microsoft.com/office/word/2010/wordprocessingCanvas" xmlns:cx="http://schemas.microsoft.com/office/drawing/2014/chartex" xmlns:cx1="http://schemas.microsoft.com/office/drawing/2015/9/8/chartex" xmlns:cx2="http://schemas.microsoft.com/office/drawing/2015/10/21/chartex" xmlns:cx3="http://schemas.microsoft.com/office/drawing/2016/5/9/chartex" xmlns:cx4="http://schemas.microsoft.com/office/drawing/2016/5/10/chartex" xmlns:cx5="http://schemas.microsoft.com/office/drawing/2016/5/11/chartex" xmlns:cx6="http://schemas.microsoft.com/office/drawing/2016/5/12/chartex" xmlns:cx7="http://schemas.microsoft.com/office/drawing/2016/5/13/chartex" xmlns:cx8="http://schemas.microsoft.com/office/drawing/2016/5/14/chartex" xmlns:mc="http://schemas.openxmlformats.org/markup-compatibility/2006" xmlns:aink="http://schemas.microsoft.com/office/drawing/2016/ink" xmlns:am3d="http://schemas.microsoft.com/office/drawing/2017/model3d" xmlns:o="urn:schemas-microsoft-com:office:office" xmlns:oel="http://schemas.microsoft.com/office/2019/extlst" xmlns:r="http://schemas.openxmlformats.org/officeDocument/2006/relationships" xmlns:m="http://schemas.openxmlformats.org/officeDocument/2006/math" xmlns:v="urn:schemas-microsoft-com:vml" xmlns:wp14="http://schemas.microsoft.com/office/word/2010/wordprocessingDrawing" xmlns:wp="http://schemas.openxmlformats.org/drawingml/2006/wordprocessingDrawing" xmlns:w10="urn:schemas-microsoft-com:office:word" xmlns:w="http://schemas.openxmlformats.org/wordprocessingml/2006/main" xmlns:w14="http://schemas.microsoft.com/office/word/2010/wordml" xmlns:w15="http://schemas.microsoft.com/office/word/2012/wordml" xmlns:w16cex="http://schemas.microsoft.com/office/word/2018/wordml/cex" xmlns:w16cid="http://schemas.microsoft.com/office/word/2016/wordml/cid" xmlns:w16="http://schemas.microsoft.com/office/word/2018/wordml" xmlns:w16du="http://schemas.microsoft.com/office/word/2023/wordml/word16du" xmlns:w16sdtdh="http://schemas.microsoft.com/office/word/2020/wordml/sdtdatahash" xmlns:w16sdtfl="http://schemas.microsoft.com/office/word/2024/wordml/sdtformatlock" xmlns:w16se="http://schemas.microsoft.com/office/word/2015/wordml/symex" xmlns:wpg="http://schemas.microsoft.com/office/word/2010/wordprocessingGroup" xmlns:wpi="http://schemas.microsoft.com/office/word/2010/wordprocessingInk" xmlns:wne="http://schemas.microsoft.com/office/word/2006/wordml" xmlns:wps="http://schemas.microsoft.com/office/word/2010/wordprocessingShape" mc:Ignorable="w14 w15 w16se w16cid w16 w16cex w16sdtdh w16sdtfl w16du wp14">
+  <w:p>
+    <w:pPr>
+      <w:pStyle w:val="af1"/>
+    </w:pPr>
+  </w:p>
+</w:ftr>
+</file>
+
+<file path=word/footer4.xml><?xml version="1.0" encoding="utf-8"?>
+<w:ftr xmlns:wpc="http://schemas.microsoft.com/office/word/2010/wordprocessingCanvas" xmlns:cx="http://schemas.microsoft.com/office/drawing/2014/chartex" xmlns:cx1="http://schemas.microsoft.com/office/drawing/2015/9/8/chartex" xmlns:cx2="http://schemas.microsoft.com/office/drawing/2015/10/21/chartex" xmlns:cx3="http://schemas.microsoft.com/office/drawing/2016/5/9/chartex" xmlns:cx4="http://schemas.microsoft.com/office/drawing/2016/5/10/chartex" xmlns:cx5="http://schemas.microsoft.com/office/drawing/2016/5/11/chartex" xmlns:cx6="http://schemas.microsoft.com/office/drawing/2016/5/12/chartex" xmlns:cx7="http://schemas.microsoft.com/office/drawing/2016/5/13/chartex" xmlns:cx8="http://schemas.microsoft.com/office/drawing/2016/5/14/chartex" xmlns:mc="http://schemas.openxmlformats.org/markup-compatibility/2006" xmlns:aink="http://schemas.microsoft.com/office/drawing/2016/ink" xmlns:am3d="http://schemas.microsoft.com/office/drawing/2017/model3d" xmlns:o="urn:schemas-microsoft-com:office:office" xmlns:oel="http://schemas.microsoft.com/office/2019/extlst" xmlns:r="http://schemas.openxmlformats.org/officeDocument/2006/relationships" xmlns:m="http://schemas.openxmlformats.org/officeDocument/2006/math" xmlns:v="urn:schemas-microsoft-com:vml" xmlns:wp14="http://schemas.microsoft.com/office/word/2010/wordprocessingDrawing" xmlns:wp="http://schemas.openxmlformats.org/drawingml/2006/wordprocessingDrawing" xmlns:w10="urn:schemas-microsoft-com:office:word" xmlns:w="http://schemas.openxmlformats.org/wordprocessingml/2006/main" xmlns:w14="http://schemas.microsoft.com/office/word/2010/wordml" xmlns:w15="http://schemas.microsoft.com/office/word/2012/wordml" xmlns:w16cex="http://schemas.microsoft.com/office/word/2018/wordml/cex" xmlns:w16cid="http://schemas.microsoft.com/office/word/2016/wordml/cid" xmlns:w16="http://schemas.microsoft.com/office/word/2018/wordml" xmlns:w16du="http://schemas.microsoft.com/office/word/2023/wordml/word16du" xmlns:w16sdtdh="http://schemas.microsoft.com/office/word/2020/wordml/sdtdatahash" xmlns:w16sdtfl="http://schemas.microsoft.com/office/word/2024/wordml/sdtformatlock" xmlns:w16se="http://schemas.microsoft.com/office/word/2015/wordml/symex" xmlns:wpg="http://schemas.microsoft.com/office/word/2010/wordprocessingGroup" xmlns:wpi="http://schemas.microsoft.com/office/word/2010/wordprocessingInk" xmlns:wne="http://schemas.microsoft.com/office/word/2006/wordml" xmlns:wps="http://schemas.microsoft.com/office/word/2010/wordprocessingShape" mc:Ignorable="w14 w15 w16se w16cid w16 w16cex w16sdtdh w16sdtfl w16du wp14">
   <w:p>
     <w:pPr>
       <w:pStyle w:val="af1"/>
@@ -3221,6 +5202,155 @@
     </w:lvl>
   </w:abstractNum>
   <w:abstractNum w:abstractNumId="1" w15:restartNumberingAfterBreak="0">
+    <w:nsid w:val="12EC0CF2"/>
+    <w:multiLevelType w:val="multilevel"/>
+    <w:tmpl w:val="9F16AE6E"/>
+    <w:lvl w:ilvl="0">
+      <w:start w:val="1"/>
+      <w:numFmt w:val="bullet"/>
+      <w:lvlText w:val=""/>
+      <w:lvlJc w:val="left"/>
+      <w:pPr>
+        <w:tabs>
+          <w:tab w:val="num" w:pos="720"/>
+        </w:tabs>
+        <w:ind w:left="720" w:hanging="360"/>
+      </w:pPr>
+      <w:rPr>
+        <w:rFonts w:ascii="Symbol" w:hAnsi="Symbol" w:hint="default"/>
+        <w:sz w:val="20"/>
+      </w:rPr>
+    </w:lvl>
+    <w:lvl w:ilvl="1" w:tentative="1">
+      <w:start w:val="1"/>
+      <w:numFmt w:val="bullet"/>
+      <w:lvlText w:val="o"/>
+      <w:lvlJc w:val="left"/>
+      <w:pPr>
+        <w:tabs>
+          <w:tab w:val="num" w:pos="1440"/>
+        </w:tabs>
+        <w:ind w:left="1440" w:hanging="360"/>
+      </w:pPr>
+      <w:rPr>
+        <w:rFonts w:ascii="Courier New" w:hAnsi="Courier New" w:hint="default"/>
+        <w:sz w:val="20"/>
+      </w:rPr>
+    </w:lvl>
+    <w:lvl w:ilvl="2" w:tentative="1">
+      <w:start w:val="1"/>
+      <w:numFmt w:val="bullet"/>
+      <w:lvlText w:val=""/>
+      <w:lvlJc w:val="left"/>
+      <w:pPr>
+        <w:tabs>
+          <w:tab w:val="num" w:pos="2160"/>
+        </w:tabs>
+        <w:ind w:left="2160" w:hanging="360"/>
+      </w:pPr>
+      <w:rPr>
+        <w:rFonts w:ascii="Wingdings" w:hAnsi="Wingdings" w:hint="default"/>
+        <w:sz w:val="20"/>
+      </w:rPr>
+    </w:lvl>
+    <w:lvl w:ilvl="3" w:tentative="1">
+      <w:start w:val="1"/>
+      <w:numFmt w:val="bullet"/>
+      <w:lvlText w:val=""/>
+      <w:lvlJc w:val="left"/>
+      <w:pPr>
+        <w:tabs>
+          <w:tab w:val="num" w:pos="2880"/>
+        </w:tabs>
+        <w:ind w:left="2880" w:hanging="360"/>
+      </w:pPr>
+      <w:rPr>
+        <w:rFonts w:ascii="Wingdings" w:hAnsi="Wingdings" w:hint="default"/>
+        <w:sz w:val="20"/>
+      </w:rPr>
+    </w:lvl>
+    <w:lvl w:ilvl="4" w:tentative="1">
+      <w:start w:val="1"/>
+      <w:numFmt w:val="bullet"/>
+      <w:lvlText w:val=""/>
+      <w:lvlJc w:val="left"/>
+      <w:pPr>
+        <w:tabs>
+          <w:tab w:val="num" w:pos="3600"/>
+        </w:tabs>
+        <w:ind w:left="3600" w:hanging="360"/>
+      </w:pPr>
+      <w:rPr>
+        <w:rFonts w:ascii="Wingdings" w:hAnsi="Wingdings" w:hint="default"/>
+        <w:sz w:val="20"/>
+      </w:rPr>
+    </w:lvl>
+    <w:lvl w:ilvl="5" w:tentative="1">
+      <w:start w:val="1"/>
+      <w:numFmt w:val="bullet"/>
+      <w:lvlText w:val=""/>
+      <w:lvlJc w:val="left"/>
+      <w:pPr>
+        <w:tabs>
+          <w:tab w:val="num" w:pos="4320"/>
+        </w:tabs>
+        <w:ind w:left="4320" w:hanging="360"/>
+      </w:pPr>
+      <w:rPr>
+        <w:rFonts w:ascii="Wingdings" w:hAnsi="Wingdings" w:hint="default"/>
+        <w:sz w:val="20"/>
+      </w:rPr>
+    </w:lvl>
+    <w:lvl w:ilvl="6" w:tentative="1">
+      <w:start w:val="1"/>
+      <w:numFmt w:val="bullet"/>
+      <w:lvlText w:val=""/>
+      <w:lvlJc w:val="left"/>
+      <w:pPr>
+        <w:tabs>
+          <w:tab w:val="num" w:pos="5040"/>
+        </w:tabs>
+        <w:ind w:left="5040" w:hanging="360"/>
+      </w:pPr>
+      <w:rPr>
+        <w:rFonts w:ascii="Wingdings" w:hAnsi="Wingdings" w:hint="default"/>
+        <w:sz w:val="20"/>
+      </w:rPr>
+    </w:lvl>
+    <w:lvl w:ilvl="7" w:tentative="1">
+      <w:start w:val="1"/>
+      <w:numFmt w:val="bullet"/>
+      <w:lvlText w:val=""/>
+      <w:lvlJc w:val="left"/>
+      <w:pPr>
+        <w:tabs>
+          <w:tab w:val="num" w:pos="5760"/>
+        </w:tabs>
+        <w:ind w:left="5760" w:hanging="360"/>
+      </w:pPr>
+      <w:rPr>
+        <w:rFonts w:ascii="Wingdings" w:hAnsi="Wingdings" w:hint="default"/>
+        <w:sz w:val="20"/>
+      </w:rPr>
+    </w:lvl>
+    <w:lvl w:ilvl="8" w:tentative="1">
+      <w:start w:val="1"/>
+      <w:numFmt w:val="bullet"/>
+      <w:lvlText w:val=""/>
+      <w:lvlJc w:val="left"/>
+      <w:pPr>
+        <w:tabs>
+          <w:tab w:val="num" w:pos="6480"/>
+        </w:tabs>
+        <w:ind w:left="6480" w:hanging="360"/>
+      </w:pPr>
+      <w:rPr>
+        <w:rFonts w:ascii="Wingdings" w:hAnsi="Wingdings" w:hint="default"/>
+        <w:sz w:val="20"/>
+      </w:rPr>
+    </w:lvl>
+  </w:abstractNum>
+  <w:abstractNum w:abstractNumId="2" w15:restartNumberingAfterBreak="0">
     <w:nsid w:val="513C3F03"/>
     <w:multiLevelType w:val="multilevel"/>
     <w:tmpl w:val="25F207CE"/>
@@ -3333,7 +5463,7 @@
       </w:pPr>
     </w:lvl>
   </w:abstractNum>
-  <w:abstractNum w:abstractNumId="2" w15:restartNumberingAfterBreak="0">
+  <w:abstractNum w:abstractNumId="3" w15:restartNumberingAfterBreak="0">
     <w:nsid w:val="672E1908"/>
     <w:multiLevelType w:val="multilevel"/>
     <w:tmpl w:val="F1D874D0"/>
@@ -3447,13 +5577,16 @@
     </w:lvl>
   </w:abstractNum>
   <w:num w:numId="1" w16cid:durableId="1499152162">
-    <w:abstractNumId w:val="1"/>
+    <w:abstractNumId w:val="2"/>
   </w:num>
   <w:num w:numId="2" w16cid:durableId="1311982485">
     <w:abstractNumId w:val="0"/>
   </w:num>
   <w:num w:numId="3" w16cid:durableId="1422795344">
-    <w:abstractNumId w:val="2"/>
+    <w:abstractNumId w:val="3"/>
+  </w:num>
+  <w:num w:numId="4" w16cid:durableId="651830967">
+    <w:abstractNumId w:val="1"/>
   </w:num>
 </w:numbering>
 </file>
@@ -3872,12 +6005,13 @@
     <w:link w:val="10"/>
     <w:uiPriority w:val="9"/>
     <w:qFormat/>
-    <w:rsid w:val="00366384"/>
+    <w:rsid w:val="00493B54"/>
     <w:pPr>
       <w:keepNext/>
       <w:keepLines/>
-      <w:spacing w:before="360" w:after="80"/>
-      <w:jc w:val="center"/>
+      <w:spacing w:before="240" w:after="240"/>
+      <w:ind w:firstLine="709"/>
+      <w:jc w:val="left"/>
       <w:outlineLvl w:val="0"/>
     </w:pPr>
     <w:rPr>
@@ -4093,7 +6227,7 @@
     <w:basedOn w:val="a0"/>
     <w:link w:val="1"/>
     <w:uiPriority w:val="9"/>
-    <w:rsid w:val="00366384"/>
+    <w:rsid w:val="00493B54"/>
     <w:rPr>
       <w:rFonts w:eastAsiaTheme="majorEastAsia" w:cstheme="majorBidi"/>
       <w:b/>
@@ -4483,8 +6617,7 @@
     <w:qFormat/>
     <w:rsid w:val="009A5BE8"/>
     <w:pPr>
-      <w:spacing w:before="240" w:after="0" w:line="259" w:lineRule="auto"/>
-      <w:jc w:val="left"/>
+      <w:spacing w:after="0" w:line="259" w:lineRule="auto"/>
       <w:outlineLvl w:val="9"/>
     </w:pPr>
     <w:rPr>

</xml_diff>

<commit_message>
Data Preprocessing section done
</commit_message>
<xml_diff>
--- a/report/Диссертация.docx
+++ b/report/Диссертация.docx
@@ -4610,7 +4610,7 @@
           <w:r>
             <w:fldChar w:fldCharType="separate"/>
           </w:r>
-          <w:hyperlink w:anchor="_Toc194490940" w:history="1">
+          <w:hyperlink w:anchor="_Toc194672590" w:history="1">
             <w:r>
               <w:rPr>
                 <w:rStyle w:val="af4"/>
@@ -4638,7 +4638,7 @@
                 <w:noProof/>
                 <w:webHidden/>
               </w:rPr>
-              <w:instrText xml:space="preserve"> PAGEREF _Toc194490940 \h </w:instrText>
+              <w:instrText xml:space="preserve"> PAGEREF _Toc194672590 \h </w:instrText>
             </w:r>
             <w:r>
               <w:rPr>
@@ -4685,7 +4685,7 @@
               <w14:ligatures w14:val="standardContextual"/>
             </w:rPr>
           </w:pPr>
-          <w:hyperlink w:anchor="_Toc194490941" w:history="1">
+          <w:hyperlink w:anchor="_Toc194672591" w:history="1">
             <w:r>
               <w:rPr>
                 <w:rStyle w:val="af4"/>
@@ -4713,7 +4713,7 @@
                 <w:noProof/>
                 <w:webHidden/>
               </w:rPr>
-              <w:instrText xml:space="preserve"> PAGEREF _Toc194490941 \h </w:instrText>
+              <w:instrText xml:space="preserve"> PAGEREF _Toc194672591 \h </w:instrText>
             </w:r>
             <w:r>
               <w:rPr>
@@ -4761,7 +4761,7 @@
               <w14:ligatures w14:val="standardContextual"/>
             </w:rPr>
           </w:pPr>
-          <w:hyperlink w:anchor="_Toc194490942" w:history="1">
+          <w:hyperlink w:anchor="_Toc194672592" w:history="1">
             <w:r>
               <w:rPr>
                 <w:rStyle w:val="af4"/>
@@ -4807,7 +4807,7 @@
                 <w:noProof/>
                 <w:webHidden/>
               </w:rPr>
-              <w:instrText xml:space="preserve"> PAGEREF _Toc194490942 \h </w:instrText>
+              <w:instrText xml:space="preserve"> PAGEREF _Toc194672592 \h </w:instrText>
             </w:r>
             <w:r>
               <w:rPr>
@@ -4854,7 +4854,7 @@
               <w14:ligatures w14:val="standardContextual"/>
             </w:rPr>
           </w:pPr>
-          <w:hyperlink w:anchor="_Toc194490943" w:history="1">
+          <w:hyperlink w:anchor="_Toc194672593" w:history="1">
             <w:r>
               <w:rPr>
                 <w:rStyle w:val="af4"/>
@@ -4882,7 +4882,7 @@
                 <w:noProof/>
                 <w:webHidden/>
               </w:rPr>
-              <w:instrText xml:space="preserve"> PAGEREF _Toc194490943 \h </w:instrText>
+              <w:instrText xml:space="preserve"> PAGEREF _Toc194672593 \h </w:instrText>
             </w:r>
             <w:r>
               <w:rPr>
@@ -4929,7 +4929,7 @@
               <w14:ligatures w14:val="standardContextual"/>
             </w:rPr>
           </w:pPr>
-          <w:hyperlink w:anchor="_Toc194490944" w:history="1">
+          <w:hyperlink w:anchor="_Toc194672594" w:history="1">
             <w:r>
               <w:rPr>
                 <w:rStyle w:val="af4"/>
@@ -4957,7 +4957,7 @@
                 <w:noProof/>
                 <w:webHidden/>
               </w:rPr>
-              <w:instrText xml:space="preserve"> PAGEREF _Toc194490944 \h </w:instrText>
+              <w:instrText xml:space="preserve"> PAGEREF _Toc194672594 \h </w:instrText>
             </w:r>
             <w:r>
               <w:rPr>
@@ -5004,14 +5004,14 @@
               <w14:ligatures w14:val="standardContextual"/>
             </w:rPr>
           </w:pPr>
-          <w:hyperlink w:anchor="_Toc194490945" w:history="1">
+          <w:hyperlink w:anchor="_Toc194672595" w:history="1">
             <w:r>
               <w:rPr>
                 <w:rStyle w:val="af4"/>
                 <w:noProof/>
                 <w:lang w:val="en-US"/>
               </w:rPr>
-              <w:t>2.1.1 Data Collection of Corruption crime numbers</w:t>
+              <w:t>2.1.1 Extracting corruption crime numbers</w:t>
             </w:r>
             <w:r>
               <w:rPr>
@@ -5032,7 +5032,7 @@
                 <w:noProof/>
                 <w:webHidden/>
               </w:rPr>
-              <w:instrText xml:space="preserve"> PAGEREF _Toc194490945 \h </w:instrText>
+              <w:instrText xml:space="preserve"> PAGEREF _Toc194672595 \h </w:instrText>
             </w:r>
             <w:r>
               <w:rPr>
@@ -5079,30 +5079,14 @@
               <w14:ligatures w14:val="standardContextual"/>
             </w:rPr>
           </w:pPr>
-          <w:hyperlink w:anchor="_Toc194490946" w:history="1">
+          <w:hyperlink w:anchor="_Toc194672596" w:history="1">
             <w:r>
               <w:rPr>
                 <w:rStyle w:val="af4"/>
                 <w:noProof/>
                 <w:lang w:val="en-US"/>
               </w:rPr>
-              <w:t>2.1.2 Data Collection of new</w:t>
-            </w:r>
-            <w:r>
-              <w:rPr>
-                <w:rStyle w:val="af4"/>
-                <w:noProof/>
-                <w:lang w:val="en-US"/>
-              </w:rPr>
-              <w:t>s</w:t>
-            </w:r>
-            <w:r>
-              <w:rPr>
-                <w:rStyle w:val="af4"/>
-                <w:noProof/>
-                <w:lang w:val="en-US"/>
-              </w:rPr>
-              <w:t xml:space="preserve"> data</w:t>
+              <w:t>2.1.2 Extracting numbers of keywords in news articles</w:t>
             </w:r>
             <w:r>
               <w:rPr>
@@ -5123,7 +5107,7 @@
                 <w:noProof/>
                 <w:webHidden/>
               </w:rPr>
-              <w:instrText xml:space="preserve"> PAGEREF _Toc194490946 \h </w:instrText>
+              <w:instrText xml:space="preserve"> PAGEREF _Toc194672596 \h </w:instrText>
             </w:r>
             <w:r>
               <w:rPr>
@@ -5170,7 +5154,7 @@
               <w14:ligatures w14:val="standardContextual"/>
             </w:rPr>
           </w:pPr>
-          <w:hyperlink w:anchor="_Toc194490947" w:history="1">
+          <w:hyperlink w:anchor="_Toc194672597" w:history="1">
             <w:r>
               <w:rPr>
                 <w:rStyle w:val="af4"/>
@@ -5198,7 +5182,7 @@
                 <w:noProof/>
                 <w:webHidden/>
               </w:rPr>
-              <w:instrText xml:space="preserve"> PAGEREF _Toc194490947 \h </w:instrText>
+              <w:instrText xml:space="preserve"> PAGEREF _Toc194672597 \h </w:instrText>
             </w:r>
             <w:r>
               <w:rPr>
@@ -5218,7 +5202,7 @@
                 <w:noProof/>
                 <w:webHidden/>
               </w:rPr>
-              <w:t>18</w:t>
+              <w:t>19</w:t>
             </w:r>
             <w:r>
               <w:rPr>
@@ -5245,14 +5229,14 @@
               <w14:ligatures w14:val="standardContextual"/>
             </w:rPr>
           </w:pPr>
-          <w:hyperlink w:anchor="_Toc194490948" w:history="1">
+          <w:hyperlink w:anchor="_Toc194672598" w:history="1">
             <w:r>
               <w:rPr>
                 <w:rStyle w:val="af4"/>
                 <w:noProof/>
                 <w:lang w:val="en-US"/>
               </w:rPr>
-              <w:t>2.3 Regression models</w:t>
+              <w:t>2.2.1 Corruption crimes numbers preprocessing</w:t>
             </w:r>
             <w:r>
               <w:rPr>
@@ -5273,7 +5257,7 @@
                 <w:noProof/>
                 <w:webHidden/>
               </w:rPr>
-              <w:instrText xml:space="preserve"> PAGEREF _Toc194490948 \h </w:instrText>
+              <w:instrText xml:space="preserve"> PAGEREF _Toc194672598 \h </w:instrText>
             </w:r>
             <w:r>
               <w:rPr>
@@ -5293,7 +5277,7 @@
                 <w:noProof/>
                 <w:webHidden/>
               </w:rPr>
-              <w:t>18</w:t>
+              <w:t>19</w:t>
             </w:r>
             <w:r>
               <w:rPr>
@@ -5320,14 +5304,14 @@
               <w14:ligatures w14:val="standardContextual"/>
             </w:rPr>
           </w:pPr>
-          <w:hyperlink w:anchor="_Toc194490949" w:history="1">
+          <w:hyperlink w:anchor="_Toc194672599" w:history="1">
             <w:r>
               <w:rPr>
                 <w:rStyle w:val="af4"/>
                 <w:noProof/>
                 <w:lang w:val="en-US"/>
               </w:rPr>
-              <w:t>2.4 Time Series Analysis</w:t>
+              <w:t>2.2.2 News data preprocessing</w:t>
             </w:r>
             <w:r>
               <w:rPr>
@@ -5348,7 +5332,7 @@
                 <w:noProof/>
                 <w:webHidden/>
               </w:rPr>
-              <w:instrText xml:space="preserve"> PAGEREF _Toc194490949 \h </w:instrText>
+              <w:instrText xml:space="preserve"> PAGEREF _Toc194672599 \h </w:instrText>
             </w:r>
             <w:r>
               <w:rPr>
@@ -5368,7 +5352,7 @@
                 <w:noProof/>
                 <w:webHidden/>
               </w:rPr>
-              <w:t>18</w:t>
+              <w:t>21</w:t>
             </w:r>
             <w:r>
               <w:rPr>
@@ -5395,7 +5379,7 @@
               <w14:ligatures w14:val="standardContextual"/>
             </w:rPr>
           </w:pPr>
-          <w:hyperlink w:anchor="_Toc194490950" w:history="1">
+          <w:hyperlink w:anchor="_Toc194672600" w:history="1">
             <w:r>
               <w:rPr>
                 <w:rStyle w:val="af4"/>
@@ -5423,7 +5407,7 @@
                 <w:noProof/>
                 <w:webHidden/>
               </w:rPr>
-              <w:instrText xml:space="preserve"> PAGEREF _Toc194490950 \h </w:instrText>
+              <w:instrText xml:space="preserve"> PAGEREF _Toc194672600 \h </w:instrText>
             </w:r>
             <w:r>
               <w:rPr>
@@ -5443,7 +5427,7 @@
                 <w:noProof/>
                 <w:webHidden/>
               </w:rPr>
-              <w:t>19</w:t>
+              <w:t>24</w:t>
             </w:r>
             <w:r>
               <w:rPr>
@@ -5470,14 +5454,14 @@
               <w14:ligatures w14:val="standardContextual"/>
             </w:rPr>
           </w:pPr>
-          <w:hyperlink w:anchor="_Toc194490951" w:history="1">
+          <w:hyperlink w:anchor="_Toc194672601" w:history="1">
             <w:r>
               <w:rPr>
                 <w:rStyle w:val="af4"/>
                 <w:noProof/>
                 <w:lang w:val="en-US"/>
               </w:rPr>
-              <w:t>4 DISCUSSION</w:t>
+              <w:t>3.1 Regression models</w:t>
             </w:r>
             <w:r>
               <w:rPr>
@@ -5498,7 +5482,7 @@
                 <w:noProof/>
                 <w:webHidden/>
               </w:rPr>
-              <w:instrText xml:space="preserve"> PAGEREF _Toc194490951 \h </w:instrText>
+              <w:instrText xml:space="preserve"> PAGEREF _Toc194672601 \h </w:instrText>
             </w:r>
             <w:r>
               <w:rPr>
@@ -5518,7 +5502,7 @@
                 <w:noProof/>
                 <w:webHidden/>
               </w:rPr>
-              <w:t>20</w:t>
+              <w:t>24</w:t>
             </w:r>
             <w:r>
               <w:rPr>
@@ -5545,14 +5529,14 @@
               <w14:ligatures w14:val="standardContextual"/>
             </w:rPr>
           </w:pPr>
-          <w:hyperlink w:anchor="_Toc194490952" w:history="1">
+          <w:hyperlink w:anchor="_Toc194672602" w:history="1">
             <w:r>
               <w:rPr>
                 <w:rStyle w:val="af4"/>
                 <w:noProof/>
                 <w:lang w:val="en-US"/>
               </w:rPr>
-              <w:t>CONCLUSION</w:t>
+              <w:t>3.2 Hypothesis Testing and Motivation for Time Series Analysis</w:t>
             </w:r>
             <w:r>
               <w:rPr>
@@ -5573,7 +5557,7 @@
                 <w:noProof/>
                 <w:webHidden/>
               </w:rPr>
-              <w:instrText xml:space="preserve"> PAGEREF _Toc194490952 \h </w:instrText>
+              <w:instrText xml:space="preserve"> PAGEREF _Toc194672602 \h </w:instrText>
             </w:r>
             <w:r>
               <w:rPr>
@@ -5593,7 +5577,7 @@
                 <w:noProof/>
                 <w:webHidden/>
               </w:rPr>
-              <w:t>21</w:t>
+              <w:t>24</w:t>
             </w:r>
             <w:r>
               <w:rPr>
@@ -5620,14 +5604,14 @@
               <w14:ligatures w14:val="standardContextual"/>
             </w:rPr>
           </w:pPr>
-          <w:hyperlink w:anchor="_Toc194490953" w:history="1">
+          <w:hyperlink w:anchor="_Toc194672603" w:history="1">
             <w:r>
               <w:rPr>
                 <w:rStyle w:val="af4"/>
                 <w:noProof/>
                 <w:lang w:val="en-US"/>
               </w:rPr>
-              <w:t>REFERENCES</w:t>
+              <w:t>3.3 Time Series Analysis</w:t>
             </w:r>
             <w:r>
               <w:rPr>
@@ -5648,7 +5632,7 @@
                 <w:noProof/>
                 <w:webHidden/>
               </w:rPr>
-              <w:instrText xml:space="preserve"> PAGEREF _Toc194490953 \h </w:instrText>
+              <w:instrText xml:space="preserve"> PAGEREF _Toc194672603 \h </w:instrText>
             </w:r>
             <w:r>
               <w:rPr>
@@ -5668,7 +5652,7 @@
                 <w:noProof/>
                 <w:webHidden/>
               </w:rPr>
-              <w:t>22</w:t>
+              <w:t>24</w:t>
             </w:r>
             <w:r>
               <w:rPr>
@@ -5695,13 +5679,14 @@
               <w14:ligatures w14:val="standardContextual"/>
             </w:rPr>
           </w:pPr>
-          <w:hyperlink w:anchor="_Toc194490954" w:history="1">
+          <w:hyperlink w:anchor="_Toc194672604" w:history="1">
             <w:r>
               <w:rPr>
                 <w:rStyle w:val="af4"/>
                 <w:noProof/>
-              </w:rPr>
-              <w:t>APPENDIX</w:t>
+                <w:lang w:val="en-US"/>
+              </w:rPr>
+              <w:t>4 DISCUSSION</w:t>
             </w:r>
             <w:r>
               <w:rPr>
@@ -5722,7 +5707,7 @@
                 <w:noProof/>
                 <w:webHidden/>
               </w:rPr>
-              <w:instrText xml:space="preserve"> PAGEREF _Toc194490954 \h </w:instrText>
+              <w:instrText xml:space="preserve"> PAGEREF _Toc194672604 \h </w:instrText>
             </w:r>
             <w:r>
               <w:rPr>
@@ -5742,7 +5727,232 @@
                 <w:noProof/>
                 <w:webHidden/>
               </w:rPr>
-              <w:t>24</w:t>
+              <w:t>25</w:t>
+            </w:r>
+            <w:r>
+              <w:rPr>
+                <w:noProof/>
+                <w:webHidden/>
+              </w:rPr>
+              <w:fldChar w:fldCharType="end"/>
+            </w:r>
+          </w:hyperlink>
+        </w:p>
+        <w:p>
+          <w:pPr>
+            <w:pStyle w:val="11"/>
+            <w:tabs>
+              <w:tab w:val="right" w:leader="dot" w:pos="9628"/>
+            </w:tabs>
+            <w:rPr>
+              <w:rFonts w:asciiTheme="minorHAnsi" w:eastAsiaTheme="minorEastAsia" w:hAnsiTheme="minorHAnsi"/>
+              <w:noProof/>
+              <w:kern w:val="2"/>
+              <w:sz w:val="24"/>
+              <w:szCs w:val="24"/>
+              <w:lang w:eastAsia="ru-RU"/>
+              <w14:ligatures w14:val="standardContextual"/>
+            </w:rPr>
+          </w:pPr>
+          <w:hyperlink w:anchor="_Toc194672605" w:history="1">
+            <w:r>
+              <w:rPr>
+                <w:rStyle w:val="af4"/>
+                <w:noProof/>
+                <w:lang w:val="en-US"/>
+              </w:rPr>
+              <w:t>CONCLUSION</w:t>
+            </w:r>
+            <w:r>
+              <w:rPr>
+                <w:noProof/>
+                <w:webHidden/>
+              </w:rPr>
+              <w:tab/>
+            </w:r>
+            <w:r>
+              <w:rPr>
+                <w:noProof/>
+                <w:webHidden/>
+              </w:rPr>
+              <w:fldChar w:fldCharType="begin"/>
+            </w:r>
+            <w:r>
+              <w:rPr>
+                <w:noProof/>
+                <w:webHidden/>
+              </w:rPr>
+              <w:instrText xml:space="preserve"> PAGEREF _Toc194672605 \h </w:instrText>
+            </w:r>
+            <w:r>
+              <w:rPr>
+                <w:noProof/>
+                <w:webHidden/>
+              </w:rPr>
+            </w:r>
+            <w:r>
+              <w:rPr>
+                <w:noProof/>
+                <w:webHidden/>
+              </w:rPr>
+              <w:fldChar w:fldCharType="separate"/>
+            </w:r>
+            <w:r>
+              <w:rPr>
+                <w:noProof/>
+                <w:webHidden/>
+              </w:rPr>
+              <w:t>26</w:t>
+            </w:r>
+            <w:r>
+              <w:rPr>
+                <w:noProof/>
+                <w:webHidden/>
+              </w:rPr>
+              <w:fldChar w:fldCharType="end"/>
+            </w:r>
+          </w:hyperlink>
+        </w:p>
+        <w:p>
+          <w:pPr>
+            <w:pStyle w:val="11"/>
+            <w:tabs>
+              <w:tab w:val="right" w:leader="dot" w:pos="9628"/>
+            </w:tabs>
+            <w:rPr>
+              <w:rFonts w:asciiTheme="minorHAnsi" w:eastAsiaTheme="minorEastAsia" w:hAnsiTheme="minorHAnsi"/>
+              <w:noProof/>
+              <w:kern w:val="2"/>
+              <w:sz w:val="24"/>
+              <w:szCs w:val="24"/>
+              <w:lang w:eastAsia="ru-RU"/>
+              <w14:ligatures w14:val="standardContextual"/>
+            </w:rPr>
+          </w:pPr>
+          <w:hyperlink w:anchor="_Toc194672606" w:history="1">
+            <w:r>
+              <w:rPr>
+                <w:rStyle w:val="af4"/>
+                <w:noProof/>
+                <w:lang w:val="en-US"/>
+              </w:rPr>
+              <w:t>REFERENCES</w:t>
+            </w:r>
+            <w:r>
+              <w:rPr>
+                <w:noProof/>
+                <w:webHidden/>
+              </w:rPr>
+              <w:tab/>
+            </w:r>
+            <w:r>
+              <w:rPr>
+                <w:noProof/>
+                <w:webHidden/>
+              </w:rPr>
+              <w:fldChar w:fldCharType="begin"/>
+            </w:r>
+            <w:r>
+              <w:rPr>
+                <w:noProof/>
+                <w:webHidden/>
+              </w:rPr>
+              <w:instrText xml:space="preserve"> PAGEREF _Toc194672606 \h </w:instrText>
+            </w:r>
+            <w:r>
+              <w:rPr>
+                <w:noProof/>
+                <w:webHidden/>
+              </w:rPr>
+            </w:r>
+            <w:r>
+              <w:rPr>
+                <w:noProof/>
+                <w:webHidden/>
+              </w:rPr>
+              <w:fldChar w:fldCharType="separate"/>
+            </w:r>
+            <w:r>
+              <w:rPr>
+                <w:noProof/>
+                <w:webHidden/>
+              </w:rPr>
+              <w:t>27</w:t>
+            </w:r>
+            <w:r>
+              <w:rPr>
+                <w:noProof/>
+                <w:webHidden/>
+              </w:rPr>
+              <w:fldChar w:fldCharType="end"/>
+            </w:r>
+          </w:hyperlink>
+        </w:p>
+        <w:p>
+          <w:pPr>
+            <w:pStyle w:val="11"/>
+            <w:tabs>
+              <w:tab w:val="right" w:leader="dot" w:pos="9628"/>
+            </w:tabs>
+            <w:rPr>
+              <w:rFonts w:asciiTheme="minorHAnsi" w:eastAsiaTheme="minorEastAsia" w:hAnsiTheme="minorHAnsi"/>
+              <w:noProof/>
+              <w:kern w:val="2"/>
+              <w:sz w:val="24"/>
+              <w:szCs w:val="24"/>
+              <w:lang w:eastAsia="ru-RU"/>
+              <w14:ligatures w14:val="standardContextual"/>
+            </w:rPr>
+          </w:pPr>
+          <w:hyperlink w:anchor="_Toc194672607" w:history="1">
+            <w:r>
+              <w:rPr>
+                <w:rStyle w:val="af4"/>
+                <w:noProof/>
+                <w:lang w:val="en-US"/>
+              </w:rPr>
+              <w:t>APPENDIX A — CORRUPTION-RELATED KEYWORDS</w:t>
+            </w:r>
+            <w:r>
+              <w:rPr>
+                <w:noProof/>
+                <w:webHidden/>
+              </w:rPr>
+              <w:tab/>
+            </w:r>
+            <w:r>
+              <w:rPr>
+                <w:noProof/>
+                <w:webHidden/>
+              </w:rPr>
+              <w:fldChar w:fldCharType="begin"/>
+            </w:r>
+            <w:r>
+              <w:rPr>
+                <w:noProof/>
+                <w:webHidden/>
+              </w:rPr>
+              <w:instrText xml:space="preserve"> PAGEREF _Toc194672607 \h </w:instrText>
+            </w:r>
+            <w:r>
+              <w:rPr>
+                <w:noProof/>
+                <w:webHidden/>
+              </w:rPr>
+            </w:r>
+            <w:r>
+              <w:rPr>
+                <w:noProof/>
+                <w:webHidden/>
+              </w:rPr>
+              <w:fldChar w:fldCharType="separate"/>
+            </w:r>
+            <w:r>
+              <w:rPr>
+                <w:noProof/>
+                <w:webHidden/>
+              </w:rPr>
+              <w:t>29</w:t>
             </w:r>
             <w:r>
               <w:rPr>
@@ -5791,7 +6001,7 @@
           <w:lang w:val="en-US"/>
         </w:rPr>
       </w:pPr>
-      <w:bookmarkStart w:id="3" w:name="_Toc194490940"/>
+      <w:bookmarkStart w:id="3" w:name="_Toc194672590"/>
       <w:r>
         <w:rPr>
           <w:lang w:val="en-US"/>
@@ -5823,7 +6033,7 @@
           <w:lang w:val="en-US"/>
         </w:rPr>
       </w:pPr>
-      <w:bookmarkStart w:id="4" w:name="_Toc194490941"/>
+      <w:bookmarkStart w:id="4" w:name="_Toc194672591"/>
       <w:r>
         <w:rPr>
           <w:lang w:val="en-US"/>
@@ -6347,7 +6557,7 @@
           <w:numId w:val="6"/>
         </w:numPr>
       </w:pPr>
-      <w:bookmarkStart w:id="5" w:name="_Toc194490942"/>
+      <w:bookmarkStart w:id="5" w:name="_Toc194672592"/>
       <w:r>
         <w:lastRenderedPageBreak/>
         <w:t>LITERATURE REVIEW</w:t>
@@ -6798,7 +7008,7 @@
           <w:lang w:val="en-US"/>
         </w:rPr>
       </w:pPr>
-      <w:bookmarkStart w:id="6" w:name="_Toc194490943"/>
+      <w:bookmarkStart w:id="6" w:name="_Toc194672593"/>
       <w:r>
         <w:rPr>
           <w:lang w:val="en-US"/>
@@ -6987,7 +7197,7 @@
           <w:lang w:val="en-US"/>
         </w:rPr>
       </w:pPr>
-      <w:bookmarkStart w:id="7" w:name="_Toc194490944"/>
+      <w:bookmarkStart w:id="7" w:name="_Toc194672594"/>
       <w:r>
         <w:rPr>
           <w:lang w:val="en-US"/>
@@ -7009,30 +7219,42 @@
           <w:lang w:val="en-US"/>
         </w:rPr>
       </w:pPr>
-      <w:bookmarkStart w:id="8" w:name="_Toc194490945"/>
-      <w:r>
-        <w:rPr>
-          <w:lang w:val="en-US"/>
-        </w:rPr>
-        <w:t>2.1.1 D</w:t>
-      </w:r>
-      <w:r>
-        <w:rPr>
-          <w:lang w:val="en-US"/>
-        </w:rPr>
-        <w:t xml:space="preserve">ata </w:t>
-      </w:r>
-      <w:r>
-        <w:rPr>
-          <w:lang w:val="en-US"/>
-        </w:rPr>
-        <w:t>C</w:t>
-      </w:r>
-      <w:r>
-        <w:rPr>
-          <w:lang w:val="en-US"/>
-        </w:rPr>
-        <w:t>ollection of Corruption crime numbers</w:t>
+      <w:bookmarkStart w:id="8" w:name="_Toc194672595"/>
+      <w:r>
+        <w:rPr>
+          <w:lang w:val="en-US"/>
+        </w:rPr>
+        <w:t>2.1.1</w:t>
+      </w:r>
+      <w:r>
+        <w:rPr>
+          <w:lang w:val="en-US"/>
+        </w:rPr>
+        <w:t xml:space="preserve"> </w:t>
+      </w:r>
+      <w:r>
+        <w:rPr>
+          <w:lang w:val="en-US"/>
+        </w:rPr>
+        <w:t>Extracting</w:t>
+      </w:r>
+      <w:r>
+        <w:rPr>
+          <w:lang w:val="en-US"/>
+        </w:rPr>
+        <w:t xml:space="preserve"> </w:t>
+      </w:r>
+      <w:r>
+        <w:rPr>
+          <w:lang w:val="en-US"/>
+        </w:rPr>
+        <w:t>c</w:t>
+      </w:r>
+      <w:r>
+        <w:rPr>
+          <w:lang w:val="en-US"/>
+        </w:rPr>
+        <w:t>orruption crime numbers</w:t>
       </w:r>
       <w:bookmarkEnd w:id="8"/>
     </w:p>
@@ -9651,37 +9873,19 @@
           <w:lang w:val="en-US"/>
         </w:rPr>
       </w:pPr>
-      <w:bookmarkStart w:id="10" w:name="_Toc194490946"/>
+      <w:bookmarkStart w:id="10" w:name="_Toc194672596"/>
       <w:r>
         <w:rPr>
           <w:lang w:val="en-US"/>
         </w:rPr>
         <w:lastRenderedPageBreak/>
-        <w:t>2.1.2 D</w:t>
-      </w:r>
-      <w:r>
-        <w:rPr>
-          <w:lang w:val="en-US"/>
-        </w:rPr>
-        <w:t xml:space="preserve">ata </w:t>
-      </w:r>
-      <w:r>
-        <w:rPr>
-          <w:lang w:val="en-US"/>
-        </w:rPr>
-        <w:t>C</w:t>
-      </w:r>
-      <w:r>
-        <w:rPr>
-          <w:lang w:val="en-US"/>
-        </w:rPr>
-        <w:t xml:space="preserve">ollection of </w:t>
-      </w:r>
-      <w:r>
-        <w:rPr>
-          <w:lang w:val="en-US"/>
-        </w:rPr>
-        <w:t>news data</w:t>
+        <w:t xml:space="preserve">2.1.2 </w:t>
+      </w:r>
+      <w:r>
+        <w:rPr>
+          <w:lang w:val="en-US"/>
+        </w:rPr>
+        <w:t>Extracting numbers of keywords in news articles</w:t>
       </w:r>
       <w:bookmarkEnd w:id="10"/>
     </w:p>
@@ -11374,6 +11578,24 @@
         </w:rPr>
         <w:t>” (criminal case). The complete list reflects various aspects of corruption discourse in Kazakhstan, including financial crimes, political institutions, enforcement bodies, and legal terminology.</w:t>
       </w:r>
+      <w:r>
+        <w:rPr>
+          <w:lang w:val="en-US"/>
+        </w:rPr>
+        <w:t xml:space="preserve"> </w:t>
+      </w:r>
+      <w:r>
+        <w:rPr>
+          <w:lang w:val="en-US"/>
+        </w:rPr>
+        <w:t>The</w:t>
+      </w:r>
+      <w:r>
+        <w:rPr>
+          <w:lang w:val="en-US"/>
+        </w:rPr>
+        <w:t xml:space="preserve"> complete list of corruption-related keywords used for feature engineering is provided in Appendix A.</w:t>
+      </w:r>
     </w:p>
     <w:p>
       <w:pPr>
@@ -11514,35 +11736,7 @@
               <w:rFonts w:ascii="Cambria Math" w:hAnsi="Cambria Math"/>
               <w:lang w:val="en-US"/>
             </w:rPr>
-            <m:t>P(l</m:t>
-          </m:r>
-          <m:r>
-            <w:rPr>
-              <w:rFonts w:ascii="Cambria Math" w:hAnsi="Cambria Math"/>
-              <w:lang w:val="en-US"/>
-            </w:rPr>
-            <m:t xml:space="preserve"> </m:t>
-          </m:r>
-          <m:r>
-            <w:rPr>
-              <w:rFonts w:ascii="Cambria Math" w:hAnsi="Cambria Math"/>
-              <w:lang w:val="en-US"/>
-            </w:rPr>
-            <m:t>|</m:t>
-          </m:r>
-          <m:r>
-            <w:rPr>
-              <w:rFonts w:ascii="Cambria Math" w:hAnsi="Cambria Math"/>
-              <w:lang w:val="en-US"/>
-            </w:rPr>
-            <m:t xml:space="preserve"> </m:t>
-          </m:r>
-          <m:r>
-            <w:rPr>
-              <w:rFonts w:ascii="Cambria Math" w:hAnsi="Cambria Math"/>
-              <w:lang w:val="en-US"/>
-            </w:rPr>
-            <m:t>w)</m:t>
+            <m:t>P(l | w)</m:t>
           </m:r>
         </m:oMath>
       </m:oMathPara>
@@ -11690,24 +11884,30 @@
         </w:rPr>
         <w:t xml:space="preserve"> </w:t>
       </w:r>
-      <w:r>
-        <w:rPr>
-          <w:lang w:val="en-US"/>
-        </w:rPr>
-        <w:t xml:space="preserve">Example of some words </w:t>
-      </w:r>
       <w:proofErr w:type="gramStart"/>
       <w:r>
         <w:rPr>
           <w:lang w:val="en-US"/>
         </w:rPr>
-        <w:t>is</w:t>
+        <w:t>Example</w:t>
       </w:r>
       <w:proofErr w:type="gramEnd"/>
       <w:r>
         <w:rPr>
           <w:lang w:val="en-US"/>
         </w:rPr>
+        <w:t xml:space="preserve"> of some words </w:t>
+      </w:r>
+      <w:r>
+        <w:rPr>
+          <w:lang w:val="en-US"/>
+        </w:rPr>
+        <w:t>are</w:t>
+      </w:r>
+      <w:r>
+        <w:rPr>
+          <w:lang w:val="en-US"/>
+        </w:rPr>
         <w:t xml:space="preserve"> shown in Table 5.</w:t>
       </w:r>
     </w:p>
@@ -11738,13 +11938,7 @@
         <w:rPr>
           <w:lang w:val="en-US"/>
         </w:rPr>
-        <w:t>Table 5</w:t>
-      </w:r>
-      <w:r>
-        <w:rPr>
-          <w:lang w:val="en-US"/>
-        </w:rPr>
-        <w:t xml:space="preserve"> Lemma example</w:t>
+        <w:t>Table 5 Lemma example</w:t>
       </w:r>
     </w:p>
     <w:tbl>
@@ -12075,7 +12269,14 @@
         <w:rPr>
           <w:lang w:val="en-US"/>
         </w:rPr>
-        <w:t>]. This process ensures that variations in word endings and grammatical forms do not lead to undercounting of keyword occurrences.</w:t>
+        <w:t xml:space="preserve">]. This </w:t>
+      </w:r>
+      <w:r>
+        <w:rPr>
+          <w:lang w:val="en-US"/>
+        </w:rPr>
+        <w:lastRenderedPageBreak/>
+        <w:t>process ensures that variations in word endings and grammatical forms do not lead to undercounting of keyword occurrences.</w:t>
       </w:r>
     </w:p>
     <w:p>
@@ -12085,6 +12286,40 @@
           <w:lang w:val="en-US"/>
         </w:rPr>
       </w:pPr>
+      <w:r>
+        <w:rPr>
+          <w:lang w:val="en-US"/>
+        </w:rPr>
+        <w:t>The script utilizes the pymorphy3 library to lemmatize each word in the article, ensuring that all morphological forms of the keywords are captured accurately. For instance, the word “</w:t>
+      </w:r>
+      <w:proofErr w:type="spellStart"/>
+      <w:r>
+        <w:rPr>
+          <w:lang w:val="en-US"/>
+        </w:rPr>
+        <w:t>взятки</w:t>
+      </w:r>
+      <w:proofErr w:type="spellEnd"/>
+      <w:r>
+        <w:rPr>
+          <w:lang w:val="en-US"/>
+        </w:rPr>
+        <w:t>” (plural, genitive case) will be mapped to its base form “</w:t>
+      </w:r>
+      <w:proofErr w:type="spellStart"/>
+      <w:r>
+        <w:rPr>
+          <w:lang w:val="en-US"/>
+        </w:rPr>
+        <w:t>взятка</w:t>
+      </w:r>
+      <w:proofErr w:type="spellEnd"/>
+      <w:r>
+        <w:rPr>
+          <w:lang w:val="en-US"/>
+        </w:rPr>
+        <w:t>.” Additionally, the script handles both single-word and multi-word expressions, counting each of their occurrences in the article's text.</w:t>
+      </w:r>
     </w:p>
     <w:p>
       <w:pPr>
@@ -12097,36 +12332,19 @@
         <w:rPr>
           <w:lang w:val="en-US"/>
         </w:rPr>
-        <w:lastRenderedPageBreak/>
-        <w:t>The script utilizes the pymorphy3 library to lemmatize each word in the article, ensuring that all morphological forms of the keywords are captured accurately. For instance, the word “</w:t>
-      </w:r>
-      <w:proofErr w:type="spellStart"/>
-      <w:r>
-        <w:rPr>
-          <w:lang w:val="en-US"/>
-        </w:rPr>
-        <w:t>взятки</w:t>
-      </w:r>
-      <w:proofErr w:type="spellEnd"/>
-      <w:r>
-        <w:rPr>
-          <w:lang w:val="en-US"/>
-        </w:rPr>
-        <w:t>” (plural, genitive case) will be mapped to its base form “</w:t>
-      </w:r>
-      <w:proofErr w:type="spellStart"/>
-      <w:r>
-        <w:rPr>
-          <w:lang w:val="en-US"/>
-        </w:rPr>
-        <w:t>взятка</w:t>
-      </w:r>
-      <w:proofErr w:type="spellEnd"/>
-      <w:r>
-        <w:rPr>
-          <w:lang w:val="en-US"/>
-        </w:rPr>
-        <w:t>.” Additionally, the script handles both single-word and multi-word expressions, counting each of their occurrences in the article's text.</w:t>
+        <w:t xml:space="preserve">The keyword frequencies are computed for every news article in the dataset and stored along with the article's date in a new structured CSV file. An example of the output is shown in Table </w:t>
+      </w:r>
+      <w:r>
+        <w:rPr>
+          <w:lang w:val="en-US"/>
+        </w:rPr>
+        <w:t>6</w:t>
+      </w:r>
+      <w:r>
+        <w:rPr>
+          <w:lang w:val="en-US"/>
+        </w:rPr>
+        <w:t>.</w:t>
       </w:r>
     </w:p>
     <w:p>
@@ -12136,11 +12354,27 @@
           <w:lang w:val="en-US"/>
         </w:rPr>
       </w:pPr>
-      <w:r>
-        <w:rPr>
-          <w:lang w:val="en-US"/>
-        </w:rPr>
-        <w:t xml:space="preserve">The keyword frequencies are computed for every news article in the dataset and stored along with the article's date in a new structured CSV file. An example of the output is shown in Table </w:t>
+    </w:p>
+    <w:p>
+      <w:pPr>
+        <w:ind w:firstLine="708"/>
+        <w:rPr>
+          <w:lang w:val="en-US"/>
+        </w:rPr>
+      </w:pPr>
+    </w:p>
+    <w:p>
+      <w:pPr>
+        <w:ind w:firstLine="708"/>
+        <w:rPr>
+          <w:lang w:val="en-US"/>
+        </w:rPr>
+      </w:pPr>
+      <w:r>
+        <w:rPr>
+          <w:lang w:val="en-US"/>
+        </w:rPr>
+        <w:t xml:space="preserve">Table </w:t>
       </w:r>
       <w:r>
         <w:rPr>
@@ -12152,49 +12386,43 @@
         <w:rPr>
           <w:lang w:val="en-US"/>
         </w:rPr>
-        <w:t>.</w:t>
-      </w:r>
-    </w:p>
-    <w:p>
-      <w:pPr>
-        <w:ind w:firstLine="708"/>
-        <w:rPr>
-          <w:lang w:val="en-US"/>
-        </w:rPr>
-      </w:pPr>
-    </w:p>
-    <w:p>
-      <w:pPr>
-        <w:ind w:firstLine="708"/>
-        <w:rPr>
-          <w:lang w:val="en-US"/>
-        </w:rPr>
-      </w:pPr>
-    </w:p>
-    <w:p>
-      <w:pPr>
-        <w:ind w:firstLine="708"/>
-        <w:rPr>
-          <w:lang w:val="en-US"/>
-        </w:rPr>
-      </w:pPr>
-      <w:r>
-        <w:rPr>
-          <w:lang w:val="en-US"/>
-        </w:rPr>
-        <w:t xml:space="preserve">Table </w:t>
-      </w:r>
-      <w:r>
-        <w:rPr>
-          <w:lang w:val="en-US"/>
-        </w:rPr>
-        <w:t>6</w:t>
-      </w:r>
-      <w:r>
-        <w:rPr>
-          <w:lang w:val="en-US"/>
-        </w:rPr>
-        <w:t xml:space="preserve"> – Sample of processed news articles with keyword counts</w:t>
+        <w:t xml:space="preserve"> – Sample of </w:t>
+      </w:r>
+      <w:r>
+        <w:rPr>
+          <w:lang w:val="en-US"/>
+        </w:rPr>
+        <w:t>extracted</w:t>
+      </w:r>
+      <w:r>
+        <w:rPr>
+          <w:lang w:val="en-US"/>
+        </w:rPr>
+        <w:t xml:space="preserve"> </w:t>
+      </w:r>
+      <w:r>
+        <w:rPr>
+          <w:lang w:val="en-US"/>
+        </w:rPr>
+        <w:t xml:space="preserve">keyword counts </w:t>
+      </w:r>
+      <w:r>
+        <w:rPr>
+          <w:lang w:val="en-US"/>
+        </w:rPr>
+        <w:t xml:space="preserve"> </w:t>
+      </w:r>
+      <w:r>
+        <w:rPr>
+          <w:lang w:val="en-US"/>
+        </w:rPr>
+        <w:t xml:space="preserve">from </w:t>
+      </w:r>
+      <w:r>
+        <w:rPr>
+          <w:lang w:val="en-US"/>
+        </w:rPr>
+        <w:t>news articles</w:t>
       </w:r>
     </w:p>
     <w:tbl>
@@ -12983,43 +13211,47 @@
         <w:rPr>
           <w:lang w:val="en-US"/>
         </w:rPr>
-        <w:t>, we described the process of collecting and extracting data used in the research. The study utilizes two primary data sources: official monthly crime reports from the Qamqor.gov.kz portal and news articles from Tengrinews.kz tagged with corruption. We developed custom Python scripts to automate the download and parsing of Excel-based crime statistics, focusing specifically on the total number of corruption crimes per month. Similarly, we scraped news articles within a defined time range</w:t>
-      </w:r>
-      <w:r>
-        <w:rPr>
-          <w:lang w:val="en-US"/>
-        </w:rPr>
-        <w:t>(November of 2016 till January of 2025)</w:t>
-      </w:r>
-      <w:r>
-        <w:rPr>
-          <w:lang w:val="en-US"/>
-        </w:rPr>
-        <w:t>, extracted their full text</w:t>
-      </w:r>
-      <w:r>
-        <w:rPr>
-          <w:lang w:val="en-US"/>
-        </w:rPr>
-        <w:t xml:space="preserve">. Next step is to </w:t>
-      </w:r>
-      <w:r>
-        <w:rPr>
-          <w:lang w:val="en-US"/>
-        </w:rPr>
-        <w:t>preprocess</w:t>
-      </w:r>
-      <w:r>
-        <w:rPr>
-          <w:lang w:val="en-US"/>
-        </w:rPr>
-        <w:t xml:space="preserve"> </w:t>
-      </w:r>
-      <w:r>
-        <w:rPr>
-          <w:lang w:val="en-US"/>
-        </w:rPr>
-        <w:t>them for analysis.</w:t>
+        <w:t xml:space="preserve"> we</w:t>
+      </w:r>
+      <w:r>
+        <w:rPr>
+          <w:lang w:val="en-US"/>
+        </w:rPr>
+        <w:t xml:space="preserve"> presented the complete pipeline for collecting and preparing the data used in this study. The research relies on two primary data sources:</w:t>
+      </w:r>
+    </w:p>
+    <w:p>
+      <w:pPr>
+        <w:numPr>
+          <w:ilvl w:val="0"/>
+          <w:numId w:val="9"/>
+        </w:numPr>
+        <w:rPr>
+          <w:lang w:val="en-US"/>
+        </w:rPr>
+      </w:pPr>
+      <w:r>
+        <w:rPr>
+          <w:lang w:val="en-US"/>
+        </w:rPr>
+        <w:t>official monthly reports on corruption crimes from the Qamqor.gov.kz portal, and</w:t>
+      </w:r>
+    </w:p>
+    <w:p>
+      <w:pPr>
+        <w:numPr>
+          <w:ilvl w:val="0"/>
+          <w:numId w:val="9"/>
+        </w:numPr>
+        <w:rPr>
+          <w:lang w:val="en-US"/>
+        </w:rPr>
+      </w:pPr>
+      <w:r>
+        <w:rPr>
+          <w:lang w:val="en-US"/>
+        </w:rPr>
+        <w:t>news articles from Tengrinews.kz, specifically those tagged with the term "corruption."</w:t>
       </w:r>
     </w:p>
     <w:p>
@@ -13033,7 +13265,7 @@
         <w:rPr>
           <w:lang w:val="en-US"/>
         </w:rPr>
-        <w:t>To quantify media attention, we compiled a list of corruption-related keywords and applied lemmatization techniques to match all morphological variants. This allowed us to count keyword occurrences in each article and aggregate them monthly. The result is a structured dataset that aligns news data with crime statistics, ready for further analysis and modeling in the subsequent sections.</w:t>
+        <w:t>To collect the crime statistics, we developed a custom Python script that automates the download of Excel reports. From each report, the total number of corruption crimes per month was extracted and compiled into a continuous time series. This monthly crime count serves as the target variable in our analysis, which we aim to predict.</w:t>
       </w:r>
     </w:p>
     <w:p>
@@ -13043,6 +13275,47 @@
           <w:lang w:val="en-US"/>
         </w:rPr>
       </w:pPr>
+      <w:r>
+        <w:rPr>
+          <w:lang w:val="en-US"/>
+        </w:rPr>
+        <w:t>For feature generation, we hypothesized that media coverage may reflect or even influence trends in corruption crime statistics. To test this, we scraped over 2,000 corruption-related news articles from Tengrinews.kz within a time frame from November 2016 to January 2025. A second Python script was used to extract the full text and publication date of each article.</w:t>
+      </w:r>
+    </w:p>
+    <w:p>
+      <w:pPr>
+        <w:ind w:firstLine="708"/>
+        <w:rPr>
+          <w:lang w:val="en-US"/>
+        </w:rPr>
+      </w:pPr>
+      <w:r>
+        <w:rPr>
+          <w:lang w:val="en-US"/>
+        </w:rPr>
+        <w:t>To quantify media attention, we compiled an extensive list of corruption-related keywords. These keywords were lemmatized using natural language processing techniques to capture all relevant morphological forms. We then computed the frequency of keyword mentions in each article and aggregated them by month.</w:t>
+      </w:r>
+    </w:p>
+    <w:p>
+      <w:pPr>
+        <w:ind w:firstLine="708"/>
+        <w:rPr>
+          <w:lang w:val="en-US"/>
+        </w:rPr>
+      </w:pPr>
+      <w:r>
+        <w:rPr>
+          <w:lang w:val="en-US"/>
+        </w:rPr>
+        <w:lastRenderedPageBreak/>
+        <w:t xml:space="preserve">The outcome of this process is a unified dataset that aligns keyword frequencies from the media with official corruption crime statistics. </w:t>
+      </w:r>
+      <w:r>
+        <w:rPr>
+          <w:lang w:val="en-US"/>
+        </w:rPr>
+        <w:t>Subsequently, in the Data Preprocessing stage, the dataset is grouped by month, features with a high proportion of missing values are removed, remaining missing values are imputed, relevant features are aggregated, and the resulting feature matrix is combined with the target variable for further analysis.</w:t>
+      </w:r>
     </w:p>
     <w:p>
       <w:pPr>
@@ -13051,7 +13324,7 @@
           <w:lang w:val="en-US"/>
         </w:rPr>
       </w:pPr>
-      <w:bookmarkStart w:id="11" w:name="_Toc194490947"/>
+      <w:bookmarkStart w:id="11" w:name="_Toc194672597"/>
       <w:r>
         <w:rPr>
           <w:lang w:val="en-US"/>
@@ -13062,11 +13335,570 @@
     </w:p>
     <w:p>
       <w:pPr>
+        <w:pStyle w:val="1"/>
+        <w:rPr>
+          <w:lang w:val="en-US"/>
+        </w:rPr>
+      </w:pPr>
+      <w:bookmarkStart w:id="12" w:name="_Toc194672598"/>
+      <w:r>
+        <w:rPr>
+          <w:lang w:val="en-US"/>
+        </w:rPr>
+        <w:t>2.2</w:t>
+      </w:r>
+      <w:r>
+        <w:rPr>
+          <w:lang w:val="en-US"/>
+        </w:rPr>
+        <w:t>.1</w:t>
+      </w:r>
+      <w:r>
+        <w:rPr>
+          <w:lang w:val="en-US"/>
+        </w:rPr>
+        <w:t xml:space="preserve"> </w:t>
+      </w:r>
+      <w:r>
+        <w:rPr>
+          <w:lang w:val="en-US"/>
+        </w:rPr>
+        <w:t>Corruption crimes numbers p</w:t>
+      </w:r>
+      <w:r>
+        <w:rPr>
+          <w:lang w:val="en-US"/>
+        </w:rPr>
+        <w:t>reprocessing</w:t>
+      </w:r>
+      <w:bookmarkEnd w:id="12"/>
+    </w:p>
+    <w:p>
+      <w:pPr>
+        <w:rPr>
+          <w:lang w:val="en-US"/>
+        </w:rPr>
+      </w:pPr>
+    </w:p>
+    <w:p>
+      <w:pPr>
         <w:ind w:firstLine="708"/>
         <w:rPr>
           <w:lang w:val="en-US"/>
         </w:rPr>
       </w:pPr>
+      <w:r>
+        <w:rPr>
+          <w:lang w:val="en-US"/>
+        </w:rPr>
+        <w:t>During the parsing of official reports from the Qamqor.gov.kz portal, it was observed that some months were missing from the dataset. These omissions likely resulted from the unavailability of reports for specific months on the portal. As a result, the column containing the monthly number of corruption crimes included several missing values (</w:t>
+      </w:r>
+      <w:proofErr w:type="spellStart"/>
+      <w:r>
+        <w:rPr>
+          <w:lang w:val="en-US"/>
+        </w:rPr>
+        <w:t>NaN</w:t>
+      </w:r>
+      <w:proofErr w:type="spellEnd"/>
+      <w:r>
+        <w:rPr>
+          <w:lang w:val="en-US"/>
+        </w:rPr>
+        <w:t>).</w:t>
+      </w:r>
+      <w:r>
+        <w:rPr>
+          <w:lang w:val="en-US"/>
+        </w:rPr>
+        <w:t xml:space="preserve"> </w:t>
+      </w:r>
+      <w:r>
+        <w:rPr>
+          <w:lang w:val="en-US"/>
+        </w:rPr>
+        <w:t>They are shown in Figure 5.</w:t>
+      </w:r>
+    </w:p>
+    <w:p>
+      <w:pPr>
+        <w:ind w:firstLine="708"/>
+        <w:rPr>
+          <w:lang w:val="en-US"/>
+        </w:rPr>
+      </w:pPr>
+    </w:p>
+    <w:p>
+      <w:pPr>
+        <w:ind w:firstLine="708"/>
+        <w:jc w:val="center"/>
+        <w:rPr>
+          <w:lang w:val="en-US"/>
+        </w:rPr>
+      </w:pPr>
+      <w:r>
+        <w:rPr>
+          <w:lang w:val="en-US"/>
+        </w:rPr>
+        <w:drawing>
+          <wp:inline distT="0" distB="0" distL="0" distR="0" wp14:anchorId="03932DC4" wp14:editId="465C20F8">
+            <wp:extent cx="4732424" cy="3367887"/>
+            <wp:effectExtent l="19050" t="19050" r="11430" b="23495"/>
+            <wp:docPr id="1986103284" name="Рисунок 1"/>
+            <wp:cNvGraphicFramePr>
+              <a:graphicFrameLocks xmlns:a="http://schemas.openxmlformats.org/drawingml/2006/main" noChangeAspect="1"/>
+            </wp:cNvGraphicFramePr>
+            <a:graphic xmlns:a="http://schemas.openxmlformats.org/drawingml/2006/main">
+              <a:graphicData uri="http://schemas.openxmlformats.org/drawingml/2006/picture">
+                <pic:pic xmlns:pic="http://schemas.openxmlformats.org/drawingml/2006/picture">
+                  <pic:nvPicPr>
+                    <pic:cNvPr id="1986103284" name=""/>
+                    <pic:cNvPicPr/>
+                  </pic:nvPicPr>
+                  <pic:blipFill>
+                    <a:blip r:embed="rId17"/>
+                    <a:stretch>
+                      <a:fillRect/>
+                    </a:stretch>
+                  </pic:blipFill>
+                  <pic:spPr>
+                    <a:xfrm>
+                      <a:off x="0" y="0"/>
+                      <a:ext cx="4769140" cy="3394017"/>
+                    </a:xfrm>
+                    <a:prstGeom prst="rect">
+                      <a:avLst/>
+                    </a:prstGeom>
+                    <a:ln>
+                      <a:solidFill>
+                        <a:schemeClr val="tx1"/>
+                      </a:solidFill>
+                    </a:ln>
+                  </pic:spPr>
+                </pic:pic>
+              </a:graphicData>
+            </a:graphic>
+          </wp:inline>
+        </w:drawing>
+      </w:r>
+    </w:p>
+    <w:p>
+      <w:pPr>
+        <w:ind w:firstLine="708"/>
+        <w:jc w:val="center"/>
+        <w:rPr>
+          <w:lang w:val="en-US"/>
+        </w:rPr>
+      </w:pPr>
+    </w:p>
+    <w:p>
+      <w:pPr>
+        <w:ind w:firstLine="708"/>
+        <w:jc w:val="center"/>
+        <w:rPr>
+          <w:lang w:val="en-US"/>
+        </w:rPr>
+      </w:pPr>
+      <w:r>
+        <w:rPr>
+          <w:lang w:val="en-US"/>
+        </w:rPr>
+        <w:t xml:space="preserve">Figure 5 Corruption crimes numbers from </w:t>
+      </w:r>
+      <w:r>
+        <w:rPr>
+          <w:lang w:val="en-US"/>
+        </w:rPr>
+        <w:t>November 2016 to January 2025</w:t>
+      </w:r>
+      <w:r>
+        <w:rPr>
+          <w:lang w:val="en-US"/>
+        </w:rPr>
+        <w:t xml:space="preserve"> </w:t>
+      </w:r>
+      <w:r>
+        <w:rPr>
+          <w:lang w:val="en-US"/>
+        </w:rPr>
+        <w:t xml:space="preserve">before </w:t>
+      </w:r>
+      <w:r>
+        <w:rPr>
+          <w:lang w:val="en-US"/>
+        </w:rPr>
+        <w:t>preprocessing</w:t>
+      </w:r>
+    </w:p>
+    <w:p>
+      <w:pPr>
+        <w:ind w:firstLine="708"/>
+        <w:jc w:val="center"/>
+        <w:rPr>
+          <w:lang w:val="en-US"/>
+        </w:rPr>
+      </w:pPr>
+    </w:p>
+    <w:p>
+      <w:pPr>
+        <w:ind w:firstLine="708"/>
+        <w:rPr>
+          <w:lang w:val="en-US"/>
+        </w:rPr>
+      </w:pPr>
+      <w:r>
+        <w:rPr>
+          <w:lang w:val="en-US"/>
+        </w:rPr>
+        <w:t>To ensure the continuity of the time series and maintain consistency for downstream modeling, a linear interpolation method was applied to estimate the missing values. This approach assumes that the changes between known monthly values follow a linear trend, which is reasonable given the relatively stable nature of monthly reporting.</w:t>
+      </w:r>
+    </w:p>
+    <w:p>
+      <w:pPr>
+        <w:ind w:firstLine="708"/>
+        <w:rPr>
+          <w:lang w:val="en-US"/>
+        </w:rPr>
+      </w:pPr>
+      <w:r>
+        <w:rPr>
+          <w:lang w:val="en-US"/>
+        </w:rPr>
+        <w:lastRenderedPageBreak/>
+        <w:t>After interpolation, all values were rounded to the nearest whole number using a custom rounding rule: if the fractional part was greater than or equal to 0.5, the value was rounded up; otherwise, it was rounded down. This ensured that the interpolated values remained consistent with the integer format of crime counts.</w:t>
+      </w:r>
+      <w:r>
+        <w:rPr>
+          <w:lang w:val="en-US"/>
+        </w:rPr>
+        <w:t xml:space="preserve"> </w:t>
+      </w:r>
+      <w:r>
+        <w:rPr>
+          <w:lang w:val="en-US"/>
+        </w:rPr>
+        <w:t xml:space="preserve">The </w:t>
+      </w:r>
+      <w:r>
+        <w:rPr>
+          <w:lang w:val="en-US"/>
+        </w:rPr>
+        <w:t>following</w:t>
+      </w:r>
+      <w:r>
+        <w:rPr>
+          <w:lang w:val="en-US"/>
+        </w:rPr>
+        <w:t xml:space="preserve"> snippet </w:t>
+      </w:r>
+      <w:r>
+        <w:rPr>
+          <w:lang w:val="en-US"/>
+        </w:rPr>
+        <w:t xml:space="preserve">in Figure 6 </w:t>
+      </w:r>
+      <w:r>
+        <w:rPr>
+          <w:lang w:val="en-US"/>
+        </w:rPr>
+        <w:t>demonstrates the implementation of this procedure</w:t>
+      </w:r>
+      <w:r>
+        <w:rPr>
+          <w:lang w:val="en-US"/>
+        </w:rPr>
+        <w:t>.</w:t>
+      </w:r>
+    </w:p>
+    <w:p>
+      <w:pPr>
+        <w:ind w:firstLine="708"/>
+        <w:rPr>
+          <w:lang w:val="en-US"/>
+        </w:rPr>
+      </w:pPr>
+    </w:p>
+    <w:p>
+      <w:pPr>
+        <w:ind w:firstLine="708"/>
+        <w:jc w:val="center"/>
+        <w:rPr>
+          <w:lang w:val="en-US"/>
+        </w:rPr>
+      </w:pPr>
+      <w:r>
+        <w:rPr>
+          <w:lang w:val="en-US"/>
+        </w:rPr>
+        <w:drawing>
+          <wp:inline distT="0" distB="0" distL="0" distR="0" wp14:anchorId="5E537BC7" wp14:editId="4F0A611F">
+            <wp:extent cx="5380658" cy="467276"/>
+            <wp:effectExtent l="19050" t="19050" r="10795" b="28575"/>
+            <wp:docPr id="1986883011" name="Рисунок 1"/>
+            <wp:cNvGraphicFramePr>
+              <a:graphicFrameLocks xmlns:a="http://schemas.openxmlformats.org/drawingml/2006/main" noChangeAspect="1"/>
+            </wp:cNvGraphicFramePr>
+            <a:graphic xmlns:a="http://schemas.openxmlformats.org/drawingml/2006/main">
+              <a:graphicData uri="http://schemas.openxmlformats.org/drawingml/2006/picture">
+                <pic:pic xmlns:pic="http://schemas.openxmlformats.org/drawingml/2006/picture">
+                  <pic:nvPicPr>
+                    <pic:cNvPr id="1986883011" name=""/>
+                    <pic:cNvPicPr/>
+                  </pic:nvPicPr>
+                  <pic:blipFill>
+                    <a:blip r:embed="rId18"/>
+                    <a:stretch>
+                      <a:fillRect/>
+                    </a:stretch>
+                  </pic:blipFill>
+                  <pic:spPr>
+                    <a:xfrm>
+                      <a:off x="0" y="0"/>
+                      <a:ext cx="5496162" cy="477307"/>
+                    </a:xfrm>
+                    <a:prstGeom prst="rect">
+                      <a:avLst/>
+                    </a:prstGeom>
+                    <a:ln>
+                      <a:solidFill>
+                        <a:schemeClr val="tx1"/>
+                      </a:solidFill>
+                    </a:ln>
+                  </pic:spPr>
+                </pic:pic>
+              </a:graphicData>
+            </a:graphic>
+          </wp:inline>
+        </w:drawing>
+      </w:r>
+    </w:p>
+    <w:p>
+      <w:pPr>
+        <w:ind w:firstLine="708"/>
+        <w:rPr>
+          <w:lang w:val="en-US"/>
+        </w:rPr>
+      </w:pPr>
+    </w:p>
+    <w:p>
+      <w:pPr>
+        <w:ind w:firstLine="708"/>
+        <w:jc w:val="center"/>
+      </w:pPr>
+      <w:r>
+        <w:rPr>
+          <w:lang w:val="en-US"/>
+        </w:rPr>
+        <w:t xml:space="preserve">Figure 6 Preprocessing missing values by </w:t>
+      </w:r>
+      <w:r>
+        <w:rPr>
+          <w:lang w:val="en-US"/>
+        </w:rPr>
+        <w:t>Linear Interpolation and Rounding of Missing Crime Data</w:t>
+      </w:r>
+    </w:p>
+    <w:p>
+      <w:pPr>
+        <w:ind w:firstLine="708"/>
+        <w:jc w:val="center"/>
+      </w:pPr>
+    </w:p>
+    <w:p>
+      <w:pPr>
+        <w:ind w:firstLine="708"/>
+        <w:rPr>
+          <w:lang w:val="en-US"/>
+        </w:rPr>
+      </w:pPr>
+      <w:r>
+        <w:rPr>
+          <w:lang w:val="en-US"/>
+        </w:rPr>
+        <w:t>The interpolation and rounding steps were implemented in a single line to ensure efficiency and reproducibility of results. This approach maintained the numerical integrity of the dataset while preventing potential biases that could arise from more arbitrary imputation methods.</w:t>
+      </w:r>
+      <w:r>
+        <w:rPr>
+          <w:lang w:val="en-US"/>
+        </w:rPr>
+        <w:t xml:space="preserve"> </w:t>
+      </w:r>
+      <w:r>
+        <w:rPr>
+          <w:lang w:val="en-US"/>
+        </w:rPr>
+        <w:t>F</w:t>
+      </w:r>
+      <w:r>
+        <w:rPr>
+          <w:lang w:val="en-US"/>
+        </w:rPr>
+        <w:t>igure 7 shows the time series of monthly corruption crimes after preprocessing.</w:t>
+      </w:r>
+    </w:p>
+    <w:p>
+      <w:pPr>
+        <w:ind w:firstLine="708"/>
+        <w:rPr>
+          <w:lang w:val="en-US"/>
+        </w:rPr>
+      </w:pPr>
+    </w:p>
+    <w:p>
+      <w:pPr>
+        <w:ind w:firstLine="708"/>
+        <w:jc w:val="center"/>
+        <w:rPr>
+          <w:lang w:val="en-US"/>
+        </w:rPr>
+      </w:pPr>
+      <w:r>
+        <w:rPr>
+          <w:lang w:val="en-US"/>
+        </w:rPr>
+        <w:drawing>
+          <wp:inline distT="0" distB="0" distL="0" distR="0" wp14:anchorId="5BC2EA74" wp14:editId="0E1B70C5">
+            <wp:extent cx="4729515" cy="3366000"/>
+            <wp:effectExtent l="19050" t="19050" r="13970" b="25400"/>
+            <wp:docPr id="353852350" name="Рисунок 1"/>
+            <wp:cNvGraphicFramePr>
+              <a:graphicFrameLocks xmlns:a="http://schemas.openxmlformats.org/drawingml/2006/main" noChangeAspect="1"/>
+            </wp:cNvGraphicFramePr>
+            <a:graphic xmlns:a="http://schemas.openxmlformats.org/drawingml/2006/main">
+              <a:graphicData uri="http://schemas.openxmlformats.org/drawingml/2006/picture">
+                <pic:pic xmlns:pic="http://schemas.openxmlformats.org/drawingml/2006/picture">
+                  <pic:nvPicPr>
+                    <pic:cNvPr id="353852350" name="Рисунок 1"/>
+                    <pic:cNvPicPr/>
+                  </pic:nvPicPr>
+                  <pic:blipFill>
+                    <a:blip r:embed="rId19">
+                      <a:extLst>
+                        <a:ext uri="{28A0092B-C50C-407E-A947-70E740481C1C}">
+                          <a14:useLocalDpi xmlns:a14="http://schemas.microsoft.com/office/drawing/2010/main" val="0"/>
+                        </a:ext>
+                      </a:extLst>
+                    </a:blip>
+                    <a:stretch>
+                      <a:fillRect/>
+                    </a:stretch>
+                  </pic:blipFill>
+                  <pic:spPr>
+                    <a:xfrm>
+                      <a:off x="0" y="0"/>
+                      <a:ext cx="4729515" cy="3366000"/>
+                    </a:xfrm>
+                    <a:prstGeom prst="rect">
+                      <a:avLst/>
+                    </a:prstGeom>
+                    <a:ln>
+                      <a:solidFill>
+                        <a:schemeClr val="tx1"/>
+                      </a:solidFill>
+                    </a:ln>
+                  </pic:spPr>
+                </pic:pic>
+              </a:graphicData>
+            </a:graphic>
+          </wp:inline>
+        </w:drawing>
+      </w:r>
+    </w:p>
+    <w:p>
+      <w:pPr>
+        <w:ind w:firstLine="708"/>
+        <w:jc w:val="center"/>
+        <w:rPr>
+          <w:lang w:val="en-US"/>
+        </w:rPr>
+      </w:pPr>
+    </w:p>
+    <w:p>
+      <w:pPr>
+        <w:ind w:firstLine="708"/>
+        <w:jc w:val="center"/>
+        <w:rPr>
+          <w:lang w:val="en-US"/>
+        </w:rPr>
+      </w:pPr>
+      <w:r>
+        <w:rPr>
+          <w:lang w:val="en-US"/>
+        </w:rPr>
+        <w:t xml:space="preserve">Figure </w:t>
+      </w:r>
+      <w:r>
+        <w:rPr>
+          <w:lang w:val="en-US"/>
+        </w:rPr>
+        <w:t>7</w:t>
+      </w:r>
+      <w:r>
+        <w:rPr>
+          <w:lang w:val="en-US"/>
+        </w:rPr>
+        <w:t xml:space="preserve"> Corruption crimes numbers from </w:t>
+      </w:r>
+      <w:r>
+        <w:rPr>
+          <w:lang w:val="en-US"/>
+        </w:rPr>
+        <w:t>November 2016 to January 2025</w:t>
+      </w:r>
+      <w:r>
+        <w:rPr>
+          <w:lang w:val="en-US"/>
+        </w:rPr>
+        <w:t xml:space="preserve"> after preprocessing</w:t>
+      </w:r>
+    </w:p>
+    <w:p>
+      <w:pPr>
+        <w:ind w:firstLine="708"/>
+        <w:jc w:val="center"/>
+        <w:rPr>
+          <w:lang w:val="en-US"/>
+        </w:rPr>
+      </w:pPr>
+    </w:p>
+    <w:p>
+      <w:pPr>
+        <w:ind w:firstLine="708"/>
+      </w:pPr>
+      <w:r>
+        <w:rPr>
+          <w:lang w:val="en-US"/>
+        </w:rPr>
+        <w:t>T</w:t>
+      </w:r>
+      <w:r>
+        <w:rPr>
+          <w:lang w:val="en-US"/>
+        </w:rPr>
+        <w:t xml:space="preserve">he previously missing values were smoothly filled based on surrounding data, resulting in a complete dataset without abrupt jumps or inconsistencies. This </w:t>
+      </w:r>
+      <w:proofErr w:type="gramStart"/>
+      <w:r>
+        <w:rPr>
+          <w:lang w:val="en-US"/>
+        </w:rPr>
+        <w:t>cleaned</w:t>
+      </w:r>
+      <w:proofErr w:type="gramEnd"/>
+      <w:r>
+        <w:rPr>
+          <w:lang w:val="en-US"/>
+        </w:rPr>
+        <w:t xml:space="preserve"> and interpolated data is now ready to be integrated with keyword frequencies from the news dataset and used in subsequent modeling tasks.</w:t>
+      </w:r>
+    </w:p>
+    <w:p>
+      <w:pPr>
+        <w:ind w:firstLine="708"/>
+        <w:rPr>
+          <w:lang w:val="en-US"/>
+        </w:rPr>
+      </w:pPr>
     </w:p>
     <w:p>
       <w:pPr>
@@ -13075,14 +13907,57 @@
           <w:lang w:val="en-US"/>
         </w:rPr>
       </w:pPr>
-      <w:bookmarkStart w:id="12" w:name="_Toc194490948"/>
-      <w:r>
-        <w:rPr>
-          <w:lang w:val="en-US"/>
-        </w:rPr>
-        <w:t>2.3 Regression models</w:t>
-      </w:r>
-      <w:bookmarkEnd w:id="12"/>
+      <w:bookmarkStart w:id="13" w:name="_Toc194672599"/>
+      <w:r>
+        <w:rPr>
+          <w:lang w:val="en-US"/>
+        </w:rPr>
+        <w:lastRenderedPageBreak/>
+        <w:t>2.2</w:t>
+      </w:r>
+      <w:r>
+        <w:rPr>
+          <w:lang w:val="en-US"/>
+        </w:rPr>
+        <w:t>.2</w:t>
+      </w:r>
+      <w:r>
+        <w:rPr>
+          <w:lang w:val="en-US"/>
+        </w:rPr>
+        <w:t xml:space="preserve"> </w:t>
+      </w:r>
+      <w:r>
+        <w:rPr>
+          <w:lang w:val="en-US"/>
+        </w:rPr>
+        <w:t>N</w:t>
+      </w:r>
+      <w:r>
+        <w:rPr>
+          <w:lang w:val="en-US"/>
+        </w:rPr>
+        <w:t>ews data</w:t>
+      </w:r>
+      <w:r>
+        <w:rPr>
+          <w:lang w:val="en-US"/>
+        </w:rPr>
+        <w:t xml:space="preserve"> </w:t>
+      </w:r>
+      <w:r>
+        <w:rPr>
+          <w:lang w:val="en-US"/>
+        </w:rPr>
+        <w:t>p</w:t>
+      </w:r>
+      <w:r>
+        <w:rPr>
+          <w:lang w:val="en-US"/>
+        </w:rPr>
+        <w:t>reprocessing</w:t>
+      </w:r>
+      <w:bookmarkEnd w:id="13"/>
     </w:p>
     <w:p>
       <w:pPr>
@@ -13091,6 +13966,916 @@
           <w:lang w:val="en-US"/>
         </w:rPr>
       </w:pPr>
+      <w:r>
+        <w:rPr>
+          <w:lang w:val="en-US"/>
+        </w:rPr>
+        <w:t xml:space="preserve">Next, we preprocess the news data. </w:t>
+      </w:r>
+      <w:r>
+        <w:rPr>
+          <w:lang w:val="en-US"/>
+        </w:rPr>
+        <w:t>The raw news data consisted of individual articles and their corresponding publication dates, along with keyword frequencies extracted from each article. To align this dataset with the monthly corruption crime statistics and make it suitable for time series modeling, several preprocessing steps were applied.</w:t>
+      </w:r>
+    </w:p>
+    <w:p>
+      <w:pPr>
+        <w:ind w:firstLine="708"/>
+        <w:rPr>
+          <w:lang w:val="en-US"/>
+        </w:rPr>
+      </w:pPr>
+      <w:r>
+        <w:rPr>
+          <w:lang w:val="en-US"/>
+        </w:rPr>
+        <w:t xml:space="preserve">First, the “Date” column was converted into a datetime format to ensure consistency and allow for resampling operations. The date was then set as the index of the </w:t>
+      </w:r>
+      <w:proofErr w:type="spellStart"/>
+      <w:r>
+        <w:rPr>
+          <w:lang w:val="en-US"/>
+        </w:rPr>
+        <w:t>dataframe</w:t>
+      </w:r>
+      <w:proofErr w:type="spellEnd"/>
+      <w:r>
+        <w:rPr>
+          <w:lang w:val="en-US"/>
+        </w:rPr>
+        <w:t xml:space="preserve">. This allowed the aggregation of keyword frequencies </w:t>
+      </w:r>
+      <w:r>
+        <w:rPr>
+          <w:lang w:val="en-US"/>
+        </w:rPr>
+        <w:t>monthly</w:t>
+      </w:r>
+      <w:r>
+        <w:rPr>
+          <w:lang w:val="en-US"/>
+        </w:rPr>
+        <w:t xml:space="preserve"> using the .resample('ME').sum() method, where 'ME' stands for month-end resampling. </w:t>
+      </w:r>
+      <w:r>
+        <w:rPr>
+          <w:lang w:val="en-US"/>
+        </w:rPr>
+        <w:t>The preprocessing code is shown in Figure 8.</w:t>
+      </w:r>
+    </w:p>
+    <w:p>
+      <w:pPr>
+        <w:ind w:firstLine="708"/>
+        <w:rPr>
+          <w:lang w:val="en-US"/>
+        </w:rPr>
+      </w:pPr>
+    </w:p>
+    <w:p>
+      <w:pPr>
+        <w:ind w:firstLine="708"/>
+        <w:jc w:val="center"/>
+        <w:rPr>
+          <w:lang w:val="en-US"/>
+        </w:rPr>
+      </w:pPr>
+      <w:r>
+        <w:rPr>
+          <w:lang w:val="en-US"/>
+        </w:rPr>
+        <w:drawing>
+          <wp:inline distT="0" distB="0" distL="0" distR="0" wp14:anchorId="76B4E810" wp14:editId="259CA6E6">
+            <wp:extent cx="4729515" cy="2595734"/>
+            <wp:effectExtent l="19050" t="19050" r="13970" b="14605"/>
+            <wp:docPr id="2051984815" name="Рисунок 1"/>
+            <wp:cNvGraphicFramePr>
+              <a:graphicFrameLocks xmlns:a="http://schemas.openxmlformats.org/drawingml/2006/main" noChangeAspect="1"/>
+            </wp:cNvGraphicFramePr>
+            <a:graphic xmlns:a="http://schemas.openxmlformats.org/drawingml/2006/main">
+              <a:graphicData uri="http://schemas.openxmlformats.org/drawingml/2006/picture">
+                <pic:pic xmlns:pic="http://schemas.openxmlformats.org/drawingml/2006/picture">
+                  <pic:nvPicPr>
+                    <pic:cNvPr id="2051984815" name="Рисунок 1"/>
+                    <pic:cNvPicPr/>
+                  </pic:nvPicPr>
+                  <pic:blipFill>
+                    <a:blip r:embed="rId20">
+                      <a:extLst>
+                        <a:ext uri="{28A0092B-C50C-407E-A947-70E740481C1C}">
+                          <a14:useLocalDpi xmlns:a14="http://schemas.microsoft.com/office/drawing/2010/main" val="0"/>
+                        </a:ext>
+                      </a:extLst>
+                    </a:blip>
+                    <a:stretch>
+                      <a:fillRect/>
+                    </a:stretch>
+                  </pic:blipFill>
+                  <pic:spPr>
+                    <a:xfrm>
+                      <a:off x="0" y="0"/>
+                      <a:ext cx="4729515" cy="2595734"/>
+                    </a:xfrm>
+                    <a:prstGeom prst="rect">
+                      <a:avLst/>
+                    </a:prstGeom>
+                    <a:ln>
+                      <a:solidFill>
+                        <a:schemeClr val="tx1"/>
+                      </a:solidFill>
+                    </a:ln>
+                  </pic:spPr>
+                </pic:pic>
+              </a:graphicData>
+            </a:graphic>
+          </wp:inline>
+        </w:drawing>
+      </w:r>
+    </w:p>
+    <w:p>
+      <w:pPr>
+        <w:ind w:firstLine="708"/>
+        <w:jc w:val="center"/>
+        <w:rPr>
+          <w:lang w:val="en-US"/>
+        </w:rPr>
+      </w:pPr>
+    </w:p>
+    <w:p>
+      <w:pPr>
+        <w:ind w:firstLine="708"/>
+        <w:jc w:val="center"/>
+        <w:rPr>
+          <w:lang w:val="en-US"/>
+        </w:rPr>
+      </w:pPr>
+      <w:r>
+        <w:rPr>
+          <w:lang w:val="en-US"/>
+        </w:rPr>
+        <w:t xml:space="preserve">Figure </w:t>
+      </w:r>
+      <w:r>
+        <w:rPr>
+          <w:lang w:val="en-US"/>
+        </w:rPr>
+        <w:t>8</w:t>
+      </w:r>
+      <w:r>
+        <w:rPr>
+          <w:lang w:val="en-US"/>
+        </w:rPr>
+        <w:t xml:space="preserve"> </w:t>
+      </w:r>
+      <w:r>
+        <w:rPr>
+          <w:lang w:val="en-US"/>
+        </w:rPr>
+        <w:t>Preprocessing news data by monthly aggregation and feature selection</w:t>
+      </w:r>
+    </w:p>
+    <w:p>
+      <w:pPr>
+        <w:ind w:firstLine="708"/>
+        <w:rPr>
+          <w:lang w:val="en-US"/>
+        </w:rPr>
+      </w:pPr>
+    </w:p>
+    <w:p>
+      <w:pPr>
+        <w:ind w:firstLine="708"/>
+        <w:rPr>
+          <w:lang w:val="en-US"/>
+        </w:rPr>
+      </w:pPr>
+    </w:p>
+    <w:p>
+      <w:pPr>
+        <w:ind w:firstLine="708"/>
+        <w:rPr>
+          <w:lang w:val="en-US"/>
+        </w:rPr>
+      </w:pPr>
+      <w:r>
+        <w:rPr>
+          <w:lang w:val="en-US"/>
+        </w:rPr>
+        <w:t xml:space="preserve">Next, all zero values in the dataset were replaced with </w:t>
+      </w:r>
+      <w:proofErr w:type="spellStart"/>
+      <w:r>
+        <w:rPr>
+          <w:lang w:val="en-US"/>
+        </w:rPr>
+        <w:t>NaN</w:t>
+      </w:r>
+      <w:proofErr w:type="spellEnd"/>
+      <w:r>
+        <w:rPr>
+          <w:lang w:val="en-US"/>
+        </w:rPr>
+        <w:t xml:space="preserve">. This was done to distinguish between actual zero keyword counts and missing data, which may occur if there were no news </w:t>
+      </w:r>
+      <w:r>
+        <w:rPr>
+          <w:lang w:val="en-US"/>
+        </w:rPr>
+        <w:t>articles,</w:t>
+      </w:r>
+      <w:r>
+        <w:rPr>
+          <w:lang w:val="en-US"/>
+        </w:rPr>
+        <w:t xml:space="preserve"> or no keywords present for a given month.</w:t>
+      </w:r>
+    </w:p>
+    <w:p>
+      <w:pPr>
+        <w:ind w:firstLine="708"/>
+        <w:rPr>
+          <w:lang w:val="en-US"/>
+        </w:rPr>
+      </w:pPr>
+      <w:r>
+        <w:rPr>
+          <w:lang w:val="en-US"/>
+        </w:rPr>
+        <w:t>To improve the quality of the dataset, columns with excessive missing data were removed. Specifically, columns where the proportion of missing values exceeded 20% were excluded from further analysis. This threshold was chosen to strike a balance between data retention and feature completeness, ensuring that remaining features had enough coverage over the time span of the dataset.</w:t>
+      </w:r>
+      <w:r>
+        <w:rPr>
+          <w:lang w:val="en-US"/>
+        </w:rPr>
+        <w:t xml:space="preserve"> </w:t>
+      </w:r>
+      <w:r>
+        <w:rPr>
+          <w:lang w:val="en-US"/>
+        </w:rPr>
+        <w:t>As a result, the number of features was reduced from 86 to 20. To address the remaining missing values and ensure compatibility with machine learning algorithms</w:t>
+      </w:r>
+      <w:r>
+        <w:rPr>
+          <w:lang w:val="en-US"/>
+        </w:rPr>
+        <w:t xml:space="preserve"> </w:t>
+      </w:r>
+      <w:r>
+        <w:rPr>
+          <w:lang w:val="en-US"/>
+        </w:rPr>
+        <w:t xml:space="preserve">which typically cannot handle </w:t>
+      </w:r>
+      <w:proofErr w:type="spellStart"/>
+      <w:r>
+        <w:rPr>
+          <w:lang w:val="en-US"/>
+        </w:rPr>
+        <w:t>NaN</w:t>
+      </w:r>
+      <w:proofErr w:type="spellEnd"/>
+      <w:r>
+        <w:rPr>
+          <w:lang w:val="en-US"/>
+        </w:rPr>
+        <w:t xml:space="preserve"> </w:t>
+      </w:r>
+      <w:r>
+        <w:rPr>
+          <w:lang w:val="en-US"/>
+        </w:rPr>
+        <w:t xml:space="preserve">values, </w:t>
+      </w:r>
+      <w:r>
+        <w:rPr>
+          <w:lang w:val="en-US"/>
+        </w:rPr>
+        <w:t>these gaps were filled with a default value of 1.</w:t>
+      </w:r>
+      <w:r>
+        <w:rPr>
+          <w:lang w:val="en-US"/>
+        </w:rPr>
+        <w:t xml:space="preserve"> </w:t>
+      </w:r>
+      <w:r>
+        <w:rPr>
+          <w:lang w:val="en-US"/>
+        </w:rPr>
+        <w:t>The selected features are shown in Figure 9.</w:t>
+      </w:r>
+    </w:p>
+    <w:p>
+      <w:pPr>
+        <w:ind w:firstLine="708"/>
+        <w:rPr>
+          <w:lang w:val="en-US"/>
+        </w:rPr>
+      </w:pPr>
+    </w:p>
+    <w:p>
+      <w:pPr>
+        <w:ind w:firstLine="708"/>
+        <w:jc w:val="center"/>
+        <w:rPr>
+          <w:lang w:val="en-US"/>
+        </w:rPr>
+      </w:pPr>
+      <w:r>
+        <w:rPr>
+          <w:lang w:val="en-US"/>
+        </w:rPr>
+        <w:lastRenderedPageBreak/>
+        <w:drawing>
+          <wp:inline distT="0" distB="0" distL="0" distR="0" wp14:anchorId="3303AA79" wp14:editId="2283439D">
+            <wp:extent cx="3764391" cy="3524250"/>
+            <wp:effectExtent l="19050" t="19050" r="26670" b="19050"/>
+            <wp:docPr id="2067186652" name="Рисунок 1"/>
+            <wp:cNvGraphicFramePr>
+              <a:graphicFrameLocks xmlns:a="http://schemas.openxmlformats.org/drawingml/2006/main" noChangeAspect="1"/>
+            </wp:cNvGraphicFramePr>
+            <a:graphic xmlns:a="http://schemas.openxmlformats.org/drawingml/2006/main">
+              <a:graphicData uri="http://schemas.openxmlformats.org/drawingml/2006/picture">
+                <pic:pic xmlns:pic="http://schemas.openxmlformats.org/drawingml/2006/picture">
+                  <pic:nvPicPr>
+                    <pic:cNvPr id="2067186652" name=""/>
+                    <pic:cNvPicPr/>
+                  </pic:nvPicPr>
+                  <pic:blipFill>
+                    <a:blip r:embed="rId21"/>
+                    <a:stretch>
+                      <a:fillRect/>
+                    </a:stretch>
+                  </pic:blipFill>
+                  <pic:spPr>
+                    <a:xfrm>
+                      <a:off x="0" y="0"/>
+                      <a:ext cx="3776180" cy="3535287"/>
+                    </a:xfrm>
+                    <a:prstGeom prst="rect">
+                      <a:avLst/>
+                    </a:prstGeom>
+                    <a:ln>
+                      <a:solidFill>
+                        <a:schemeClr val="tx1"/>
+                      </a:solidFill>
+                    </a:ln>
+                  </pic:spPr>
+                </pic:pic>
+              </a:graphicData>
+            </a:graphic>
+          </wp:inline>
+        </w:drawing>
+      </w:r>
+    </w:p>
+    <w:p>
+      <w:pPr>
+        <w:ind w:firstLine="708"/>
+        <w:jc w:val="center"/>
+        <w:rPr>
+          <w:lang w:val="en-US"/>
+        </w:rPr>
+      </w:pPr>
+    </w:p>
+    <w:p>
+      <w:pPr>
+        <w:ind w:firstLine="708"/>
+        <w:jc w:val="center"/>
+        <w:rPr>
+          <w:lang w:val="en-US"/>
+        </w:rPr>
+      </w:pPr>
+      <w:r>
+        <w:rPr>
+          <w:lang w:val="en-US"/>
+        </w:rPr>
+        <w:t>Figure 9 The selected features from initial dataset</w:t>
+      </w:r>
+    </w:p>
+    <w:p>
+      <w:pPr>
+        <w:ind w:firstLine="708"/>
+        <w:jc w:val="center"/>
+        <w:rPr>
+          <w:lang w:val="en-US"/>
+        </w:rPr>
+      </w:pPr>
+    </w:p>
+    <w:p>
+      <w:pPr>
+        <w:ind w:firstLine="708"/>
+        <w:rPr>
+          <w:lang w:val="en-US"/>
+        </w:rPr>
+      </w:pPr>
+      <w:r>
+        <w:rPr>
+          <w:lang w:val="en-US"/>
+        </w:rPr>
+        <w:t>We use these features to predict the target</w:t>
+      </w:r>
+      <w:r>
+        <w:rPr>
+          <w:lang w:val="en-US"/>
+        </w:rPr>
+        <w:t xml:space="preserve"> variable</w:t>
+      </w:r>
+      <w:r>
+        <w:rPr>
+          <w:lang w:val="en-US"/>
+        </w:rPr>
+        <w:t xml:space="preserve">. </w:t>
+      </w:r>
+      <w:r>
+        <w:rPr>
+          <w:lang w:val="en-US"/>
+        </w:rPr>
+        <w:t>To conclude the news data preprocessing section, we visualize the keyword frequency trends using two plots that offer both macro and micro perspectives on the data.</w:t>
+      </w:r>
+      <w:r>
+        <w:rPr>
+          <w:lang w:val="en-US"/>
+        </w:rPr>
+        <w:t xml:space="preserve"> </w:t>
+      </w:r>
+      <w:r>
+        <w:rPr>
+          <w:lang w:val="en-US"/>
+        </w:rPr>
+        <w:t>The first graph illustrates the total monthly keyword frequency across all selected keywords over the entire study period.</w:t>
+      </w:r>
+      <w:r>
+        <w:rPr>
+          <w:lang w:val="en-US"/>
+        </w:rPr>
+        <w:t xml:space="preserve"> The “</w:t>
+      </w:r>
+      <w:r>
+        <w:rPr>
+          <w:lang w:val="en-US"/>
+        </w:rPr>
+        <w:t>Total Keyword Frequency Over Time</w:t>
+      </w:r>
+      <w:r>
+        <w:rPr>
+          <w:lang w:val="en-US"/>
+        </w:rPr>
+        <w:t xml:space="preserve">” graph is shown in Figure 10. </w:t>
+      </w:r>
+    </w:p>
+    <w:p>
+      <w:pPr>
+        <w:ind w:firstLine="708"/>
+        <w:rPr>
+          <w:lang w:val="en-US"/>
+        </w:rPr>
+      </w:pPr>
+    </w:p>
+    <w:p>
+      <w:pPr>
+        <w:ind w:firstLine="708"/>
+        <w:jc w:val="center"/>
+        <w:rPr>
+          <w:lang w:val="en-US"/>
+        </w:rPr>
+      </w:pPr>
+      <w:r>
+        <w:rPr>
+          <w:lang w:val="en-US"/>
+        </w:rPr>
+        <w:drawing>
+          <wp:inline distT="0" distB="0" distL="0" distR="0" wp14:anchorId="36769942" wp14:editId="121A86E9">
+            <wp:extent cx="5323336" cy="2191961"/>
+            <wp:effectExtent l="19050" t="19050" r="10795" b="18415"/>
+            <wp:docPr id="1159328613" name="Рисунок 1"/>
+            <wp:cNvGraphicFramePr>
+              <a:graphicFrameLocks xmlns:a="http://schemas.openxmlformats.org/drawingml/2006/main" noChangeAspect="1"/>
+            </wp:cNvGraphicFramePr>
+            <a:graphic xmlns:a="http://schemas.openxmlformats.org/drawingml/2006/main">
+              <a:graphicData uri="http://schemas.openxmlformats.org/drawingml/2006/picture">
+                <pic:pic xmlns:pic="http://schemas.openxmlformats.org/drawingml/2006/picture">
+                  <pic:nvPicPr>
+                    <pic:cNvPr id="1159328613" name="Рисунок 1"/>
+                    <pic:cNvPicPr/>
+                  </pic:nvPicPr>
+                  <pic:blipFill>
+                    <a:blip r:embed="rId22">
+                      <a:extLst>
+                        <a:ext uri="{28A0092B-C50C-407E-A947-70E740481C1C}">
+                          <a14:useLocalDpi xmlns:a14="http://schemas.microsoft.com/office/drawing/2010/main" val="0"/>
+                        </a:ext>
+                      </a:extLst>
+                    </a:blip>
+                    <a:stretch>
+                      <a:fillRect/>
+                    </a:stretch>
+                  </pic:blipFill>
+                  <pic:spPr>
+                    <a:xfrm>
+                      <a:off x="0" y="0"/>
+                      <a:ext cx="5323336" cy="2191961"/>
+                    </a:xfrm>
+                    <a:prstGeom prst="rect">
+                      <a:avLst/>
+                    </a:prstGeom>
+                    <a:ln>
+                      <a:solidFill>
+                        <a:schemeClr val="tx1"/>
+                      </a:solidFill>
+                    </a:ln>
+                  </pic:spPr>
+                </pic:pic>
+              </a:graphicData>
+            </a:graphic>
+          </wp:inline>
+        </w:drawing>
+      </w:r>
+    </w:p>
+    <w:p>
+      <w:pPr>
+        <w:ind w:firstLine="708"/>
+        <w:rPr>
+          <w:lang w:val="en-US"/>
+        </w:rPr>
+      </w:pPr>
+    </w:p>
+    <w:p>
+      <w:pPr>
+        <w:ind w:firstLine="708"/>
+        <w:jc w:val="center"/>
+        <w:rPr>
+          <w:lang w:val="en-US"/>
+        </w:rPr>
+      </w:pPr>
+      <w:r>
+        <w:rPr>
+          <w:lang w:val="en-US"/>
+        </w:rPr>
+        <w:t xml:space="preserve">Figure 10 </w:t>
+      </w:r>
+      <w:r>
+        <w:rPr>
+          <w:lang w:val="en-US"/>
+        </w:rPr>
+        <w:t>Total Keyword Frequency Over Time</w:t>
+      </w:r>
+      <w:r>
+        <w:rPr>
+          <w:lang w:val="en-US"/>
+        </w:rPr>
+        <w:t xml:space="preserve"> graph</w:t>
+      </w:r>
+    </w:p>
+    <w:p>
+      <w:pPr>
+        <w:ind w:firstLine="708"/>
+        <w:jc w:val="center"/>
+        <w:rPr>
+          <w:lang w:val="en-US"/>
+        </w:rPr>
+      </w:pPr>
+    </w:p>
+    <w:p>
+      <w:pPr>
+        <w:ind w:firstLine="708"/>
+        <w:rPr>
+          <w:lang w:val="en-US"/>
+        </w:rPr>
+      </w:pPr>
+      <w:r>
+        <w:rPr>
+          <w:lang w:val="en-US"/>
+        </w:rPr>
+        <w:t xml:space="preserve">This high-level overview shows several peaks and troughs, reflecting fluctuating levels of media attention to corruption-related topics. Periods of heightened keyword activity may align with political events, major investigations, or public scandals, providing </w:t>
+      </w:r>
+      <w:r>
+        <w:rPr>
+          <w:lang w:val="en-US"/>
+        </w:rPr>
+        <w:t>valuable</w:t>
+      </w:r>
+      <w:r>
+        <w:rPr>
+          <w:lang w:val="en-US"/>
+        </w:rPr>
+        <w:t xml:space="preserve"> context for further analysis.</w:t>
+      </w:r>
+      <w:r>
+        <w:rPr>
+          <w:lang w:val="en-US"/>
+        </w:rPr>
+        <w:t xml:space="preserve"> </w:t>
+      </w:r>
+      <w:r>
+        <w:rPr>
+          <w:lang w:val="en-US"/>
+        </w:rPr>
+        <w:t xml:space="preserve">The second graph displays individual </w:t>
+      </w:r>
+      <w:r>
+        <w:rPr>
+          <w:lang w:val="en-US"/>
+        </w:rPr>
+        <w:lastRenderedPageBreak/>
+        <w:t>keyword frequency trends over time, highlighting the specific contribution of each term to the total count.</w:t>
+      </w:r>
+      <w:r>
+        <w:rPr>
+          <w:lang w:val="en-US"/>
+        </w:rPr>
+        <w:t xml:space="preserve"> The “</w:t>
+      </w:r>
+      <w:r>
+        <w:rPr>
+          <w:lang w:val="en-US"/>
+        </w:rPr>
+        <w:t>Monthly Keyword Frequency Trends</w:t>
+      </w:r>
+      <w:r>
+        <w:rPr>
+          <w:lang w:val="en-US"/>
+        </w:rPr>
+        <w:t xml:space="preserve">” graph is shown in Figure 11. </w:t>
+      </w:r>
+    </w:p>
+    <w:p>
+      <w:pPr>
+        <w:ind w:firstLine="708"/>
+        <w:rPr>
+          <w:lang w:val="en-US"/>
+        </w:rPr>
+      </w:pPr>
+    </w:p>
+    <w:p>
+      <w:pPr>
+        <w:ind w:firstLine="708"/>
+        <w:jc w:val="center"/>
+        <w:rPr>
+          <w:lang w:val="en-US"/>
+        </w:rPr>
+      </w:pPr>
+      <w:r>
+        <w:rPr>
+          <w:lang w:val="en-US"/>
+        </w:rPr>
+        <w:drawing>
+          <wp:inline distT="0" distB="0" distL="0" distR="0" wp14:anchorId="265DC93A" wp14:editId="77DB583C">
+            <wp:extent cx="5275878" cy="2827642"/>
+            <wp:effectExtent l="19050" t="19050" r="20320" b="11430"/>
+            <wp:docPr id="1957875726" name="Рисунок 1"/>
+            <wp:cNvGraphicFramePr>
+              <a:graphicFrameLocks xmlns:a="http://schemas.openxmlformats.org/drawingml/2006/main" noChangeAspect="1"/>
+            </wp:cNvGraphicFramePr>
+            <a:graphic xmlns:a="http://schemas.openxmlformats.org/drawingml/2006/main">
+              <a:graphicData uri="http://schemas.openxmlformats.org/drawingml/2006/picture">
+                <pic:pic xmlns:pic="http://schemas.openxmlformats.org/drawingml/2006/picture">
+                  <pic:nvPicPr>
+                    <pic:cNvPr id="1957875726" name="Рисунок 1"/>
+                    <pic:cNvPicPr/>
+                  </pic:nvPicPr>
+                  <pic:blipFill>
+                    <a:blip r:embed="rId23" cstate="print">
+                      <a:extLst>
+                        <a:ext uri="{28A0092B-C50C-407E-A947-70E740481C1C}">
+                          <a14:useLocalDpi xmlns:a14="http://schemas.microsoft.com/office/drawing/2010/main" val="0"/>
+                        </a:ext>
+                      </a:extLst>
+                    </a:blip>
+                    <a:stretch>
+                      <a:fillRect/>
+                    </a:stretch>
+                  </pic:blipFill>
+                  <pic:spPr>
+                    <a:xfrm>
+                      <a:off x="0" y="0"/>
+                      <a:ext cx="5275878" cy="2827642"/>
+                    </a:xfrm>
+                    <a:prstGeom prst="rect">
+                      <a:avLst/>
+                    </a:prstGeom>
+                    <a:ln>
+                      <a:solidFill>
+                        <a:schemeClr val="tx1"/>
+                      </a:solidFill>
+                    </a:ln>
+                  </pic:spPr>
+                </pic:pic>
+              </a:graphicData>
+            </a:graphic>
+          </wp:inline>
+        </w:drawing>
+      </w:r>
+    </w:p>
+    <w:p>
+      <w:pPr>
+        <w:ind w:firstLine="708"/>
+        <w:rPr>
+          <w:lang w:val="en-US"/>
+        </w:rPr>
+      </w:pPr>
+    </w:p>
+    <w:p>
+      <w:pPr>
+        <w:ind w:firstLine="708"/>
+        <w:jc w:val="center"/>
+        <w:rPr>
+          <w:lang w:val="en-US"/>
+        </w:rPr>
+      </w:pPr>
+      <w:r>
+        <w:rPr>
+          <w:lang w:val="en-US"/>
+        </w:rPr>
+        <w:t xml:space="preserve">Figure 10 </w:t>
+      </w:r>
+      <w:r>
+        <w:rPr>
+          <w:lang w:val="en-US"/>
+        </w:rPr>
+        <w:t>Total Keyword Frequency Over Time</w:t>
+      </w:r>
+      <w:r>
+        <w:rPr>
+          <w:lang w:val="en-US"/>
+        </w:rPr>
+        <w:t xml:space="preserve"> graph</w:t>
+      </w:r>
+    </w:p>
+    <w:p>
+      <w:pPr>
+        <w:ind w:firstLine="708"/>
+        <w:rPr>
+          <w:lang w:val="en-US"/>
+        </w:rPr>
+      </w:pPr>
+    </w:p>
+    <w:p>
+      <w:pPr>
+        <w:ind w:firstLine="708"/>
+        <w:rPr>
+          <w:lang w:val="en-US"/>
+        </w:rPr>
+      </w:pPr>
+      <w:r>
+        <w:rPr>
+          <w:lang w:val="en-US"/>
+        </w:rPr>
+        <w:t>This more granular view reveals that certain keywords</w:t>
+      </w:r>
+      <w:r>
+        <w:rPr>
+          <w:lang w:val="en-US"/>
+        </w:rPr>
+        <w:t xml:space="preserve"> </w:t>
+      </w:r>
+      <w:r>
+        <w:rPr>
+          <w:lang w:val="en-US"/>
+        </w:rPr>
+        <w:t xml:space="preserve">such as </w:t>
+      </w:r>
+      <w:r>
+        <w:rPr>
+          <w:i/>
+          <w:iCs/>
+          <w:lang w:val="en-US"/>
+        </w:rPr>
+        <w:t>bribe</w:t>
+      </w:r>
+      <w:r>
+        <w:rPr>
+          <w:lang w:val="en-US"/>
+        </w:rPr>
+        <w:t xml:space="preserve">, </w:t>
+      </w:r>
+      <w:r>
+        <w:rPr>
+          <w:i/>
+          <w:iCs/>
+          <w:lang w:val="en-US"/>
+        </w:rPr>
+        <w:t>corruption</w:t>
+      </w:r>
+      <w:r>
+        <w:rPr>
+          <w:lang w:val="en-US"/>
+        </w:rPr>
+        <w:t xml:space="preserve">, and </w:t>
+      </w:r>
+      <w:r>
+        <w:rPr>
+          <w:i/>
+          <w:iCs/>
+          <w:lang w:val="en-US"/>
+        </w:rPr>
+        <w:t>court</w:t>
+      </w:r>
+      <w:r>
+        <w:rPr>
+          <w:i/>
+          <w:iCs/>
+          <w:lang w:val="en-US"/>
+        </w:rPr>
+        <w:t xml:space="preserve"> </w:t>
+      </w:r>
+      <w:r>
+        <w:rPr>
+          <w:lang w:val="en-US"/>
+        </w:rPr>
+        <w:t>occur more frequently and consistently than others, suggesting their prominence in media discourse related to corruption. These trends also show that media focus varies over time, with some keywords spiking sharply during specific months.</w:t>
+      </w:r>
+    </w:p>
+    <w:p>
+      <w:pPr>
+        <w:ind w:firstLine="708"/>
+        <w:rPr>
+          <w:lang w:val="en-US"/>
+        </w:rPr>
+      </w:pPr>
+      <w:r>
+        <w:rPr>
+          <w:lang w:val="en-US"/>
+        </w:rPr>
+        <w:t>T</w:t>
+      </w:r>
+      <w:r>
+        <w:rPr>
+          <w:lang w:val="en-US"/>
+        </w:rPr>
+        <w:t xml:space="preserve">he preprocessing of both the official crime data and news-based keyword frequencies was essential for ensuring data quality, temporal consistency, and compatibility with analytical models. The interpolation of missing crime data enabled the construction of a complete monthly time series, while the aggregation and filtering of keyword features resulted in a refined dataset with strong temporal alignment. These preprocessing steps laid the foundation for subsequent regression and time series modeling by transforming raw, unstructured inputs into clean, structured, and informative variables. The resulting dataset captures both statistical and linguistic patterns, enabling deeper </w:t>
+      </w:r>
+      <w:proofErr w:type="gramStart"/>
+      <w:r>
+        <w:rPr>
+          <w:lang w:val="en-US"/>
+        </w:rPr>
+        <w:t>insights</w:t>
+      </w:r>
+      <w:proofErr w:type="gramEnd"/>
+      <w:r>
+        <w:rPr>
+          <w:lang w:val="en-US"/>
+        </w:rPr>
+        <w:t xml:space="preserve"> into the relationship between media discourse and reported corruption crimes.</w:t>
+      </w:r>
+    </w:p>
+    <w:p>
+      <w:pPr>
+        <w:ind w:firstLine="708"/>
+        <w:rPr>
+          <w:lang w:val="en-US"/>
+        </w:rPr>
+      </w:pPr>
+    </w:p>
+    <w:p>
+      <w:pPr>
+        <w:ind w:firstLine="708"/>
+        <w:rPr>
+          <w:lang w:val="en-US"/>
+        </w:rPr>
+      </w:pPr>
+    </w:p>
+    <w:p>
+      <w:pPr>
+        <w:ind w:firstLine="708"/>
+        <w:rPr>
+          <w:lang w:val="en-US"/>
+        </w:rPr>
+      </w:pPr>
+    </w:p>
+    <w:p>
+      <w:pPr>
+        <w:ind w:firstLine="708"/>
+        <w:rPr>
+          <w:lang w:val="en-US"/>
+        </w:rPr>
+      </w:pPr>
+    </w:p>
+    <w:p>
+      <w:pPr>
+        <w:ind w:firstLine="708"/>
+        <w:rPr>
+          <w:lang w:val="en-US"/>
+        </w:rPr>
+      </w:pPr>
+    </w:p>
+    <w:p>
+      <w:pPr>
+        <w:ind w:firstLine="708"/>
+        <w:rPr>
+          <w:lang w:val="en-US"/>
+        </w:rPr>
+      </w:pPr>
+    </w:p>
+    <w:p>
+      <w:pPr>
+        <w:ind w:firstLine="708"/>
+        <w:rPr>
+          <w:lang w:val="en-US"/>
+        </w:rPr>
+      </w:pPr>
     </w:p>
     <w:p>
       <w:pPr>
@@ -13099,55 +14884,7 @@
           <w:lang w:val="en-US"/>
         </w:rPr>
       </w:pPr>
-      <w:bookmarkStart w:id="13" w:name="_Toc194490949"/>
-      <w:r>
-        <w:rPr>
-          <w:lang w:val="en-US"/>
-        </w:rPr>
-        <w:lastRenderedPageBreak/>
-        <w:t>2.</w:t>
-      </w:r>
-      <w:r>
-        <w:rPr>
-          <w:lang w:val="en-US"/>
-        </w:rPr>
-        <w:t>4</w:t>
-      </w:r>
-      <w:r>
-        <w:rPr>
-          <w:lang w:val="en-US"/>
-        </w:rPr>
-        <w:t xml:space="preserve"> Time Series </w:t>
-      </w:r>
-      <w:r>
-        <w:rPr>
-          <w:lang w:val="en-US"/>
-        </w:rPr>
-        <w:t>Analysis</w:t>
-      </w:r>
-      <w:bookmarkEnd w:id="13"/>
-    </w:p>
-    <w:p>
-      <w:pPr>
-        <w:rPr>
-          <w:lang w:val="en-US"/>
-        </w:rPr>
-      </w:pPr>
-      <w:r>
-        <w:rPr>
-          <w:lang w:val="en-US"/>
-        </w:rPr>
-        <w:br w:type="page"/>
-      </w:r>
-    </w:p>
-    <w:p>
-      <w:pPr>
-        <w:pStyle w:val="1"/>
-        <w:rPr>
-          <w:lang w:val="en-US"/>
-        </w:rPr>
-      </w:pPr>
-      <w:bookmarkStart w:id="14" w:name="_Toc194490950"/>
+      <w:bookmarkStart w:id="14" w:name="_Toc194672600"/>
       <w:r>
         <w:rPr>
           <w:lang w:val="en-US"/>
@@ -13165,11 +14902,193 @@
     </w:p>
     <w:p>
       <w:pPr>
+        <w:pStyle w:val="1"/>
+        <w:rPr>
+          <w:lang w:val="en-US"/>
+        </w:rPr>
+      </w:pPr>
+      <w:bookmarkStart w:id="15" w:name="_Toc194672601"/>
+      <w:r>
+        <w:rPr>
+          <w:lang w:val="en-US"/>
+        </w:rPr>
+        <w:t>3</w:t>
+      </w:r>
+      <w:r>
+        <w:rPr>
+          <w:lang w:val="en-US"/>
+        </w:rPr>
+        <w:t>.</w:t>
+      </w:r>
+      <w:r>
+        <w:rPr>
+          <w:lang w:val="en-US"/>
+        </w:rPr>
+        <w:t>1</w:t>
+      </w:r>
+      <w:r>
+        <w:rPr>
+          <w:lang w:val="en-US"/>
+        </w:rPr>
+        <w:t xml:space="preserve"> Regression models</w:t>
+      </w:r>
+      <w:bookmarkEnd w:id="15"/>
+    </w:p>
+    <w:p>
+      <w:pPr>
+        <w:pStyle w:val="1"/>
+        <w:rPr>
+          <w:lang w:val="en-US"/>
+        </w:rPr>
+      </w:pPr>
+      <w:bookmarkStart w:id="16" w:name="_Toc194672602"/>
+      <w:r>
+        <w:rPr>
+          <w:lang w:val="en-US"/>
+        </w:rPr>
+        <w:t>3</w:t>
+      </w:r>
+      <w:r>
+        <w:rPr>
+          <w:lang w:val="en-US"/>
+        </w:rPr>
+        <w:t>.</w:t>
+      </w:r>
+      <w:r>
+        <w:rPr>
+          <w:lang w:val="en-US"/>
+        </w:rPr>
+        <w:t>2</w:t>
+      </w:r>
+      <w:r>
+        <w:rPr>
+          <w:lang w:val="en-US"/>
+        </w:rPr>
+        <w:t xml:space="preserve"> </w:t>
+      </w:r>
+      <w:r>
+        <w:rPr>
+          <w:lang w:val="en-US"/>
+        </w:rPr>
+        <w:t>Hypothesis Testing and Motivation for Time Series Analysis</w:t>
+      </w:r>
+      <w:bookmarkEnd w:id="16"/>
+    </w:p>
+    <w:p>
+      <w:pPr>
         <w:ind w:firstLine="708"/>
         <w:rPr>
           <w:lang w:val="en-US"/>
         </w:rPr>
       </w:pPr>
+      <w:r>
+        <w:rPr>
+          <w:lang w:val="en-US"/>
+        </w:rPr>
+        <w:t>In the initial phase of the research, we hypothesized that the frequency of corruption-related keywords in the media might serve as a meaningful predictor of the number of officially reported corruption crimes in Kazakhstan. The intuition behind this assumption is straightforward: increased media attention to corruption may reflect heightened public interest, journalistic investigation, or even governmental transparency efforts, which in turn could correspond to more criminal cases being registered.</w:t>
+      </w:r>
+    </w:p>
+    <w:p>
+      <w:pPr>
+        <w:ind w:firstLine="708"/>
+        <w:rPr>
+          <w:lang w:val="en-US"/>
+        </w:rPr>
+      </w:pPr>
+      <w:r>
+        <w:rPr>
+          <w:lang w:val="en-US"/>
+        </w:rPr>
+        <w:t xml:space="preserve">To test this hypothesis, we developed a structured dataset that aggregates keyword counts from news articles </w:t>
+      </w:r>
+      <w:r>
+        <w:rPr>
+          <w:lang w:val="en-US"/>
+        </w:rPr>
+        <w:t>monthly</w:t>
+      </w:r>
+      <w:r>
+        <w:rPr>
+          <w:lang w:val="en-US"/>
+        </w:rPr>
+        <w:t xml:space="preserve"> and aligned them with monthly crime statistics. These keyword frequencies were then used as independent features to train regression models, with the monthly number of corruption crimes as the target variable.</w:t>
+      </w:r>
+    </w:p>
+    <w:p>
+      <w:pPr>
+        <w:ind w:firstLine="708"/>
+        <w:rPr>
+          <w:lang w:val="en-US"/>
+        </w:rPr>
+      </w:pPr>
+      <w:r>
+        <w:rPr>
+          <w:lang w:val="en-US"/>
+        </w:rPr>
+        <w:t>However, the results from this approach revealed a weak statistical relationship. Most regression models yielded low R² values and high error metrics (e.g., MAE and MSE), indicating that the keyword-based features lacked sufficient explanatory power. This suggests that the number of registered corruption crimes is not strongly driven by the intensity of media coverage. Several possible explanations for this disconnect were considered, including the potential manipulation or administrative control over crime reporting, the influence of internal institutional factors, or simply the fact that media narratives and official records may reflect different facets of corruption.</w:t>
+      </w:r>
+    </w:p>
+    <w:p>
+      <w:pPr>
+        <w:ind w:firstLine="708"/>
+        <w:rPr>
+          <w:lang w:val="en-US"/>
+        </w:rPr>
+      </w:pPr>
+      <w:r>
+        <w:rPr>
+          <w:lang w:val="en-US"/>
+        </w:rPr>
+        <w:t>Given these findings, we concluded that news data alone is not suitable for forecasting corruption crime statistics. This motivated a shift in methodology: instead of relying on external features, we turned to time series modeling techniques to examine the internal patterns and temporal dependencies within the official crime statistics themselves. Time series models such as SARIMA and Prophet are particularly well-suited for this task, as they can capture trends, seasonality, and autoregressive components — all of which may provide deeper insights into the dynamics of reported corruption crimes over time.</w:t>
+      </w:r>
+    </w:p>
+    <w:p>
+      <w:pPr>
+        <w:ind w:firstLine="708"/>
+        <w:rPr>
+          <w:lang w:val="en-US"/>
+        </w:rPr>
+      </w:pPr>
+    </w:p>
+    <w:p>
+      <w:pPr>
+        <w:pStyle w:val="1"/>
+        <w:rPr>
+          <w:lang w:val="en-US"/>
+        </w:rPr>
+      </w:pPr>
+      <w:bookmarkStart w:id="17" w:name="_Toc194672603"/>
+      <w:r>
+        <w:rPr>
+          <w:lang w:val="en-US"/>
+        </w:rPr>
+        <w:t>3</w:t>
+      </w:r>
+      <w:r>
+        <w:rPr>
+          <w:lang w:val="en-US"/>
+        </w:rPr>
+        <w:t>.</w:t>
+      </w:r>
+      <w:r>
+        <w:rPr>
+          <w:lang w:val="en-US"/>
+        </w:rPr>
+        <w:t>3</w:t>
+      </w:r>
+      <w:r>
+        <w:rPr>
+          <w:lang w:val="en-US"/>
+        </w:rPr>
+        <w:t xml:space="preserve"> Time Series </w:t>
+      </w:r>
+      <w:r>
+        <w:rPr>
+          <w:lang w:val="en-US"/>
+        </w:rPr>
+        <w:t>Analysis</w:t>
+      </w:r>
+      <w:bookmarkEnd w:id="17"/>
     </w:p>
     <w:p>
       <w:pPr>
@@ -13191,7 +15110,7 @@
           <w:lang w:val="en-US"/>
         </w:rPr>
       </w:pPr>
-      <w:bookmarkStart w:id="15" w:name="_Toc194490951"/>
+      <w:bookmarkStart w:id="18" w:name="_Toc194672604"/>
       <w:r>
         <w:rPr>
           <w:lang w:val="en-US"/>
@@ -13206,7 +15125,7 @@
         </w:rPr>
         <w:t>DISCUSSION</w:t>
       </w:r>
-      <w:bookmarkEnd w:id="15"/>
+      <w:bookmarkEnd w:id="18"/>
       <w:proofErr w:type="gramEnd"/>
     </w:p>
     <w:p>
@@ -13236,7 +15155,7 @@
           <w:lang w:val="en-US"/>
         </w:rPr>
       </w:pPr>
-      <w:bookmarkStart w:id="16" w:name="_Toc194490952"/>
+      <w:bookmarkStart w:id="19" w:name="_Toc194672605"/>
       <w:r>
         <w:rPr>
           <w:lang w:val="en-US"/>
@@ -13244,7 +15163,7 @@
         <w:lastRenderedPageBreak/>
         <w:t>CONCLUSION</w:t>
       </w:r>
-      <w:bookmarkEnd w:id="16"/>
+      <w:bookmarkEnd w:id="19"/>
     </w:p>
     <w:p>
       <w:pPr>
@@ -13273,7 +15192,7 @@
           <w:lang w:val="en-US"/>
         </w:rPr>
       </w:pPr>
-      <w:bookmarkStart w:id="17" w:name="_Toc194490953"/>
+      <w:bookmarkStart w:id="20" w:name="_Toc194672606"/>
       <w:r>
         <w:rPr>
           <w:lang w:val="en-US"/>
@@ -13281,7 +15200,7 @@
         <w:lastRenderedPageBreak/>
         <w:t>REFERENCES</w:t>
       </w:r>
-      <w:bookmarkEnd w:id="17"/>
+      <w:bookmarkEnd w:id="20"/>
     </w:p>
     <w:p>
       <w:pPr>
@@ -13338,7 +15257,7 @@
         </w:rPr>
         <w:t xml:space="preserve">Available: </w:t>
       </w:r>
-      <w:hyperlink r:id="rId17" w:history="1">
+      <w:hyperlink r:id="rId24" w:history="1">
         <w:r>
           <w:rPr>
             <w:rStyle w:val="af4"/>
@@ -13886,6 +15805,7 @@
           <w:rFonts w:cs="Times New Roman"/>
           <w:kern w:val="2"/>
           <w:szCs w:val="28"/>
+          <w:lang w:val="en-US"/>
         </w:rPr>
       </w:pPr>
       <w:r>
@@ -13911,37 +15831,39 @@
           <w:rFonts w:cs="Times New Roman"/>
           <w:kern w:val="2"/>
           <w:szCs w:val="28"/>
-        </w:rPr>
-        <w:t xml:space="preserve"> </w:t>
+          <w:lang w:val="en-US"/>
+        </w:rPr>
+        <w:t xml:space="preserve"> https://qamqor.gov.kz/crimestat/about</w:t>
       </w:r>
       <w:r>
         <w:rPr>
           <w:rFonts w:cs="Times New Roman"/>
           <w:kern w:val="2"/>
           <w:szCs w:val="28"/>
-        </w:rPr>
-        <w:t>https://qamqor.gov.kz/crimestat/about</w:t>
-      </w:r>
-      <w:r>
+          <w:lang w:val="en-US"/>
+        </w:rPr>
+        <w:t xml:space="preserve">. [Accessed: Mar. 11, 2025].  </w:t>
+      </w:r>
+    </w:p>
+    <w:p>
+      <w:pPr>
+        <w:ind w:firstLine="652"/>
         <w:rPr>
           <w:rFonts w:cs="Times New Roman"/>
           <w:kern w:val="2"/>
           <w:szCs w:val="28"/>
           <w:lang w:val="en-US"/>
         </w:rPr>
-        <w:t xml:space="preserve">. [Accessed: Mar. 11, 2025].  </w:t>
-      </w:r>
-    </w:p>
-    <w:p>
-      <w:pPr>
-        <w:ind w:firstLine="652"/>
+      </w:pPr>
+      <w:r>
         <w:rPr>
           <w:rFonts w:cs="Times New Roman"/>
           <w:kern w:val="2"/>
           <w:szCs w:val="28"/>
           <w:lang w:val="en-US"/>
         </w:rPr>
-      </w:pPr>
+        <w:t xml:space="preserve">[21] </w:t>
+      </w:r>
       <w:r>
         <w:rPr>
           <w:rFonts w:cs="Times New Roman"/>
@@ -13949,7 +15871,7 @@
           <w:szCs w:val="28"/>
           <w:lang w:val="en-US"/>
         </w:rPr>
-        <w:t xml:space="preserve">[21] </w:t>
+        <w:t>"</w:t>
       </w:r>
       <w:r>
         <w:rPr>
@@ -13958,7 +15880,7 @@
           <w:szCs w:val="28"/>
           <w:lang w:val="en-US"/>
         </w:rPr>
-        <w:t>"</w:t>
+        <w:t>Order of the Prosecutor General of the Republic of Kazakhstan</w:t>
       </w:r>
       <w:r>
         <w:rPr>
@@ -13967,7 +15889,7 @@
           <w:szCs w:val="28"/>
           <w:lang w:val="en-US"/>
         </w:rPr>
-        <w:t>Order of the Prosecutor General of the Republic of Kazakhstan</w:t>
+        <w:t>"</w:t>
       </w:r>
       <w:r>
         <w:rPr>
@@ -13976,7 +15898,7 @@
           <w:szCs w:val="28"/>
           <w:lang w:val="en-US"/>
         </w:rPr>
-        <w:t>"</w:t>
+        <w:t xml:space="preserve">, [Online]. Available: </w:t>
       </w:r>
       <w:r>
         <w:rPr>
@@ -13985,17 +15907,19 @@
           <w:szCs w:val="28"/>
           <w:lang w:val="en-US"/>
         </w:rPr>
-        <w:t>, [Online]. Available:</w:t>
-      </w:r>
-      <w:r>
+        <w:t>https://adilet.zan.kz/rus/docs/V2400034898</w:t>
+      </w:r>
+    </w:p>
+    <w:p>
+      <w:pPr>
+        <w:ind w:firstLine="652"/>
         <w:rPr>
           <w:rFonts w:cs="Times New Roman"/>
           <w:kern w:val="2"/>
           <w:szCs w:val="28"/>
           <w:lang w:val="en-US"/>
         </w:rPr>
-        <w:t xml:space="preserve"> </w:t>
-      </w:r>
+      </w:pPr>
       <w:r>
         <w:rPr>
           <w:rFonts w:cs="Times New Roman"/>
@@ -14003,19 +15927,17 @@
           <w:szCs w:val="28"/>
           <w:lang w:val="en-US"/>
         </w:rPr>
-        <w:t>https://adilet.zan.kz/rus/docs/V2400034898</w:t>
-      </w:r>
-    </w:p>
-    <w:p>
-      <w:pPr>
-        <w:ind w:firstLine="652"/>
+        <w:t>[2</w:t>
+      </w:r>
+      <w:r>
         <w:rPr>
           <w:rFonts w:cs="Times New Roman"/>
           <w:kern w:val="2"/>
           <w:szCs w:val="28"/>
           <w:lang w:val="en-US"/>
         </w:rPr>
-      </w:pPr>
+        <w:t>2</w:t>
+      </w:r>
       <w:r>
         <w:rPr>
           <w:rFonts w:cs="Times New Roman"/>
@@ -14023,7 +15945,7 @@
           <w:szCs w:val="28"/>
           <w:lang w:val="en-US"/>
         </w:rPr>
-        <w:t>[2</w:t>
+        <w:t xml:space="preserve">] </w:t>
       </w:r>
       <w:r>
         <w:rPr>
@@ -14032,7 +15954,7 @@
           <w:szCs w:val="28"/>
           <w:lang w:val="en-US"/>
         </w:rPr>
-        <w:t>2</w:t>
+        <w:t>"</w:t>
       </w:r>
       <w:r>
         <w:rPr>
@@ -14041,7 +15963,7 @@
           <w:szCs w:val="28"/>
           <w:lang w:val="en-US"/>
         </w:rPr>
-        <w:t xml:space="preserve">] </w:t>
+        <w:t>Rating of Kazakhstan’s media</w:t>
       </w:r>
       <w:r>
         <w:rPr>
@@ -14059,7 +15981,7 @@
           <w:szCs w:val="28"/>
           <w:lang w:val="en-US"/>
         </w:rPr>
-        <w:t>Rating of Kazakhstan’s media</w:t>
+        <w:t xml:space="preserve">, [Online]. Available: </w:t>
       </w:r>
       <w:r>
         <w:rPr>
@@ -14068,27 +15990,9 @@
           <w:szCs w:val="28"/>
           <w:lang w:val="en-US"/>
         </w:rPr>
-        <w:t>"</w:t>
-      </w:r>
-      <w:r>
-        <w:rPr>
-          <w:rFonts w:cs="Times New Roman"/>
-          <w:kern w:val="2"/>
-          <w:szCs w:val="28"/>
-          <w:lang w:val="en-US"/>
-        </w:rPr>
-        <w:t xml:space="preserve">, [Online]. Available: </w:t>
-      </w:r>
-      <w:r>
-        <w:rPr>
-          <w:rFonts w:cs="Times New Roman"/>
-          <w:kern w:val="2"/>
-          <w:szCs w:val="28"/>
-          <w:lang w:val="en-US"/>
-        </w:rPr>
-        <w:t xml:space="preserve"> </w:t>
-      </w:r>
-      <w:hyperlink r:id="rId18" w:history="1">
+        <w:t xml:space="preserve"> </w:t>
+      </w:r>
+      <w:hyperlink r:id="rId25" w:history="1">
         <w:r>
           <w:rPr>
             <w:rStyle w:val="af4"/>
@@ -14142,34 +16046,18 @@
           <w:rFonts w:cs="Times New Roman"/>
           <w:kern w:val="2"/>
           <w:szCs w:val="28"/>
-        </w:rPr>
-        <w:t xml:space="preserve">[Online]. </w:t>
-      </w:r>
-      <w:proofErr w:type="spellStart"/>
-      <w:r>
-        <w:rPr>
-          <w:rFonts w:cs="Times New Roman"/>
-          <w:kern w:val="2"/>
-          <w:szCs w:val="28"/>
-        </w:rPr>
-        <w:t>Available</w:t>
-      </w:r>
-      <w:proofErr w:type="spellEnd"/>
-      <w:r>
-        <w:rPr>
-          <w:rFonts w:cs="Times New Roman"/>
-          <w:kern w:val="2"/>
-          <w:szCs w:val="28"/>
-        </w:rPr>
-        <w:t xml:space="preserve">: </w:t>
-      </w:r>
-      <w:hyperlink r:id="rId19" w:tgtFrame="_new" w:history="1">
+          <w:lang w:val="en-US"/>
+        </w:rPr>
+        <w:t xml:space="preserve">[Online]. Available: </w:t>
+      </w:r>
+      <w:hyperlink r:id="rId26" w:tgtFrame="_new" w:history="1">
         <w:r>
           <w:rPr>
             <w:rStyle w:val="af4"/>
             <w:rFonts w:cs="Times New Roman"/>
             <w:kern w:val="2"/>
             <w:szCs w:val="28"/>
+            <w:lang w:val="en-US"/>
           </w:rPr>
           <w:t>https://github.com/kmike/pymorphy3</w:t>
         </w:r>
@@ -14179,44 +16067,9 @@
           <w:rFonts w:cs="Times New Roman"/>
           <w:kern w:val="2"/>
           <w:szCs w:val="28"/>
-        </w:rPr>
-        <w:t>. [</w:t>
-      </w:r>
-      <w:proofErr w:type="spellStart"/>
-      <w:r>
-        <w:rPr>
-          <w:rFonts w:cs="Times New Roman"/>
-          <w:kern w:val="2"/>
-          <w:szCs w:val="28"/>
-        </w:rPr>
-        <w:t>Accessed</w:t>
-      </w:r>
-      <w:proofErr w:type="spellEnd"/>
-      <w:r>
-        <w:rPr>
-          <w:rFonts w:cs="Times New Roman"/>
-          <w:kern w:val="2"/>
-          <w:szCs w:val="28"/>
-        </w:rPr>
-        <w:t xml:space="preserve">: </w:t>
-      </w:r>
-      <w:proofErr w:type="spellStart"/>
-      <w:r>
-        <w:rPr>
-          <w:rFonts w:cs="Times New Roman"/>
-          <w:kern w:val="2"/>
-          <w:szCs w:val="28"/>
-        </w:rPr>
-        <w:t>Apr</w:t>
-      </w:r>
-      <w:proofErr w:type="spellEnd"/>
-      <w:r>
-        <w:rPr>
-          <w:rFonts w:cs="Times New Roman"/>
-          <w:kern w:val="2"/>
-          <w:szCs w:val="28"/>
-        </w:rPr>
-        <w:t>. 1, 2025].</w:t>
+          <w:lang w:val="en-US"/>
+        </w:rPr>
+        <w:t>. [Accessed: Apr. 1, 2025].</w:t>
       </w:r>
     </w:p>
     <w:p>
@@ -14242,13 +16095,987 @@
     <w:p>
       <w:pPr>
         <w:pStyle w:val="1"/>
-      </w:pPr>
-      <w:bookmarkStart w:id="18" w:name="_Toc194490954"/>
-      <w:r>
+        <w:rPr>
+          <w:lang w:val="en-US"/>
+        </w:rPr>
+      </w:pPr>
+      <w:bookmarkStart w:id="21" w:name="_Toc194672607"/>
+      <w:r>
+        <w:rPr>
+          <w:lang w:val="en-US"/>
+        </w:rPr>
         <w:lastRenderedPageBreak/>
         <w:t>APPENDIX</w:t>
       </w:r>
-      <w:bookmarkEnd w:id="18"/>
+      <w:r>
+        <w:rPr>
+          <w:lang w:val="en-US"/>
+        </w:rPr>
+        <w:t xml:space="preserve"> A </w:t>
+      </w:r>
+      <w:r>
+        <w:rPr>
+          <w:lang w:val="en-US"/>
+        </w:rPr>
+        <w:t>— CORRUPTION-RELATED KEYWORDS</w:t>
+      </w:r>
+      <w:bookmarkEnd w:id="21"/>
+    </w:p>
+    <w:tbl>
+      <w:tblPr>
+        <w:tblW w:w="0" w:type="auto"/>
+        <w:tblBorders>
+          <w:top w:val="single" w:sz="4" w:space="0" w:color="auto"/>
+          <w:left w:val="single" w:sz="4" w:space="0" w:color="auto"/>
+          <w:bottom w:val="single" w:sz="4" w:space="0" w:color="auto"/>
+          <w:right w:val="single" w:sz="4" w:space="0" w:color="auto"/>
+          <w:insideH w:val="single" w:sz="4" w:space="0" w:color="auto"/>
+          <w:insideV w:val="single" w:sz="4" w:space="0" w:color="auto"/>
+        </w:tblBorders>
+        <w:tblLook w:val="04A0" w:firstRow="1" w:lastRow="0" w:firstColumn="1" w:lastColumn="0" w:noHBand="0" w:noVBand="1"/>
+      </w:tblPr>
+      <w:tblGrid>
+        <w:gridCol w:w="2038"/>
+        <w:gridCol w:w="1846"/>
+        <w:gridCol w:w="1829"/>
+        <w:gridCol w:w="1955"/>
+        <w:gridCol w:w="1960"/>
+      </w:tblGrid>
+      <w:tr>
+        <w:tc>
+          <w:tcPr>
+            <w:tcW w:w="0" w:type="auto"/>
+          </w:tcPr>
+          <w:p>
+            <w:r>
+              <w:t>коррупция</w:t>
+            </w:r>
+          </w:p>
+        </w:tc>
+        <w:tc>
+          <w:tcPr>
+            <w:tcW w:w="0" w:type="auto"/>
+          </w:tcPr>
+          <w:p>
+            <w:r>
+              <w:t>взятка</w:t>
+            </w:r>
+          </w:p>
+        </w:tc>
+        <w:tc>
+          <w:tcPr>
+            <w:tcW w:w="0" w:type="auto"/>
+          </w:tcPr>
+          <w:p>
+            <w:r>
+              <w:t>подкуп</w:t>
+            </w:r>
+          </w:p>
+        </w:tc>
+        <w:tc>
+          <w:tcPr>
+            <w:tcW w:w="0" w:type="auto"/>
+          </w:tcPr>
+          <w:p>
+            <w:r>
+              <w:t>злоупотребление полномочиями</w:t>
+            </w:r>
+          </w:p>
+        </w:tc>
+        <w:tc>
+          <w:tcPr>
+            <w:tcW w:w="0" w:type="auto"/>
+          </w:tcPr>
+          <w:p>
+            <w:r>
+              <w:t>непотизм</w:t>
+            </w:r>
+          </w:p>
+        </w:tc>
+      </w:tr>
+      <w:tr>
+        <w:tc>
+          <w:tcPr>
+            <w:tcW w:w="0" w:type="auto"/>
+          </w:tcPr>
+          <w:p>
+            <w:r>
+              <w:t>бездействие</w:t>
+            </w:r>
+          </w:p>
+        </w:tc>
+        <w:tc>
+          <w:tcPr>
+            <w:tcW w:w="0" w:type="auto"/>
+          </w:tcPr>
+          <w:p>
+            <w:r>
+              <w:t>конфликт интересов</w:t>
+            </w:r>
+          </w:p>
+        </w:tc>
+        <w:tc>
+          <w:tcPr>
+            <w:tcW w:w="0" w:type="auto"/>
+          </w:tcPr>
+          <w:p>
+            <w:r>
+              <w:t>теневая экономика</w:t>
+            </w:r>
+          </w:p>
+        </w:tc>
+        <w:tc>
+          <w:tcPr>
+            <w:tcW w:w="0" w:type="auto"/>
+          </w:tcPr>
+          <w:p>
+            <w:r>
+              <w:t>финансовые махинации</w:t>
+            </w:r>
+          </w:p>
+        </w:tc>
+        <w:tc>
+          <w:tcPr>
+            <w:tcW w:w="0" w:type="auto"/>
+          </w:tcPr>
+          <w:p>
+            <w:r>
+              <w:t>противодействие коррупции</w:t>
+            </w:r>
+          </w:p>
+        </w:tc>
+      </w:tr>
+      <w:tr>
+        <w:tc>
+          <w:tcPr>
+            <w:tcW w:w="0" w:type="auto"/>
+          </w:tcPr>
+          <w:p>
+            <w:r>
+              <w:t>транспарентность</w:t>
+            </w:r>
+          </w:p>
+        </w:tc>
+        <w:tc>
+          <w:tcPr>
+            <w:tcW w:w="0" w:type="auto"/>
+          </w:tcPr>
+          <w:p>
+            <w:r>
+              <w:t>подотчетность</w:t>
+            </w:r>
+          </w:p>
+        </w:tc>
+        <w:tc>
+          <w:tcPr>
+            <w:tcW w:w="0" w:type="auto"/>
+          </w:tcPr>
+          <w:p>
+            <w:r>
+              <w:t>мониторинг</w:t>
+            </w:r>
+          </w:p>
+        </w:tc>
+        <w:tc>
+          <w:tcPr>
+            <w:tcW w:w="0" w:type="auto"/>
+          </w:tcPr>
+          <w:p>
+            <w:r>
+              <w:t>приговор</w:t>
+            </w:r>
+          </w:p>
+        </w:tc>
+        <w:tc>
+          <w:tcPr>
+            <w:tcW w:w="0" w:type="auto"/>
+          </w:tcPr>
+          <w:p>
+            <w:r>
+              <w:t>уголовное дело</w:t>
+            </w:r>
+          </w:p>
+        </w:tc>
+      </w:tr>
+      <w:tr>
+        <w:tc>
+          <w:tcPr>
+            <w:tcW w:w="0" w:type="auto"/>
+          </w:tcPr>
+          <w:p>
+            <w:r>
+              <w:t>прозрачность финансирования</w:t>
+            </w:r>
+          </w:p>
+        </w:tc>
+        <w:tc>
+          <w:tcPr>
+            <w:tcW w:w="0" w:type="auto"/>
+          </w:tcPr>
+          <w:p>
+            <w:r>
+              <w:t>теневые сделки</w:t>
+            </w:r>
+          </w:p>
+        </w:tc>
+        <w:tc>
+          <w:tcPr>
+            <w:tcW w:w="0" w:type="auto"/>
+          </w:tcPr>
+          <w:p>
+            <w:r>
+              <w:t>откат</w:t>
+            </w:r>
+          </w:p>
+        </w:tc>
+        <w:tc>
+          <w:tcPr>
+            <w:tcW w:w="0" w:type="auto"/>
+          </w:tcPr>
+          <w:p>
+            <w:r>
+              <w:t>откаты</w:t>
+            </w:r>
+          </w:p>
+        </w:tc>
+        <w:tc>
+          <w:tcPr>
+            <w:tcW w:w="0" w:type="auto"/>
+          </w:tcPr>
+          <w:p>
+            <w:r>
+              <w:t>хищение</w:t>
+            </w:r>
+          </w:p>
+        </w:tc>
+      </w:tr>
+      <w:tr>
+        <w:tc>
+          <w:tcPr>
+            <w:tcW w:w="0" w:type="auto"/>
+          </w:tcPr>
+          <w:p>
+            <w:r>
+              <w:t>родственник</w:t>
+            </w:r>
+          </w:p>
+        </w:tc>
+        <w:tc>
+          <w:tcPr>
+            <w:tcW w:w="0" w:type="auto"/>
+          </w:tcPr>
+          <w:p>
+            <w:r>
+              <w:t>расследуется</w:t>
+            </w:r>
+          </w:p>
+        </w:tc>
+        <w:tc>
+          <w:tcPr>
+            <w:tcW w:w="0" w:type="auto"/>
+          </w:tcPr>
+          <w:p>
+            <w:r>
+              <w:t>расследование</w:t>
+            </w:r>
+          </w:p>
+        </w:tc>
+        <w:tc>
+          <w:tcPr>
+            <w:tcW w:w="0" w:type="auto"/>
+          </w:tcPr>
+          <w:p>
+            <w:r>
+              <w:t>лоббизм</w:t>
+            </w:r>
+          </w:p>
+        </w:tc>
+        <w:tc>
+          <w:tcPr>
+            <w:tcW w:w="0" w:type="auto"/>
+          </w:tcPr>
+          <w:p>
+            <w:r>
+              <w:t>незаконное обогащение</w:t>
+            </w:r>
+          </w:p>
+        </w:tc>
+      </w:tr>
+      <w:tr>
+        <w:tc>
+          <w:tcPr>
+            <w:tcW w:w="0" w:type="auto"/>
+          </w:tcPr>
+          <w:p>
+            <w:r>
+              <w:t>контроль расходов</w:t>
+            </w:r>
+          </w:p>
+        </w:tc>
+        <w:tc>
+          <w:tcPr>
+            <w:tcW w:w="0" w:type="auto"/>
+          </w:tcPr>
+          <w:p>
+            <w:r>
+              <w:t>проверки деятельности</w:t>
+            </w:r>
+          </w:p>
+        </w:tc>
+        <w:tc>
+          <w:tcPr>
+            <w:tcW w:w="0" w:type="auto"/>
+          </w:tcPr>
+          <w:p>
+            <w:r>
+              <w:t>подозреваемый</w:t>
+            </w:r>
+          </w:p>
+        </w:tc>
+        <w:tc>
+          <w:tcPr>
+            <w:tcW w:w="0" w:type="auto"/>
+          </w:tcPr>
+          <w:p>
+            <w:r>
+              <w:t>подозревается</w:t>
+            </w:r>
+          </w:p>
+        </w:tc>
+        <w:tc>
+          <w:tcPr>
+            <w:tcW w:w="0" w:type="auto"/>
+          </w:tcPr>
+          <w:p>
+            <w:r>
+              <w:t>аудит</w:t>
+            </w:r>
+          </w:p>
+        </w:tc>
+      </w:tr>
+      <w:tr>
+        <w:tc>
+          <w:tcPr>
+            <w:tcW w:w="0" w:type="auto"/>
+          </w:tcPr>
+          <w:p>
+            <w:r>
+              <w:t>закупка</w:t>
+            </w:r>
+          </w:p>
+        </w:tc>
+        <w:tc>
+          <w:tcPr>
+            <w:tcW w:w="0" w:type="auto"/>
+          </w:tcPr>
+          <w:p>
+            <w:r>
+              <w:t>госзакупки</w:t>
+            </w:r>
+          </w:p>
+        </w:tc>
+        <w:tc>
+          <w:tcPr>
+            <w:tcW w:w="0" w:type="auto"/>
+          </w:tcPr>
+          <w:p>
+            <w:r>
+              <w:t>госконтракт</w:t>
+            </w:r>
+          </w:p>
+        </w:tc>
+        <w:tc>
+          <w:tcPr>
+            <w:tcW w:w="0" w:type="auto"/>
+          </w:tcPr>
+          <w:p>
+            <w:r>
+              <w:t>электронное правительство</w:t>
+            </w:r>
+          </w:p>
+        </w:tc>
+        <w:tc>
+          <w:tcPr>
+            <w:tcW w:w="0" w:type="auto"/>
+          </w:tcPr>
+          <w:p>
+            <w:r>
+              <w:t>похищение</w:t>
+            </w:r>
+          </w:p>
+        </w:tc>
+      </w:tr>
+      <w:tr>
+        <w:tc>
+          <w:tcPr>
+            <w:tcW w:w="0" w:type="auto"/>
+          </w:tcPr>
+          <w:p>
+            <w:r>
+              <w:t>отмывание</w:t>
+            </w:r>
+          </w:p>
+        </w:tc>
+        <w:tc>
+          <w:tcPr>
+            <w:tcW w:w="0" w:type="auto"/>
+          </w:tcPr>
+          <w:p>
+            <w:r>
+              <w:t>задержание</w:t>
+            </w:r>
+          </w:p>
+        </w:tc>
+        <w:tc>
+          <w:tcPr>
+            <w:tcW w:w="0" w:type="auto"/>
+          </w:tcPr>
+          <w:p>
+            <w:r>
+              <w:t>рейдерство</w:t>
+            </w:r>
+          </w:p>
+        </w:tc>
+        <w:tc>
+          <w:tcPr>
+            <w:tcW w:w="0" w:type="auto"/>
+          </w:tcPr>
+          <w:p>
+            <w:r>
+              <w:t>тенге</w:t>
+            </w:r>
+          </w:p>
+        </w:tc>
+        <w:tc>
+          <w:tcPr>
+            <w:tcW w:w="0" w:type="auto"/>
+          </w:tcPr>
+          <w:p>
+            <w:r>
+              <w:t>доллар</w:t>
+            </w:r>
+          </w:p>
+        </w:tc>
+      </w:tr>
+      <w:tr>
+        <w:tc>
+          <w:tcPr>
+            <w:tcW w:w="0" w:type="auto"/>
+          </w:tcPr>
+          <w:p>
+            <w:r>
+              <w:t>доллары</w:t>
+            </w:r>
+          </w:p>
+        </w:tc>
+        <w:tc>
+          <w:tcPr>
+            <w:tcW w:w="0" w:type="auto"/>
+          </w:tcPr>
+          <w:p>
+            <w:r>
+              <w:t>миллион</w:t>
+            </w:r>
+          </w:p>
+        </w:tc>
+        <w:tc>
+          <w:tcPr>
+            <w:tcW w:w="0" w:type="auto"/>
+          </w:tcPr>
+          <w:p>
+            <w:r>
+              <w:t>миллиард</w:t>
+            </w:r>
+          </w:p>
+        </w:tc>
+        <w:tc>
+          <w:tcPr>
+            <w:tcW w:w="0" w:type="auto"/>
+          </w:tcPr>
+          <w:p>
+            <w:r>
+              <w:t>триллион</w:t>
+            </w:r>
+          </w:p>
+        </w:tc>
+        <w:tc>
+          <w:tcPr>
+            <w:tcW w:w="0" w:type="auto"/>
+          </w:tcPr>
+          <w:p>
+            <w:r>
+              <w:t>превышение власти</w:t>
+            </w:r>
+          </w:p>
+        </w:tc>
+      </w:tr>
+      <w:tr>
+        <w:tc>
+          <w:tcPr>
+            <w:tcW w:w="0" w:type="auto"/>
+          </w:tcPr>
+          <w:p>
+            <w:r>
+              <w:t>задержали</w:t>
+            </w:r>
+          </w:p>
+        </w:tc>
+        <w:tc>
+          <w:tcPr>
+            <w:tcW w:w="0" w:type="auto"/>
+          </w:tcPr>
+          <w:p>
+            <w:r>
+              <w:t>агентство</w:t>
+            </w:r>
+          </w:p>
+        </w:tc>
+        <w:tc>
+          <w:tcPr>
+            <w:tcW w:w="0" w:type="auto"/>
+          </w:tcPr>
+          <w:p>
+            <w:r>
+              <w:t>уголовный кодекс</w:t>
+            </w:r>
+          </w:p>
+        </w:tc>
+        <w:tc>
+          <w:tcPr>
+            <w:tcW w:w="0" w:type="auto"/>
+          </w:tcPr>
+          <w:p>
+            <w:r>
+              <w:t>получение взятки</w:t>
+            </w:r>
+          </w:p>
+        </w:tc>
+        <w:tc>
+          <w:tcPr>
+            <w:tcW w:w="0" w:type="auto"/>
+          </w:tcPr>
+          <w:p>
+            <w:r>
+              <w:t>незаконное вознаграждение</w:t>
+            </w:r>
+          </w:p>
+        </w:tc>
+      </w:tr>
+      <w:tr>
+        <w:tc>
+          <w:tcPr>
+            <w:tcW w:w="0" w:type="auto"/>
+          </w:tcPr>
+          <w:p>
+            <w:r>
+              <w:t>концепция</w:t>
+            </w:r>
+          </w:p>
+        </w:tc>
+        <w:tc>
+          <w:tcPr>
+            <w:tcW w:w="0" w:type="auto"/>
+          </w:tcPr>
+          <w:p>
+            <w:r>
+              <w:t>преступление</w:t>
+            </w:r>
+          </w:p>
+        </w:tc>
+        <w:tc>
+          <w:tcPr>
+            <w:tcW w:w="0" w:type="auto"/>
+          </w:tcPr>
+          <w:p>
+            <w:r>
+              <w:t>мошенничество</w:t>
+            </w:r>
+          </w:p>
+        </w:tc>
+        <w:tc>
+          <w:tcPr>
+            <w:tcW w:w="0" w:type="auto"/>
+          </w:tcPr>
+          <w:p>
+            <w:r>
+              <w:t>легализация</w:t>
+            </w:r>
+          </w:p>
+        </w:tc>
+        <w:tc>
+          <w:tcPr>
+            <w:tcW w:w="0" w:type="auto"/>
+          </w:tcPr>
+          <w:p>
+            <w:r>
+              <w:t>обогатился</w:t>
+            </w:r>
+          </w:p>
+        </w:tc>
+      </w:tr>
+      <w:tr>
+        <w:tc>
+          <w:tcPr>
+            <w:tcW w:w="0" w:type="auto"/>
+          </w:tcPr>
+          <w:p>
+            <w:r>
+              <w:t>обогатились</w:t>
+            </w:r>
+          </w:p>
+        </w:tc>
+        <w:tc>
+          <w:tcPr>
+            <w:tcW w:w="0" w:type="auto"/>
+          </w:tcPr>
+          <w:p>
+            <w:r>
+              <w:t>судебный процесс</w:t>
+            </w:r>
+          </w:p>
+        </w:tc>
+        <w:tc>
+          <w:tcPr>
+            <w:tcW w:w="0" w:type="auto"/>
+          </w:tcPr>
+          <w:p>
+            <w:r>
+              <w:t>суд</w:t>
+            </w:r>
+          </w:p>
+        </w:tc>
+        <w:tc>
+          <w:tcPr>
+            <w:tcW w:w="0" w:type="auto"/>
+          </w:tcPr>
+          <w:p>
+            <w:r>
+              <w:t>министерство</w:t>
+            </w:r>
+          </w:p>
+        </w:tc>
+        <w:tc>
+          <w:tcPr>
+            <w:tcW w:w="0" w:type="auto"/>
+          </w:tcPr>
+          <w:p>
+            <w:r>
+              <w:t>парламент</w:t>
+            </w:r>
+          </w:p>
+        </w:tc>
+      </w:tr>
+      <w:tr>
+        <w:tc>
+          <w:tcPr>
+            <w:tcW w:w="0" w:type="auto"/>
+          </w:tcPr>
+          <w:p>
+            <w:proofErr w:type="spellStart"/>
+            <w:r>
+              <w:t>мвд</w:t>
+            </w:r>
+            <w:proofErr w:type="spellEnd"/>
+          </w:p>
+        </w:tc>
+        <w:tc>
+          <w:tcPr>
+            <w:tcW w:w="0" w:type="auto"/>
+          </w:tcPr>
+          <w:p>
+            <w:proofErr w:type="spellStart"/>
+            <w:r>
+              <w:t>кнб</w:t>
+            </w:r>
+            <w:proofErr w:type="spellEnd"/>
+          </w:p>
+        </w:tc>
+        <w:tc>
+          <w:tcPr>
+            <w:tcW w:w="0" w:type="auto"/>
+          </w:tcPr>
+          <w:p>
+            <w:r>
+              <w:t>депутат</w:t>
+            </w:r>
+          </w:p>
+        </w:tc>
+        <w:tc>
+          <w:tcPr>
+            <w:tcW w:w="0" w:type="auto"/>
+          </w:tcPr>
+          <w:p>
+            <w:r>
+              <w:t>сенат</w:t>
+            </w:r>
+          </w:p>
+        </w:tc>
+        <w:tc>
+          <w:tcPr>
+            <w:tcW w:w="0" w:type="auto"/>
+          </w:tcPr>
+          <w:p>
+            <w:r>
+              <w:t>комиссия</w:t>
+            </w:r>
+          </w:p>
+        </w:tc>
+      </w:tr>
+      <w:tr>
+        <w:tc>
+          <w:tcPr>
+            <w:tcW w:w="0" w:type="auto"/>
+          </w:tcPr>
+          <w:p>
+            <w:r>
+              <w:t>конкурс</w:t>
+            </w:r>
+          </w:p>
+        </w:tc>
+        <w:tc>
+          <w:tcPr>
+            <w:tcW w:w="0" w:type="auto"/>
+          </w:tcPr>
+          <w:p>
+            <w:r>
+              <w:t>должностное лицо</w:t>
+            </w:r>
+          </w:p>
+        </w:tc>
+        <w:tc>
+          <w:tcPr>
+            <w:tcW w:w="0" w:type="auto"/>
+          </w:tcPr>
+          <w:p>
+            <w:r>
+              <w:t>служебное положение</w:t>
+            </w:r>
+          </w:p>
+        </w:tc>
+        <w:tc>
+          <w:tcPr>
+            <w:tcW w:w="0" w:type="auto"/>
+          </w:tcPr>
+          <w:p>
+            <w:r>
+              <w:t>фиктивный</w:t>
+            </w:r>
+          </w:p>
+        </w:tc>
+        <w:tc>
+          <w:tcPr>
+            <w:tcW w:w="0" w:type="auto"/>
+          </w:tcPr>
+          <w:p>
+            <w:r>
+              <w:t>растратил</w:t>
+            </w:r>
+          </w:p>
+        </w:tc>
+      </w:tr>
+      <w:tr>
+        <w:tc>
+          <w:tcPr>
+            <w:tcW w:w="0" w:type="auto"/>
+          </w:tcPr>
+          <w:p>
+            <w:r>
+              <w:t>растрата</w:t>
+            </w:r>
+          </w:p>
+        </w:tc>
+        <w:tc>
+          <w:tcPr>
+            <w:tcW w:w="0" w:type="auto"/>
+          </w:tcPr>
+          <w:p>
+            <w:r>
+              <w:t>вымогательство</w:t>
+            </w:r>
+          </w:p>
+        </w:tc>
+        <w:tc>
+          <w:tcPr>
+            <w:tcW w:w="0" w:type="auto"/>
+          </w:tcPr>
+          <w:p>
+            <w:r>
+              <w:t>халатность</w:t>
+            </w:r>
+          </w:p>
+        </w:tc>
+        <w:tc>
+          <w:tcPr>
+            <w:tcW w:w="0" w:type="auto"/>
+          </w:tcPr>
+          <w:p>
+            <w:r>
+              <w:t>аким</w:t>
+            </w:r>
+          </w:p>
+        </w:tc>
+        <w:tc>
+          <w:tcPr>
+            <w:tcW w:w="0" w:type="auto"/>
+          </w:tcPr>
+          <w:p>
+            <w:r>
+              <w:t>начальник</w:t>
+            </w:r>
+          </w:p>
+        </w:tc>
+      </w:tr>
+      <w:tr>
+        <w:tc>
+          <w:tcPr>
+            <w:tcW w:w="0" w:type="auto"/>
+          </w:tcPr>
+          <w:p>
+            <w:r>
+              <w:t>зам</w:t>
+            </w:r>
+          </w:p>
+        </w:tc>
+        <w:tc>
+          <w:tcPr>
+            <w:tcW w:w="0" w:type="auto"/>
+          </w:tcPr>
+          <w:p>
+            <w:r>
+              <w:t>заместитель</w:t>
+            </w:r>
+          </w:p>
+        </w:tc>
+        <w:tc>
+          <w:tcPr>
+            <w:tcW w:w="0" w:type="auto"/>
+          </w:tcPr>
+          <w:p>
+            <w:r>
+              <w:t>район</w:t>
+            </w:r>
+          </w:p>
+        </w:tc>
+        <w:tc>
+          <w:tcPr>
+            <w:tcW w:w="0" w:type="auto"/>
+          </w:tcPr>
+          <w:p>
+            <w:r>
+              <w:t>город</w:t>
+            </w:r>
+          </w:p>
+        </w:tc>
+        <w:tc>
+          <w:tcPr>
+            <w:tcW w:w="0" w:type="auto"/>
+          </w:tcPr>
+          <w:p>
+            <w:r>
+              <w:t>область</w:t>
+            </w:r>
+          </w:p>
+        </w:tc>
+      </w:tr>
+      <w:tr>
+        <w:tc>
+          <w:tcPr>
+            <w:tcW w:w="0" w:type="auto"/>
+          </w:tcPr>
+          <w:p>
+            <w:r>
+              <w:t>село</w:t>
+            </w:r>
+          </w:p>
+        </w:tc>
+        <w:tc>
+          <w:tcPr>
+            <w:tcW w:w="0" w:type="auto"/>
+          </w:tcPr>
+          <w:p>
+            <w:r>
+              <w:t>деревня</w:t>
+            </w:r>
+          </w:p>
+        </w:tc>
+        <w:tc>
+          <w:tcPr>
+            <w:tcW w:w="0" w:type="auto"/>
+          </w:tcPr>
+          <w:p>
+            <w:r>
+              <w:t>аул</w:t>
+            </w:r>
+          </w:p>
+        </w:tc>
+        <w:tc>
+          <w:tcPr>
+            <w:tcW w:w="0" w:type="auto"/>
+          </w:tcPr>
+          <w:p>
+            <w:r>
+              <w:t>правонарушение</w:t>
+            </w:r>
+          </w:p>
+        </w:tc>
+        <w:tc>
+          <w:tcPr>
+            <w:tcW w:w="0" w:type="auto"/>
+          </w:tcPr>
+          <w:p>
+            <w:proofErr w:type="spellStart"/>
+            <w:r>
+              <w:t>антикор</w:t>
+            </w:r>
+            <w:proofErr w:type="spellEnd"/>
+          </w:p>
+        </w:tc>
+      </w:tr>
+      <w:tr>
+        <w:tc>
+          <w:tcPr>
+            <w:tcW w:w="0" w:type="auto"/>
+          </w:tcPr>
+          <w:p>
+            <w:proofErr w:type="spellStart"/>
+            <w:r>
+              <w:t>антикора</w:t>
+            </w:r>
+            <w:proofErr w:type="spellEnd"/>
+          </w:p>
+        </w:tc>
+        <w:tc>
+          <w:tcPr>
+            <w:tcW w:w="0" w:type="auto"/>
+          </w:tcPr>
+          <w:p/>
+        </w:tc>
+        <w:tc>
+          <w:tcPr>
+            <w:tcW w:w="0" w:type="auto"/>
+          </w:tcPr>
+          <w:p/>
+        </w:tc>
+        <w:tc>
+          <w:tcPr>
+            <w:tcW w:w="0" w:type="auto"/>
+          </w:tcPr>
+          <w:p/>
+        </w:tc>
+        <w:tc>
+          <w:tcPr>
+            <w:tcW w:w="0" w:type="auto"/>
+          </w:tcPr>
+          <w:p/>
+        </w:tc>
+      </w:tr>
+    </w:tbl>
+    <w:p>
+      <w:pPr>
+        <w:rPr>
+          <w:lang w:val="en-US"/>
+        </w:rPr>
+      </w:pPr>
     </w:p>
     <w:sectPr>
       <w:pgSz w:w="11906" w:h="16838"/>
@@ -14410,6 +17237,122 @@
 <file path=word/numbering.xml><?xml version="1.0" encoding="utf-8"?>
 <w:numbering xmlns:wpc="http://schemas.microsoft.com/office/word/2010/wordprocessingCanvas" xmlns:cx="http://schemas.microsoft.com/office/drawing/2014/chartex" xmlns:cx1="http://schemas.microsoft.com/office/drawing/2015/9/8/chartex" xmlns:cx2="http://schemas.microsoft.com/office/drawing/2015/10/21/chartex" xmlns:cx3="http://schemas.microsoft.com/office/drawing/2016/5/9/chartex" xmlns:cx4="http://schemas.microsoft.com/office/drawing/2016/5/10/chartex" xmlns:cx5="http://schemas.microsoft.com/office/drawing/2016/5/11/chartex" xmlns:cx6="http://schemas.microsoft.com/office/drawing/2016/5/12/chartex" xmlns:cx7="http://schemas.microsoft.com/office/drawing/2016/5/13/chartex" xmlns:cx8="http://schemas.microsoft.com/office/drawing/2016/5/14/chartex" xmlns:mc="http://schemas.openxmlformats.org/markup-compatibility/2006" xmlns:aink="http://schemas.microsoft.com/office/drawing/2016/ink" xmlns:am3d="http://schemas.microsoft.com/office/drawing/2017/model3d" xmlns:o="urn:schemas-microsoft-com:office:office" xmlns:oel="http://schemas.microsoft.com/office/2019/extlst" xmlns:r="http://schemas.openxmlformats.org/officeDocument/2006/relationships" xmlns:m="http://schemas.openxmlformats.org/officeDocument/2006/math" xmlns:v="urn:schemas-microsoft-com:vml" xmlns:wp14="http://schemas.microsoft.com/office/word/2010/wordprocessingDrawing" xmlns:wp="http://schemas.openxmlformats.org/drawingml/2006/wordprocessingDrawing" xmlns:w10="urn:schemas-microsoft-com:office:word" xmlns:w="http://schemas.openxmlformats.org/wordprocessingml/2006/main" xmlns:w14="http://schemas.microsoft.com/office/word/2010/wordml" xmlns:w15="http://schemas.microsoft.com/office/word/2012/wordml" xmlns:w16cex="http://schemas.microsoft.com/office/word/2018/wordml/cex" xmlns:w16cid="http://schemas.microsoft.com/office/word/2016/wordml/cid" xmlns:w16="http://schemas.microsoft.com/office/word/2018/wordml" xmlns:w16du="http://schemas.microsoft.com/office/word/2023/wordml/word16du" xmlns:w16sdtdh="http://schemas.microsoft.com/office/word/2020/wordml/sdtdatahash" xmlns:w16sdtfl="http://schemas.microsoft.com/office/word/2024/wordml/sdtformatlock" xmlns:w16se="http://schemas.microsoft.com/office/word/2015/wordml/symex" xmlns:wpg="http://schemas.microsoft.com/office/word/2010/wordprocessingGroup" xmlns:wpi="http://schemas.microsoft.com/office/word/2010/wordprocessingInk" xmlns:wne="http://schemas.microsoft.com/office/word/2006/wordml" xmlns:wps="http://schemas.microsoft.com/office/word/2010/wordprocessingShape" mc:Ignorable="w14 w15 w16se w16cid w16 w16cex w16sdtdh w16sdtfl w16du wp14">
   <w:abstractNum w:abstractNumId="0" w15:restartNumberingAfterBreak="0">
+    <w:nsid w:val="0F031BC6"/>
+    <w:multiLevelType w:val="multilevel"/>
+    <w:tmpl w:val="843ED218"/>
+    <w:lvl w:ilvl="0">
+      <w:start w:val="1"/>
+      <w:numFmt w:val="bullet"/>
+      <w:lvlText w:val=""/>
+      <w:lvlJc w:val="left"/>
+      <w:pPr>
+        <w:tabs>
+          <w:tab w:val="num" w:pos="720"/>
+        </w:tabs>
+        <w:ind w:left="720" w:hanging="360"/>
+      </w:pPr>
+      <w:rPr>
+        <w:rFonts w:ascii="Symbol" w:hAnsi="Symbol" w:hint="default"/>
+      </w:rPr>
+    </w:lvl>
+    <w:lvl w:ilvl="1" w:tentative="1">
+      <w:start w:val="1"/>
+      <w:numFmt w:val="decimal"/>
+      <w:lvlText w:val="%2."/>
+      <w:lvlJc w:val="left"/>
+      <w:pPr>
+        <w:tabs>
+          <w:tab w:val="num" w:pos="1440"/>
+        </w:tabs>
+        <w:ind w:left="1440" w:hanging="360"/>
+      </w:pPr>
+    </w:lvl>
+    <w:lvl w:ilvl="2" w:tentative="1">
+      <w:start w:val="1"/>
+      <w:numFmt w:val="decimal"/>
+      <w:lvlText w:val="%3."/>
+      <w:lvlJc w:val="left"/>
+      <w:pPr>
+        <w:tabs>
+          <w:tab w:val="num" w:pos="2160"/>
+        </w:tabs>
+        <w:ind w:left="2160" w:hanging="360"/>
+      </w:pPr>
+    </w:lvl>
+    <w:lvl w:ilvl="3" w:tentative="1">
+      <w:start w:val="1"/>
+      <w:numFmt w:val="decimal"/>
+      <w:lvlText w:val="%4."/>
+      <w:lvlJc w:val="left"/>
+      <w:pPr>
+        <w:tabs>
+          <w:tab w:val="num" w:pos="2880"/>
+        </w:tabs>
+        <w:ind w:left="2880" w:hanging="360"/>
+      </w:pPr>
+    </w:lvl>
+    <w:lvl w:ilvl="4" w:tentative="1">
+      <w:start w:val="1"/>
+      <w:numFmt w:val="decimal"/>
+      <w:lvlText w:val="%5."/>
+      <w:lvlJc w:val="left"/>
+      <w:pPr>
+        <w:tabs>
+          <w:tab w:val="num" w:pos="3600"/>
+        </w:tabs>
+        <w:ind w:left="3600" w:hanging="360"/>
+      </w:pPr>
+    </w:lvl>
+    <w:lvl w:ilvl="5" w:tentative="1">
+      <w:start w:val="1"/>
+      <w:numFmt w:val="decimal"/>
+      <w:lvlText w:val="%6."/>
+      <w:lvlJc w:val="left"/>
+      <w:pPr>
+        <w:tabs>
+          <w:tab w:val="num" w:pos="4320"/>
+        </w:tabs>
+        <w:ind w:left="4320" w:hanging="360"/>
+      </w:pPr>
+    </w:lvl>
+    <w:lvl w:ilvl="6" w:tentative="1">
+      <w:start w:val="1"/>
+      <w:numFmt w:val="decimal"/>
+      <w:lvlText w:val="%7."/>
+      <w:lvlJc w:val="left"/>
+      <w:pPr>
+        <w:tabs>
+          <w:tab w:val="num" w:pos="5040"/>
+        </w:tabs>
+        <w:ind w:left="5040" w:hanging="360"/>
+      </w:pPr>
+    </w:lvl>
+    <w:lvl w:ilvl="7" w:tentative="1">
+      <w:start w:val="1"/>
+      <w:numFmt w:val="decimal"/>
+      <w:lvlText w:val="%8."/>
+      <w:lvlJc w:val="left"/>
+      <w:pPr>
+        <w:tabs>
+          <w:tab w:val="num" w:pos="5760"/>
+        </w:tabs>
+        <w:ind w:left="5760" w:hanging="360"/>
+      </w:pPr>
+    </w:lvl>
+    <w:lvl w:ilvl="8" w:tentative="1">
+      <w:start w:val="1"/>
+      <w:numFmt w:val="decimal"/>
+      <w:lvlText w:val="%9."/>
+      <w:lvlJc w:val="left"/>
+      <w:pPr>
+        <w:tabs>
+          <w:tab w:val="num" w:pos="6480"/>
+        </w:tabs>
+        <w:ind w:left="6480" w:hanging="360"/>
+      </w:pPr>
+    </w:lvl>
+  </w:abstractNum>
+  <w:abstractNum w:abstractNumId="1" w15:restartNumberingAfterBreak="0">
     <w:nsid w:val="109D15C9"/>
     <w:multiLevelType w:val="multilevel"/>
     <w:tmpl w:val="FCB690B2"/>
@@ -14558,7 +17501,7 @@
       </w:rPr>
     </w:lvl>
   </w:abstractNum>
-  <w:abstractNum w:abstractNumId="1" w15:restartNumberingAfterBreak="0">
+  <w:abstractNum w:abstractNumId="2" w15:restartNumberingAfterBreak="0">
     <w:nsid w:val="12EC0CF2"/>
     <w:multiLevelType w:val="multilevel"/>
     <w:tmpl w:val="9F16AE6E"/>
@@ -14707,7 +17650,7 @@
       </w:rPr>
     </w:lvl>
   </w:abstractNum>
-  <w:abstractNum w:abstractNumId="2" w15:restartNumberingAfterBreak="0">
+  <w:abstractNum w:abstractNumId="3" w15:restartNumberingAfterBreak="0">
     <w:nsid w:val="3FF9024F"/>
     <w:multiLevelType w:val="hybridMultilevel"/>
     <w:tmpl w:val="2454FF32"/>
@@ -14796,7 +17739,7 @@
       </w:pPr>
     </w:lvl>
   </w:abstractNum>
-  <w:abstractNum w:abstractNumId="3" w15:restartNumberingAfterBreak="0">
+  <w:abstractNum w:abstractNumId="4" w15:restartNumberingAfterBreak="0">
     <w:nsid w:val="4B7D4A4E"/>
     <w:multiLevelType w:val="hybridMultilevel"/>
     <w:tmpl w:val="067E943A"/>
@@ -14885,7 +17828,7 @@
       </w:pPr>
     </w:lvl>
   </w:abstractNum>
-  <w:abstractNum w:abstractNumId="4" w15:restartNumberingAfterBreak="0">
+  <w:abstractNum w:abstractNumId="5" w15:restartNumberingAfterBreak="0">
     <w:nsid w:val="513C3F03"/>
     <w:multiLevelType w:val="multilevel"/>
     <w:tmpl w:val="25F207CE"/>
@@ -14998,7 +17941,7 @@
       </w:pPr>
     </w:lvl>
   </w:abstractNum>
-  <w:abstractNum w:abstractNumId="5" w15:restartNumberingAfterBreak="0">
+  <w:abstractNum w:abstractNumId="6" w15:restartNumberingAfterBreak="0">
     <w:nsid w:val="5FB277AE"/>
     <w:multiLevelType w:val="multilevel"/>
     <w:tmpl w:val="436E6094"/>
@@ -15147,7 +18090,7 @@
       </w:rPr>
     </w:lvl>
   </w:abstractNum>
-  <w:abstractNum w:abstractNumId="6" w15:restartNumberingAfterBreak="0">
+  <w:abstractNum w:abstractNumId="7" w15:restartNumberingAfterBreak="0">
     <w:nsid w:val="65E70F43"/>
     <w:multiLevelType w:val="multilevel"/>
     <w:tmpl w:val="77125016"/>
@@ -15296,7 +18239,7 @@
       </w:rPr>
     </w:lvl>
   </w:abstractNum>
-  <w:abstractNum w:abstractNumId="7" w15:restartNumberingAfterBreak="0">
+  <w:abstractNum w:abstractNumId="8" w15:restartNumberingAfterBreak="0">
     <w:nsid w:val="672E1908"/>
     <w:multiLevelType w:val="multilevel"/>
     <w:tmpl w:val="F1D874D0"/>
@@ -15410,28 +18353,31 @@
     </w:lvl>
   </w:abstractNum>
   <w:num w:numId="1" w16cid:durableId="1499152162">
+    <w:abstractNumId w:val="5"/>
+  </w:num>
+  <w:num w:numId="2" w16cid:durableId="1311982485">
+    <w:abstractNumId w:val="1"/>
+  </w:num>
+  <w:num w:numId="3" w16cid:durableId="1422795344">
+    <w:abstractNumId w:val="8"/>
+  </w:num>
+  <w:num w:numId="4" w16cid:durableId="651830967">
+    <w:abstractNumId w:val="2"/>
+  </w:num>
+  <w:num w:numId="5" w16cid:durableId="569997695">
+    <w:abstractNumId w:val="3"/>
+  </w:num>
+  <w:num w:numId="6" w16cid:durableId="629215183">
     <w:abstractNumId w:val="4"/>
   </w:num>
-  <w:num w:numId="2" w16cid:durableId="1311982485">
-    <w:abstractNumId w:val="0"/>
+  <w:num w:numId="7" w16cid:durableId="1332105063">
+    <w:abstractNumId w:val="6"/>
   </w:num>
-  <w:num w:numId="3" w16cid:durableId="1422795344">
+  <w:num w:numId="8" w16cid:durableId="1600790277">
     <w:abstractNumId w:val="7"/>
   </w:num>
-  <w:num w:numId="4" w16cid:durableId="651830967">
-    <w:abstractNumId w:val="1"/>
-  </w:num>
-  <w:num w:numId="5" w16cid:durableId="569997695">
-    <w:abstractNumId w:val="2"/>
-  </w:num>
-  <w:num w:numId="6" w16cid:durableId="629215183">
-    <w:abstractNumId w:val="3"/>
-  </w:num>
-  <w:num w:numId="7" w16cid:durableId="1332105063">
-    <w:abstractNumId w:val="5"/>
-  </w:num>
-  <w:num w:numId="8" w16cid:durableId="1600790277">
-    <w:abstractNumId w:val="6"/>
+  <w:num w:numId="9" w16cid:durableId="667826080">
+    <w:abstractNumId w:val="0"/>
   </w:num>
 </w:numbering>
 </file>

</xml_diff>